<commit_message>
Draft: Region exceptions for face 11 triangles
Face 11's code is Region 3 (73% of its city population is northern
Japan), but by land it is mostly Russian Far East and Alaska/Yukon.
Section 8.3 now lists, at two-octet resolution:

- triangles 2-4: Region 2 (Alaska, Yukon; no other land);
- triangle 0: Region 1 (97% Russian land);
- inside triangle 0, Alaska's North Slope and the Canadian Arctic back
  to Region 2, at five octets (the border passes between the Diomede
  Islands, 3.8 km apart).

Section 4.2 mentions the exceptions. Also fixes the doubled indentation
left in the table when the Puerto Rico and USVI rows were removed.
</commit_message>
<xml_diff>
--- a/draft/draft-hanley-rsdggs-00.docx
+++ b/draft/draft-hanley-rsdggs-00.docx
@@ -11274,7 +11274,7 @@
       <w:bookmarkEnd w:id="397"/>
       <w:r>
         <w:rPr/>
-        <w:t>Face indices 1, 2, and 3 carry the ITU Region number directly, establishing a direct correspondence between a single-octet RSDGGS index and ITU Region membership for the most populous zone of each Region. Every other face follows the same rule through its two low-order bits: the ITU Region at single-octet resolution is face &amp; 0x3 (equivalently, Octet 0 &amp; 0x03), where 0 means no Region. The rule gives the Region of the face's principal population; a face may also contain land of another Region (for example, north-east Brazil on face 9, Iran on face 1, and Alaska on face 11), and there the regulatory database, not the face index, determines the Region and the rules.</w:t>
+        <w:t>Face indices 1, 2, and 3 carry the ITU Region number directly, establishing a direct correspondence between a single-octet RSDGGS index and ITU Region membership for the most populous zone of each Region. Every other face follows the same rule through its two low-order bits: the ITU Region at single-octet resolution is face &amp; 0x3 (equivalently, Octet 0 &amp; 0x03), where 0 means no Region. The rule gives the Region of the face's principal population; a face may also contain land of another Region (for example, north-east Brazil on face 9, Iran on face 1, and Alaska on face 11), and there the regulatory database, not the face index, determines the Region and the rules. Face 11 also carries Region exceptions at triangle level (Section 8.3): triangles 2 to 4 (Alaska and the Yukon) are Region 2, and triangle 0 (the Russian Far East) is Region 1, so a two-octet index resolves the Region there.</w:t>
       </w:r>
     </w:p>
     <w:p>
@@ -19879,10 +19879,10 @@
         </w:tblCellMar>
       </w:tblPr>
       <w:tblGrid>
-        <w:gridCol w:w="2588"/>
-        <w:gridCol w:w="639"/>
-        <w:gridCol w:w="4671"/>
-        <w:gridCol w:w="2638"/>
+        <w:gridCol w:w="2773"/>
+        <w:gridCol w:w="988"/>
+        <w:gridCol w:w="5166"/>
+        <w:gridCol w:w="1612"/>
       </w:tblGrid>
       <w:tr>
         <w:trPr>
@@ -20574,6 +20574,267 @@
             <w:r>
               <w:rPr/>
               <w:t>4</w:t>
+            </w:r>
+          </w:p>
+        </w:tc>
+      </w:tr>
+      <w:tr>
+        <w:trPr/>
+        <w:tc>
+          <w:tcPr>
+            <w:tcBorders/>
+            <w:vAlign w:val="center"/>
+          </w:tcPr>
+          <w:p>
+            <w:pPr>
+              <w:pStyle w:val="TableContents"/>
+              <w:widowControl w:val="false"/>
+              <w:suppressLineNumbers/>
+              <w:shd w:fill="F8F8F8" w:val="clear"/>
+              <w:bidi w:val="0"/>
+              <w:jc w:val="left"/>
+              <w:rPr/>
+            </w:pPr>
+            <w:r>
+              <w:rPr/>
+              <w:t>Alaska / Yukon (FCC, ISED)</w:t>
+            </w:r>
+          </w:p>
+        </w:tc>
+        <w:tc>
+          <w:tcPr>
+            <w:tcBorders/>
+            <w:vAlign w:val="center"/>
+          </w:tcPr>
+          <w:p>
+            <w:pPr>
+              <w:pStyle w:val="TableContents"/>
+              <w:widowControl w:val="false"/>
+              <w:suppressLineNumbers/>
+              <w:shd w:fill="F8F8F8" w:val="clear"/>
+              <w:bidi w:val="0"/>
+              <w:jc w:val="left"/>
+              <w:rPr/>
+            </w:pPr>
+            <w:r>
+              <w:rPr/>
+              <w:t>11, triangles 2–4</w:t>
+            </w:r>
+          </w:p>
+        </w:tc>
+        <w:tc>
+          <w:tcPr>
+            <w:tcBorders/>
+            <w:vAlign w:val="center"/>
+          </w:tcPr>
+          <w:p>
+            <w:pPr>
+              <w:pStyle w:val="TableContents"/>
+              <w:widowControl w:val="false"/>
+              <w:suppressLineNumbers/>
+              <w:shd w:fill="F8F8F8" w:val="clear"/>
+              <w:bidi w:val="0"/>
+              <w:jc w:val="left"/>
+              <w:rPr/>
+            </w:pPr>
+            <w:r>
+              <w:rPr/>
+              <w:t>Region 2 rules in Region 3 face; the triangles hold no other land</w:t>
+            </w:r>
+          </w:p>
+        </w:tc>
+        <w:tc>
+          <w:tcPr>
+            <w:tcBorders/>
+            <w:vAlign w:val="center"/>
+          </w:tcPr>
+          <w:p>
+            <w:pPr>
+              <w:pStyle w:val="TableContents"/>
+              <w:widowControl w:val="false"/>
+              <w:suppressLineNumbers/>
+              <w:shd w:fill="F8F8F8" w:val="clear"/>
+              <w:bidi w:val="0"/>
+              <w:jc w:val="left"/>
+              <w:rPr/>
+            </w:pPr>
+            <w:r>
+              <w:rPr/>
+              <w:t>2</w:t>
+            </w:r>
+          </w:p>
+        </w:tc>
+      </w:tr>
+      <w:tr>
+        <w:trPr/>
+        <w:tc>
+          <w:tcPr>
+            <w:tcBorders/>
+            <w:vAlign w:val="center"/>
+          </w:tcPr>
+          <w:p>
+            <w:pPr>
+              <w:pStyle w:val="TableContents"/>
+              <w:widowControl w:val="false"/>
+              <w:suppressLineNumbers/>
+              <w:shd w:fill="F8F8F8" w:val="clear"/>
+              <w:bidi w:val="0"/>
+              <w:jc w:val="left"/>
+              <w:rPr/>
+            </w:pPr>
+            <w:r>
+              <w:rPr/>
+              <w:t>Russian Far East (Roskomnadzor)</w:t>
+            </w:r>
+          </w:p>
+        </w:tc>
+        <w:tc>
+          <w:tcPr>
+            <w:tcBorders/>
+            <w:vAlign w:val="center"/>
+          </w:tcPr>
+          <w:p>
+            <w:pPr>
+              <w:pStyle w:val="TableContents"/>
+              <w:widowControl w:val="false"/>
+              <w:suppressLineNumbers/>
+              <w:shd w:fill="F8F8F8" w:val="clear"/>
+              <w:bidi w:val="0"/>
+              <w:jc w:val="left"/>
+              <w:rPr/>
+            </w:pPr>
+            <w:r>
+              <w:rPr/>
+              <w:t>11, triangle 0</w:t>
+            </w:r>
+          </w:p>
+        </w:tc>
+        <w:tc>
+          <w:tcPr>
+            <w:tcBorders/>
+            <w:vAlign w:val="center"/>
+          </w:tcPr>
+          <w:p>
+            <w:pPr>
+              <w:pStyle w:val="TableContents"/>
+              <w:widowControl w:val="false"/>
+              <w:suppressLineNumbers/>
+              <w:shd w:fill="F8F8F8" w:val="clear"/>
+              <w:bidi w:val="0"/>
+              <w:jc w:val="left"/>
+              <w:rPr/>
+            </w:pPr>
+            <w:r>
+              <w:rPr/>
+              <w:t>Region 1 rules in Region 3 face; triangle 0 is 97% Russian land</w:t>
+            </w:r>
+          </w:p>
+        </w:tc>
+        <w:tc>
+          <w:tcPr>
+            <w:tcBorders/>
+            <w:vAlign w:val="center"/>
+          </w:tcPr>
+          <w:p>
+            <w:pPr>
+              <w:pStyle w:val="TableContents"/>
+              <w:widowControl w:val="false"/>
+              <w:suppressLineNumbers/>
+              <w:shd w:fill="F8F8F8" w:val="clear"/>
+              <w:bidi w:val="0"/>
+              <w:jc w:val="left"/>
+              <w:rPr/>
+            </w:pPr>
+            <w:r>
+              <w:rPr/>
+              <w:t>2</w:t>
+            </w:r>
+          </w:p>
+        </w:tc>
+      </w:tr>
+      <w:tr>
+        <w:trPr/>
+        <w:tc>
+          <w:tcPr>
+            <w:tcBorders/>
+            <w:vAlign w:val="center"/>
+          </w:tcPr>
+          <w:p>
+            <w:pPr>
+              <w:pStyle w:val="TableContents"/>
+              <w:widowControl w:val="false"/>
+              <w:suppressLineNumbers/>
+              <w:shd w:fill="F8F8F8" w:val="clear"/>
+              <w:bidi w:val="0"/>
+              <w:jc w:val="left"/>
+              <w:rPr/>
+            </w:pPr>
+            <w:r>
+              <w:rPr/>
+              <w:t>Alaska North Slope, Canadian Arctic (FCC, ISED)</w:t>
+            </w:r>
+          </w:p>
+        </w:tc>
+        <w:tc>
+          <w:tcPr>
+            <w:tcBorders/>
+            <w:vAlign w:val="center"/>
+          </w:tcPr>
+          <w:p>
+            <w:pPr>
+              <w:pStyle w:val="TableContents"/>
+              <w:widowControl w:val="false"/>
+              <w:suppressLineNumbers/>
+              <w:shd w:fill="F8F8F8" w:val="clear"/>
+              <w:bidi w:val="0"/>
+              <w:jc w:val="left"/>
+              <w:rPr/>
+            </w:pPr>
+            <w:r>
+              <w:rPr/>
+              <w:t>11, triangle 0</w:t>
+            </w:r>
+          </w:p>
+        </w:tc>
+        <w:tc>
+          <w:tcPr>
+            <w:tcBorders/>
+            <w:vAlign w:val="center"/>
+          </w:tcPr>
+          <w:p>
+            <w:pPr>
+              <w:pStyle w:val="TableContents"/>
+              <w:widowControl w:val="false"/>
+              <w:suppressLineNumbers/>
+              <w:shd w:fill="F8F8F8" w:val="clear"/>
+              <w:bidi w:val="0"/>
+              <w:jc w:val="left"/>
+              <w:rPr/>
+            </w:pPr>
+            <w:r>
+              <w:rPr/>
+              <w:t>Region 2 inside the triangle 0 Region 1 exception; the US–Russia border passes between the Diomede Islands, 3.8 km apart</w:t>
+            </w:r>
+          </w:p>
+        </w:tc>
+        <w:tc>
+          <w:tcPr>
+            <w:tcBorders/>
+            <w:vAlign w:val="center"/>
+          </w:tcPr>
+          <w:p>
+            <w:pPr>
+              <w:pStyle w:val="TableContents"/>
+              <w:widowControl w:val="false"/>
+              <w:suppressLineNumbers/>
+              <w:shd w:fill="F8F8F8" w:val="clear"/>
+              <w:bidi w:val="0"/>
+              <w:jc w:val="left"/>
+              <w:rPr/>
+            </w:pPr>
+            <w:r>
+              <w:rPr/>
+              <w:t>5</w:t>
             </w:r>
           </w:p>
         </w:tc>
@@ -59164,49 +59425,49 @@
 
 <file path=word/comments.xml><?xml version="1.0" encoding="utf-8"?>
 <w:comments xmlns:o="urn:schemas-microsoft-com:office:office" xmlns:r="http://schemas.openxmlformats.org/officeDocument/2006/relationships" xmlns:v="urn:schemas-microsoft-com:vml" xmlns:w="http://schemas.openxmlformats.org/wordprocessingml/2006/main" xmlns:w10="urn:schemas-microsoft-com:office:word" xmlns:wp="http://schemas.openxmlformats.org/drawingml/2006/wordprocessingDrawing" xmlns:wps="http://schemas.microsoft.com/office/word/2010/wordprocessingShape" xmlns:wpg="http://schemas.microsoft.com/office/word/2010/wordprocessingGroup" xmlns:mc="http://schemas.openxmlformats.org/markup-compatibility/2006" xmlns:wp14="http://schemas.microsoft.com/office/word/2010/wordprocessingDrawing" xmlns:w14="http://schemas.microsoft.com/office/word/2010/wordml" xmlns:w15="http://schemas.microsoft.com/office/word/2012/wordml" mc:Ignorable="w14 wp14 w15">
-  <w:comment w:id="0" w:author="" w:date="2026-10-20T05:42:03Z" w:initials="">
+  <w:comment w:id="0" w:author="" w:date="2026-10-20T06:07:44Z" w:initials="">
     <w:p>
       <w:r>
         <w:t>HTML: &lt;meta name="keyword" content="spectrum"&gt;</w:t>
       </w:r>
     </w:p>
   </w:comment>
-  <w:comment w:id="1" w:author="" w:date="2026-10-20T05:42:03Z" w:initials="">
+  <w:comment w:id="1" w:author="" w:date="2026-10-20T06:07:44Z" w:initials="">
     <w:p>
       <w:r>
         <w:t>HTML: &lt;meta name="keyword" content="regulatory"&gt;</w:t>
       </w:r>
     </w:p>
   </w:comment>
-  <w:comment w:id="2" w:author="" w:date="2026-10-20T05:42:03Z" w:initials="">
+  <w:comment w:id="2" w:author="" w:date="2026-10-20T06:07:44Z" w:initials="">
     <w:p>
       <w:r>
         <w:t>HTML: &lt;meta name="keyword" content="dodecahedron"&gt;</w:t>
       </w:r>
     </w:p>
   </w:comment>
-  <w:comment w:id="3" w:author="" w:date="2026-10-20T05:42:03Z" w:initials="">
+  <w:comment w:id="3" w:author="" w:date="2026-10-20T06:07:44Z" w:initials="">
     <w:p>
       <w:r>
         <w:t>HTML: &lt;meta name="keyword" content="ISM"&gt;</w:t>
       </w:r>
     </w:p>
   </w:comment>
-  <w:comment w:id="4" w:author="" w:date="2026-10-20T05:42:03Z" w:initials="">
+  <w:comment w:id="4" w:author="" w:date="2026-10-20T06:07:44Z" w:initials="">
     <w:p>
       <w:r>
         <w:t>HTML: &lt;meta name="keyword" content="location"&gt;</w:t>
       </w:r>
     </w:p>
   </w:comment>
-  <w:comment w:id="5" w:author="" w:date="2026-10-20T05:42:03Z" w:initials="">
+  <w:comment w:id="5" w:author="" w:date="2026-10-20T06:07:44Z" w:initials="">
     <w:p>
       <w:r>
         <w:t>HTML: &lt;meta name="keyword" content="802.15.4"&gt;</w:t>
       </w:r>
     </w:p>
   </w:comment>
-  <w:comment w:id="6" w:author="" w:date="2026-10-20T05:42:03Z" w:initials="">
+  <w:comment w:id="6" w:author="" w:date="2026-10-20T06:07:44Z" w:initials="">
     <w:p>
       <w:r>
         <w:t>HTML: &lt;meta name="keyword" content="CBOR"&gt;</w:t>

</xml_diff>

<commit_message>
Draft: ASCII text outside SVG (idnits non-ASCII warning)
idnits 2.17.1 warned about 288 lines with non-ASCII characters in the
text rendering (RFC 7997). Outside inline SVG the XML now uses ASCII:
box drawing and en dashes become "-", em dashes "--", "->" for arrows,
"~" for approximately, "^2" for squared, "x" for times, separators in
the face table become commas, "39N" for coordinates and " deg" for
other angles, "47 CFR 90.619" without the section sign, and "Sao Paulo".
Also fixes the "Wirelesss" typo in Appendix B.

build.sh now fails if the text rendering contains non-ASCII.
idnits --submitcheck reports no nits.
</commit_message>
<xml_diff>
--- a/draft/draft-hanley-rsdggs-00.docx
+++ b/draft/draft-hanley-rsdggs-00.docx
@@ -1073,7 +1073,7 @@
           <w:rPr>
             <w:rStyle w:val="Hyperlink"/>
           </w:rPr>
-          <w:t>RSDGGS Dodecahedron Net — ISM Band Regulatory Coverage Map</w:t>
+          <w:t>RSDGGS Dodecahedron Net -- ISM Band Regulatory Coverage Map</w:t>
         </w:r>
       </w:hyperlink>
     </w:p>
@@ -5501,7 +5501,7 @@
           <w:rPr>
             <w:rStyle w:val="Hyperlink"/>
           </w:rPr>
-          <w:t>GPSR — Greedy Perimeter Stateless Routing (from US 10,812,365)</w:t>
+          <w:t>GPSR -- Greedy Perimeter Stateless Routing (from US 10,812,365)</w:t>
         </w:r>
       </w:hyperlink>
     </w:p>
@@ -5542,7 +5542,7 @@
           <w:rPr>
             <w:rStyle w:val="Hyperlink"/>
           </w:rPr>
-          <w:t>IEEE 802.11d — Country Information Elements (from US 10,306,400 family)</w:t>
+          <w:t>IEEE 802.11d -- Country Information Elements (from US 10,306,400 family)</w:t>
         </w:r>
       </w:hyperlink>
     </w:p>
@@ -5583,7 +5583,7 @@
           <w:rPr>
             <w:rStyle w:val="Hyperlink"/>
           </w:rPr>
-          <w:t>IEEE 802.11h — DFS and TPC (from US 10,306,400 family)</w:t>
+          <w:t>IEEE 802.11h -- DFS and TPC (from US 10,306,400 family)</w:t>
         </w:r>
       </w:hyperlink>
     </w:p>
@@ -5624,7 +5624,7 @@
           <w:rPr>
             <w:rStyle w:val="Hyperlink"/>
           </w:rPr>
-          <w:t>RFC 3693 — GEOPRIV Requirements (from RFC 6442 and RFC 6280)</w:t>
+          <w:t>RFC 3693 -- GEOPRIV Requirements (from RFC 6442 and RFC 6280)</w:t>
         </w:r>
       </w:hyperlink>
     </w:p>
@@ -5665,7 +5665,7 @@
           <w:rPr>
             <w:rStyle w:val="Hyperlink"/>
           </w:rPr>
-          <w:t>RFC 3825 — DHCP Geodetic Location Option (from RFC 5870 and RFC 5808)</w:t>
+          <w:t>RFC 3825 -- DHCP Geodetic Location Option (from RFC 5870 and RFC 5808)</w:t>
         </w:r>
       </w:hyperlink>
     </w:p>
@@ -5706,7 +5706,7 @@
           <w:rPr>
             <w:rStyle w:val="Hyperlink"/>
           </w:rPr>
-          <w:t>RFC 4632 — CIDR: Classless Inter-Domain Routing (from RFC 9632)</w:t>
+          <w:t>RFC 4632 -- CIDR: Classless Inter-Domain Routing (from RFC 9632)</w:t>
         </w:r>
       </w:hyperlink>
     </w:p>
@@ -5747,7 +5747,7 @@
           <w:rPr>
             <w:rStyle w:val="Hyperlink"/>
           </w:rPr>
-          <w:t>RFC 6269 — Issues with IP Address Sharing (from RFC 9632)</w:t>
+          <w:t>RFC 6269 -- Issues with IP Address Sharing (from RFC 9632)</w:t>
         </w:r>
       </w:hyperlink>
     </w:p>
@@ -5788,7 +5788,7 @@
           <w:rPr>
             <w:rStyle w:val="Hyperlink"/>
           </w:rPr>
-          <w:t>GeoCast — Geographic Addressing and Routing (from RFC 2009)</w:t>
+          <w:t>GeoCast -- Geographic Addressing and Routing (from RFC 2009)</w:t>
         </w:r>
       </w:hyperlink>
     </w:p>
@@ -5911,7 +5911,7 @@
           <w:rPr>
             <w:rStyle w:val="Hyperlink"/>
           </w:rPr>
-          <w:t>Expired Patents — Public Domain Prior Art</w:t>
+          <w:t>Expired Patents -- Public Domain Prior Art</w:t>
         </w:r>
       </w:hyperlink>
     </w:p>
@@ -5952,7 +5952,7 @@
           <w:rPr>
             <w:rStyle w:val="Hyperlink"/>
           </w:rPr>
-          <w:t>US Patent 4,939,726 — Metricom, Inc. (Expired 2007)</w:t>
+          <w:t>US Patent 4,939,726 -- Metricom, Inc. (Expired 2007)</w:t>
         </w:r>
       </w:hyperlink>
     </w:p>
@@ -5993,7 +5993,7 @@
           <w:rPr>
             <w:rStyle w:val="Hyperlink"/>
           </w:rPr>
-          <w:t>US Patent 6,982,966 — Status Unconfirmed</w:t>
+          <w:t>US Patent 6,982,966 -- Status Unconfirmed</w:t>
         </w:r>
       </w:hyperlink>
     </w:p>
@@ -6034,7 +6034,7 @@
           <w:rPr>
             <w:rStyle w:val="Hyperlink"/>
           </w:rPr>
-          <w:t>Active Patents — Detailed Analysis</w:t>
+          <w:t>Active Patents -- Detailed Analysis</w:t>
         </w:r>
       </w:hyperlink>
     </w:p>
@@ -6075,7 +6075,7 @@
           <w:rPr>
             <w:rStyle w:val="Hyperlink"/>
           </w:rPr>
-          <w:t>US Patent 10,306,400 / Application 2014/0162692 — Wirelesss Regulatory Compliance (Active until ~2035)</w:t>
+          <w:t>US Patent 10,306,400 / Application 2014/0162692 -- Wireless Regulatory Compliance (Active until ~2035)</w:t>
         </w:r>
       </w:hyperlink>
     </w:p>
@@ -6116,7 +6116,7 @@
           <w:rPr>
             <w:rStyle w:val="Hyperlink"/>
           </w:rPr>
-          <w:t>US Patent 10,812,365 — Geohyperbolic Routing (Northeastern University, Active until 2037)</w:t>
+          <w:t>US Patent 10,812,365 -- Geohyperbolic Routing (Northeastern University, Active until 2037)</w:t>
         </w:r>
       </w:hyperlink>
     </w:p>
@@ -6157,7 +6157,7 @@
           <w:rPr>
             <w:rStyle w:val="Hyperlink"/>
           </w:rPr>
-          <w:t>US Patent 11,652,742 — Ghost Routing (Microsoft, Active until 2041)</w:t>
+          <w:t>US Patent 11,652,742 -- Ghost Routing (Microsoft, Active until 2041)</w:t>
         </w:r>
       </w:hyperlink>
     </w:p>
@@ -6198,7 +6198,7 @@
           <w:rPr>
             <w:rStyle w:val="Hyperlink"/>
           </w:rPr>
-          <w:t>CN101923801B — Method for Generating a Regular Dodecahedron Map Projection (Expired)</w:t>
+          <w:t>CN101923801B -- Method for Generating a Regular Dodecahedron Map Projection (Expired)</w:t>
         </w:r>
       </w:hyperlink>
     </w:p>
@@ -6280,7 +6280,7 @@
           <w:rPr>
             <w:rStyle w:val="Hyperlink"/>
           </w:rPr>
-          <w:t>RFC 2009 — GPS-Based Addressing (1996, Experimental/Legacy)</w:t>
+          <w:t>RFC 2009 -- GPS-Based Addressing (1996, Experimental/Legacy)</w:t>
         </w:r>
       </w:hyperlink>
     </w:p>
@@ -6321,7 +6321,7 @@
           <w:rPr>
             <w:rStyle w:val="Hyperlink"/>
           </w:rPr>
-          <w:t>RFC 5870 — geo URI Scheme (2010, Standards Track)</w:t>
+          <w:t>RFC 5870 -- geo URI Scheme (2010, Standards Track)</w:t>
         </w:r>
       </w:hyperlink>
     </w:p>
@@ -6362,7 +6362,7 @@
           <w:rPr>
             <w:rStyle w:val="Hyperlink"/>
           </w:rPr>
-          <w:t>RFC 6442 — Location Conveyance for SIP (2011, Standards Track)</w:t>
+          <w:t>RFC 6442 -- Location Conveyance for SIP (2011, Standards Track)</w:t>
         </w:r>
       </w:hyperlink>
     </w:p>
@@ -6403,7 +6403,7 @@
           <w:rPr>
             <w:rStyle w:val="Hyperlink"/>
           </w:rPr>
-          <w:t>RFC 9179 — YANG Grouping for Geographic Locations (2022, Standards Track)</w:t>
+          <w:t>RFC 9179 -- YANG Grouping for Geographic Locations (2022, Standards Track)</w:t>
         </w:r>
       </w:hyperlink>
     </w:p>
@@ -6444,7 +6444,7 @@
           <w:rPr>
             <w:rStyle w:val="Hyperlink"/>
           </w:rPr>
-          <w:t>RFC 9632 / RFC 8805 — Geofeed Data (2024 / 2020)</w:t>
+          <w:t>RFC 9632 / RFC 8805 -- Geofeed Data (2024 / 2020)</w:t>
         </w:r>
       </w:hyperlink>
     </w:p>
@@ -6485,7 +6485,7 @@
           <w:rPr>
             <w:rStyle w:val="Hyperlink"/>
           </w:rPr>
-          <w:t>RFC 5808 — Location-by-Reference Requirements (2010, Informational)</w:t>
+          <w:t>RFC 5808 -- Location-by-Reference Requirements (2010, Informational)</w:t>
         </w:r>
       </w:hyperlink>
     </w:p>
@@ -6526,7 +6526,7 @@
           <w:rPr>
             <w:rStyle w:val="Hyperlink"/>
           </w:rPr>
-          <w:t>RFC 5491 — PIDF-LO Usage (2009, Standards Track)</w:t>
+          <w:t>RFC 5491 -- PIDF-LO Usage (2009, Standards Track)</w:t>
         </w:r>
       </w:hyperlink>
     </w:p>
@@ -6567,7 +6567,7 @@
           <w:rPr>
             <w:rStyle w:val="Hyperlink"/>
           </w:rPr>
-          <w:t>RFC 6280 — GEOPRIV Architecture (2011, BCP)</w:t>
+          <w:t>RFC 6280 -- GEOPRIV Architecture (2011, BCP)</w:t>
         </w:r>
       </w:hyperlink>
     </w:p>
@@ -6608,7 +6608,7 @@
           <w:rPr>
             <w:rStyle w:val="Hyperlink"/>
           </w:rPr>
-          <w:t>RFC 6772 — Geolocation Policy (2013, Standards Track)</w:t>
+          <w:t>RFC 6772 -- Geolocation Policy (2013, Standards Track)</w:t>
         </w:r>
       </w:hyperlink>
     </w:p>
@@ -7746,7 +7746,7 @@
       <w:bookmarkEnd w:id="365"/>
       <w:r>
         <w:rPr/>
-        <w:t>G1 — Regulatory Alignment: The coarsest index level MUST correspond to ITU Radio Region boundaries. Face indices 1, 2, and 3 SHALL correspond to ITU Regions 1, 2, and 3 respectively, enabling a single-octet lookup to determine gross band availability for most ISM bands.</w:t>
+        <w:t>G1 -- Regulatory Alignment: The coarsest index level MUST correspond to ITU Radio Region boundaries. Face indices 1, 2, and 3 SHALL correspond to ITU Regions 1, 2, and 3 respectively, enabling a single-octet lookup to determine gross band availability for most ISM bands.</w:t>
       </w:r>
     </w:p>
     <w:p>
@@ -7761,7 +7761,7 @@
       <w:bookmarkEnd w:id="366"/>
       <w:r>
         <w:rPr/>
-        <w:t>G2 — Self-Describing Resolution: The length of the index in octets SHALL implicitly encode its resolution. No explicit resolution field is required. This enables resolution to be communicated through the CBOR byte string length header at zero additional cost.</w:t>
+        <w:t>G2 -- Self-Describing Resolution: The length of the index in octets SHALL implicitly encode its resolution. No explicit resolution field is required. This enables resolution to be communicated through the CBOR byte string length header at zero additional cost.</w:t>
       </w:r>
     </w:p>
     <w:p>
@@ -7776,7 +7776,7 @@
       <w:bookmarkEnd w:id="367"/>
       <w:r>
         <w:rPr/>
-        <w:t>G3 — Privacy Truncation: Truncating the index from the right SHALL yield a valid, coarser-resolution index. Devices MAY share a truncated index to disclose only the precision required for the intended purpose, protecting precise location from unnecessary disclosure.</w:t>
+        <w:t>G3 -- Privacy Truncation: Truncating the index from the right SHALL yield a valid, coarser-resolution index. Devices MAY share a truncated index to disclose only the precision required for the intended purpose, protecting precise location from unnecessary disclosure.</w:t>
       </w:r>
     </w:p>
     <w:p>
@@ -7791,7 +7791,7 @@
       <w:bookmarkEnd w:id="368"/>
       <w:r>
         <w:rPr/>
-        <w:t>G4 — Embedded Deployment: The encoding and decoding algorithms SHALL be implementable in constrained environments with no heap allocation (no_std, no_alloc in Rust; fixed stack in C). The index fits within a uint64_t.</w:t>
+        <w:t>G4 -- Embedded Deployment: The encoding and decoding algorithms SHALL be implementable in constrained environments with no heap allocation (no_std, no_alloc in Rust; fixed stack in C). The index fits within a uint64_t.</w:t>
       </w:r>
     </w:p>
     <w:p>
@@ -7806,7 +7806,7 @@
       <w:bookmarkEnd w:id="369"/>
       <w:r>
         <w:rPr/>
-        <w:t>G5 — CBOR Integration: The index SHALL serialize naturally as a CBOR byte string (major type 2), with the CBOR length header providing resolution information to the receiver at no additional encoding cost.</w:t>
+        <w:t>G5 -- CBOR Integration: The index SHALL serialize naturally as a CBOR byte string (major type 2), with the CBOR length header providing resolution information to the receiver at no additional encoding cost.</w:t>
       </w:r>
     </w:p>
     <w:p>
@@ -7821,7 +7821,7 @@
       <w:bookmarkEnd w:id="370"/>
       <w:r>
         <w:rPr/>
-        <w:t>G6 — Peer-Assisted Discovery: Location-unaware devices SHALL be able to derive their applicable regulatory parameters by receiving a beacon from a location-aware peer, using only the ISM channels permitted at the beacon device's location.</w:t>
+        <w:t>G6 -- Peer-Assisted Discovery: Location-unaware devices SHALL be able to derive their applicable regulatory parameters by receiving a beacon from a location-aware peer, using only the ISM channels permitted at the beacon device's location.</w:t>
       </w:r>
     </w:p>
     <w:p>
@@ -7836,7 +7836,7 @@
       <w:bookmarkEnd w:id="371"/>
       <w:r>
         <w:rPr/>
-        <w:t>G7 — Manufacturing Provisionability: Fixed-deployment IoT devices SHALL be provisionable with their RSDGGS index at manufacturing time, enabling a single hardware SKU to configure itself correctly based on deployment location without firmware variants.</w:t>
+        <w:t>G7 -- Manufacturing Provisionability: Fixed-deployment IoT devices SHALL be provisionable with their RSDGGS index at manufacturing time, enabling a single hardware SKU to configure itself correctly based on deployment location without firmware variants.</w:t>
       </w:r>
     </w:p>
     <w:p>
@@ -7851,7 +7851,7 @@
       <w:bookmarkEnd w:id="372"/>
       <w:r>
         <w:rPr/>
-        <w:t>G8 — Decentralized, Infrastructure-Independent Operation: RSDGGS regulatory context discovery MUST NOT require any centralized server, directory, or management system. All mechanisms for a device to acquire its RSDGGS cell index and associated regulatory rule set SHALL be fully operational in the absence of any network infrastructure beyond the device and its immediate radio neighbors. This precludes DHCP, DNS, and any client-server configuration protocol as a required element of the regulatory bootstrap path. In particular, DHCPv6 introduces a single point of failure: if the DHCP server is unavailable, onboarding nodes cannot be configured. RSDGGS instead follows the model of IPv6 SLAAC (Stateless Address Autoconfiguration) and Neighbor Discovery: a device SHALL be able to determine its own regulatory context from the devices around it, with no dependence on reachability to any server. Tethered devices such as smartphones used for provisioning, and infrastructure systems such as manufacturing databases or cloud enrollment services, are permitted as optional accelerators of the bootstrap process but MUST NOT be required for correct operation. A Naive Device with no tethering, no GPS, no DHCP, and no pre-provisioned cell index SHALL converge on a valid regulatory context solely through the peer-assisted mechanism defined in Section 11.</w:t>
+        <w:t>G8 -- Decentralized, Infrastructure-Independent Operation: RSDGGS regulatory context discovery MUST NOT require any centralized server, directory, or management system. All mechanisms for a device to acquire its RSDGGS cell index and associated regulatory rule set SHALL be fully operational in the absence of any network infrastructure beyond the device and its immediate radio neighbors. This precludes DHCP, DNS, and any client-server configuration protocol as a required element of the regulatory bootstrap path. In particular, DHCPv6 introduces a single point of failure: if the DHCP server is unavailable, onboarding nodes cannot be configured. RSDGGS instead follows the model of IPv6 SLAAC (Stateless Address Autoconfiguration) and Neighbor Discovery: a device SHALL be able to determine its own regulatory context from the devices around it, with no dependence on reachability to any server. Tethered devices such as smartphones used for provisioning, and infrastructure systems such as manufacturing databases or cloud enrollment services, are permitted as optional accelerators of the bootstrap process but MUST NOT be required for correct operation. A Naive Device with no tethering, no GPS, no DHCP, and no pre-provisioned cell index SHALL converge on a valid regulatory context solely through the peer-assisted mechanism defined in Section 11.</w:t>
       </w:r>
     </w:p>
     <w:p>
@@ -7866,7 +7866,7 @@
       <w:bookmarkEnd w:id="373"/>
       <w:r>
         <w:rPr/>
-        <w:t>G9 — Extraterrestrial Extensibility: The RSDGGS index format SHALL be extensible to celestial bodies beyond Earth without changing the wire format, adding version bits, or breaking backward compatibility with existing Earth indices. The four most-significant bits of Octet 0 are designated as the celestial body selector, allowing up to 16 independent dodecahedral grids (one per body) to coexist within a single 8-octet index space. A body selector value of 0x0 (Earth) is the default and preserves full backward compatibility: all RSDGGS indices generated before the body selector field was defined decode identically as Earth face indices. This design goal is motivated by the increasing operational relevance of wireless communications on the Moon (Artemis Program), Mars (long-duration missions), and other bodies where radio frequency coordination under the Outer Space Treaty (1967) will require a compact, self-describing location encoding.</w:t>
+        <w:t>G9 -- Extraterrestrial Extensibility: The RSDGGS index format SHALL be extensible to celestial bodies beyond Earth without changing the wire format, adding version bits, or breaking backward compatibility with existing Earth indices. The four most-significant bits of Octet 0 are designated as the celestial body selector, allowing up to 16 independent dodecahedral grids (one per body) to coexist within a single 8-octet index space. A body selector value of 0x0 (Earth) is the default and preserves full backward compatibility: all RSDGGS indices generated before the body selector field was defined decode identically as Earth face indices. This design goal is motivated by the increasing operational relevance of wireless communications on the Moon (Artemis Program), Mars (long-duration missions), and other bodies where radio frequency coordination under the Outer Space Treaty (1967) will require a compact, self-describing location encoding.</w:t>
       </w:r>
     </w:p>
     <w:p>
@@ -8061,7 +8061,7 @@
       </w:pPr>
       <w:r>
         <w:rPr/>
-        <w:t>Icosahedron — 20 triangular faces:</w:t>
+        <w:t>Icosahedron -- 20 triangular faces:</w:t>
       </w:r>
     </w:p>
     <w:p>
@@ -8077,7 +8077,7 @@
       </w:r>
       <w:r>
         <w:rPr/>
-        <w:t>Face area  ≈ 1/20 of sphere ≈ 25,500,000 km²</w:t>
+        <w:t>Face area  ~ 1/20 of sphere ~ 25,500,000 km^2</w:t>
       </w:r>
     </w:p>
     <w:p>
@@ -8093,55 +8093,55 @@
       </w:r>
       <w:r>
         <w:rPr/>
-        <w:t>ITU Region 2 (Americas) area ≈ 24,700,000 km²</w:t>
-      </w:r>
-    </w:p>
-    <w:p>
-      <w:pPr>
-        <w:pStyle w:val="PreformattedText"/>
-        <w:bidi w:val="0"/>
-        <w:jc w:val="left"/>
-        <w:rPr/>
-      </w:pPr>
-      <w:r>
-        <w:rPr/>
-        <w:t xml:space="preserve">  → </w:t>
-      </w:r>
-      <w:r>
-        <w:rPr/>
-        <w:t>Region 2 barely fits in one triangular face</w:t>
-      </w:r>
-    </w:p>
-    <w:p>
-      <w:pPr>
-        <w:pStyle w:val="PreformattedText"/>
-        <w:bidi w:val="0"/>
-        <w:jc w:val="left"/>
-        <w:rPr/>
-      </w:pPr>
-      <w:r>
-        <w:rPr/>
-        <w:t xml:space="preserve">  → </w:t>
-      </w:r>
-      <w:r>
-        <w:rPr/>
-        <w:t>Remaining 17 faces: over-partitions ITU regions at level 0</w:t>
-      </w:r>
-    </w:p>
-    <w:p>
-      <w:pPr>
-        <w:pStyle w:val="PreformattedText"/>
-        <w:bidi w:val="0"/>
-        <w:jc w:val="left"/>
-        <w:rPr/>
-      </w:pPr>
-      <w:r>
-        <w:rPr/>
-        <w:t xml:space="preserve">  → </w:t>
-      </w:r>
-      <w:r>
-        <w:rPr/>
-        <w:t>3 faces assigned to ITU Regions; 17 faces available for</w:t>
+        <w:t>ITU Region 2 (Americas) area ~ 24,700,000 km^2</w:t>
+      </w:r>
+    </w:p>
+    <w:p>
+      <w:pPr>
+        <w:pStyle w:val="PreformattedText"/>
+        <w:bidi w:val="0"/>
+        <w:jc w:val="left"/>
+        <w:rPr/>
+      </w:pPr>
+      <w:r>
+        <w:rPr/>
+        <w:t xml:space="preserve">  </w:t>
+      </w:r>
+      <w:r>
+        <w:rPr/>
+        <w:t>-&gt; Region 2 barely fits in one triangular face</w:t>
+      </w:r>
+    </w:p>
+    <w:p>
+      <w:pPr>
+        <w:pStyle w:val="PreformattedText"/>
+        <w:bidi w:val="0"/>
+        <w:jc w:val="left"/>
+        <w:rPr/>
+      </w:pPr>
+      <w:r>
+        <w:rPr/>
+        <w:t xml:space="preserve">  </w:t>
+      </w:r>
+      <w:r>
+        <w:rPr/>
+        <w:t>-&gt; Remaining 17 faces: over-partitions ITU regions at level 0</w:t>
+      </w:r>
+    </w:p>
+    <w:p>
+      <w:pPr>
+        <w:pStyle w:val="PreformattedText"/>
+        <w:bidi w:val="0"/>
+        <w:jc w:val="left"/>
+        <w:rPr/>
+      </w:pPr>
+      <w:r>
+        <w:rPr/>
+        <w:t xml:space="preserve">  </w:t>
+      </w:r>
+      <w:r>
+        <w:rPr/>
+        <w:t>-&gt; 3 faces assigned to ITU Regions; 17 faces available for</w:t>
       </w:r>
     </w:p>
     <w:p>
@@ -8157,23 +8157,23 @@
       </w:r>
       <w:r>
         <w:rPr/>
-        <w:t>sub-regions — excessive granularity at coarsest level</w:t>
-      </w:r>
-    </w:p>
-    <w:p>
-      <w:pPr>
-        <w:pStyle w:val="PreformattedText"/>
-        <w:bidi w:val="0"/>
-        <w:jc w:val="left"/>
-        <w:rPr/>
-      </w:pPr>
-      <w:r>
-        <w:rPr/>
-        <w:t xml:space="preserve">  → </w:t>
-      </w:r>
-      <w:r>
-        <w:rPr/>
-        <w:t>Triangle shape forces boundary cuts through</w:t>
+        <w:t>sub-regions -- excessive granularity at coarsest level</w:t>
+      </w:r>
+    </w:p>
+    <w:p>
+      <w:pPr>
+        <w:pStyle w:val="PreformattedText"/>
+        <w:bidi w:val="0"/>
+        <w:jc w:val="left"/>
+        <w:rPr/>
+      </w:pPr>
+      <w:r>
+        <w:rPr/>
+        <w:t xml:space="preserve">  </w:t>
+      </w:r>
+      <w:r>
+        <w:rPr/>
+        <w:t>-&gt; Triangle shape forces boundary cuts through</w:t>
       </w:r>
     </w:p>
     <w:p>
@@ -8212,7 +8212,7 @@
       </w:pPr>
       <w:r>
         <w:rPr/>
-        <w:t>Dodecahedron — 12 pentagonal faces:</w:t>
+        <w:t>Dodecahedron -- 12 pentagonal faces:</w:t>
       </w:r>
     </w:p>
     <w:p>
@@ -8228,7 +8228,7 @@
       </w:r>
       <w:r>
         <w:rPr/>
-        <w:t>Face area  ≈ 1/12 of sphere ≈ 42,000,000 km²</w:t>
+        <w:t>Face area  ~ 1/12 of sphere ~ 42,000,000 km^2</w:t>
       </w:r>
     </w:p>
     <w:p>
@@ -8244,23 +8244,23 @@
       </w:r>
       <w:r>
         <w:rPr/>
-        <w:t>ITU Region 2 (Americas) area ≈ 24,700,000 km²</w:t>
-      </w:r>
-    </w:p>
-    <w:p>
-      <w:pPr>
-        <w:pStyle w:val="PreformattedText"/>
-        <w:bidi w:val="0"/>
-        <w:jc w:val="left"/>
-        <w:rPr/>
-      </w:pPr>
-      <w:r>
-        <w:rPr/>
-        <w:t xml:space="preserve">  → </w:t>
-      </w:r>
-      <w:r>
-        <w:rPr/>
-        <w:t>Region 2 fits within one pentagonal face with</w:t>
+        <w:t>ITU Region 2 (Americas) area ~ 24,700,000 km^2</w:t>
+      </w:r>
+    </w:p>
+    <w:p>
+      <w:pPr>
+        <w:pStyle w:val="PreformattedText"/>
+        <w:bidi w:val="0"/>
+        <w:jc w:val="left"/>
+        <w:rPr/>
+      </w:pPr>
+      <w:r>
+        <w:rPr/>
+        <w:t xml:space="preserve">  </w:t>
+      </w:r>
+      <w:r>
+        <w:rPr/>
+        <w:t>-&gt; Region 2 fits within one pentagonal face with</w:t>
       </w:r>
     </w:p>
     <w:p>
@@ -8276,7 +8276,7 @@
       </w:r>
       <w:r>
         <w:rPr/>
-        <w:t>~17,300,000 km² margin — accommodates coastal</w:t>
+        <w:t>~17,300,000 km^2 margin -- accommodates coastal</w:t>
       </w:r>
     </w:p>
     <w:p>
@@ -8304,11 +8304,11 @@
       </w:pPr>
       <w:r>
         <w:rPr/>
-        <w:t xml:space="preserve">  → </w:t>
-      </w:r>
-      <w:r>
-        <w:rPr/>
-        <w:t>3 faces centred on the most populous zone of</w:t>
+        <w:t xml:space="preserve">  </w:t>
+      </w:r>
+      <w:r>
+        <w:rPr/>
+        <w:t>-&gt; 3 faces centred on the most populous zone of</w:t>
       </w:r>
     </w:p>
     <w:p>
@@ -8336,11 +8336,11 @@
       </w:pPr>
       <w:r>
         <w:rPr/>
-        <w:t xml:space="preserve">  → </w:t>
-      </w:r>
-      <w:r>
-        <w:rPr/>
-        <w:t>9 further faces; the two low-order bits of every</w:t>
+        <w:t xml:space="preserve">  </w:t>
+      </w:r>
+      <w:r>
+        <w:rPr/>
+        <w:t>-&gt; 9 further faces; the two low-order bits of every</w:t>
       </w:r>
     </w:p>
     <w:p>
@@ -8562,7 +8562,7 @@
       </w:r>
       <w:r>
         <w:rPr/>
-        <w:t>Gnomonic scale at edge midpoint: 1/cos²(20.9°) ≈ 1.15</w:t>
+        <w:t>Gnomonic scale at edge midpoint: 1/cos^2(20.9 deg) ~ 1.15</w:t>
       </w:r>
     </w:p>
     <w:p>
@@ -8578,7 +8578,7 @@
       </w:r>
       <w:r>
         <w:rPr/>
-        <w:t>Gnomonic scale at vertex:        1/cos²(41.8°) ≈ 1.80</w:t>
+        <w:t>Gnomonic scale at vertex:        1/cos^2(41.8 deg) ~ 1.80</w:t>
       </w:r>
     </w:p>
     <w:p>
@@ -8681,7 +8681,7 @@
       </w:r>
       <w:r>
         <w:rPr/>
-        <w:t>Gnomonic scale at edge midpoint: 1/cos²(31.7°) ≈ 1.38</w:t>
+        <w:t>Gnomonic scale at edge midpoint: 1/cos^2(31.7 deg) ~ 1.38</w:t>
       </w:r>
     </w:p>
     <w:p>
@@ -8697,7 +8697,7 @@
       </w:r>
       <w:r>
         <w:rPr/>
-        <w:t>Gnomonic scale at vertex:        1/cos²(41.8°) ≈ 1.80</w:t>
+        <w:t>Gnomonic scale at vertex:        1/cos^2(41.8 deg) ~ 1.80</w:t>
       </w:r>
     </w:p>
     <w:p>
@@ -8806,7 +8806,7 @@
       <w:bookmarkEnd w:id="387"/>
       <w:r>
         <w:rPr/>
-        <w:t>Pentagonal faces distribute boundary distortion more uniformly. The 108-degree interior angle of the regular pentagon produces a shallower boundary curvature, and the 1.30x distortion ratio means corner-adjacent cells and edge-midpoint-adjacent cells experience only 30 percent more scale variation. The progressive 4-fold triangular subdivision of each pentagonal sector (Section 4.5) places triangle apices at the face center — a fixed interior point — rather than at face corners, further reducing the population of high-distortion boundary cells in the subdivision hierarchy.</w:t>
+        <w:t>Pentagonal faces distribute boundary distortion more uniformly. The 108-degree interior angle of the regular pentagon produces a shallower boundary curvature, and the 1.30x distortion ratio means corner-adjacent cells and edge-midpoint-adjacent cells experience only 30 percent more scale variation. The progressive 4-fold triangular subdivision of each pentagonal sector (Section 4.5) places triangle apices at the face center -- a fixed interior point -- rather than at face corners, further reducing the population of high-distortion boundary cells in the subdivision hierarchy.</w:t>
       </w:r>
     </w:p>
     <w:p>
@@ -9256,28 +9256,28 @@
             </w:pPr>
             <w:r>
               <w:rPr/>
-              <w:t>~25.5M km² (tight fit)</w:t>
-            </w:r>
-          </w:p>
-        </w:tc>
-        <w:tc>
-          <w:tcPr>
-            <w:tcBorders/>
-            <w:vAlign w:val="center"/>
-          </w:tcPr>
-          <w:p>
-            <w:pPr>
-              <w:pStyle w:val="TableContents"/>
-              <w:widowControl w:val="false"/>
-              <w:suppressLineNumbers/>
-              <w:shd w:fill="F8F8F8" w:val="clear"/>
-              <w:bidi w:val="0"/>
-              <w:jc w:val="left"/>
-              <w:rPr/>
-            </w:pPr>
-            <w:r>
-              <w:rPr/>
-              <w:t>~42M km² (ample margin)</w:t>
+              <w:t>~25.5M km^2 (tight fit)</w:t>
+            </w:r>
+          </w:p>
+        </w:tc>
+        <w:tc>
+          <w:tcPr>
+            <w:tcBorders/>
+            <w:vAlign w:val="center"/>
+          </w:tcPr>
+          <w:p>
+            <w:pPr>
+              <w:pStyle w:val="TableContents"/>
+              <w:widowControl w:val="false"/>
+              <w:suppressLineNumbers/>
+              <w:shd w:fill="F8F8F8" w:val="clear"/>
+              <w:bidi w:val="0"/>
+              <w:jc w:val="left"/>
+              <w:rPr/>
+            </w:pPr>
+            <w:r>
+              <w:rPr/>
+              <w:t>~42M km^2 (ample margin)</w:t>
             </w:r>
           </w:p>
         </w:tc>
@@ -9833,10 +9833,10 @@
       </w:tblPr>
       <w:tblGrid>
         <w:gridCol w:w="586"/>
-        <w:gridCol w:w="1902"/>
-        <w:gridCol w:w="2424"/>
-        <w:gridCol w:w="1997"/>
-        <w:gridCol w:w="3630"/>
+        <w:gridCol w:w="1915"/>
+        <w:gridCol w:w="2385"/>
+        <w:gridCol w:w="2000"/>
+        <w:gridCol w:w="3653"/>
       </w:tblGrid>
       <w:tr>
         <w:trPr>
@@ -9983,7 +9983,7 @@
             </w:pPr>
             <w:r>
               <w:rPr/>
-              <w:t>—</w:t>
+              <w:t>--</w:t>
             </w:r>
           </w:p>
         </w:tc>
@@ -10112,7 +10112,7 @@
             </w:pPr>
             <w:r>
               <w:rPr/>
-              <w:t>ITU Region 1 — Europe</w:t>
+              <w:t>ITU Region 1 -- Europe</w:t>
             </w:r>
           </w:p>
         </w:tc>
@@ -10220,7 +10220,7 @@
             </w:pPr>
             <w:r>
               <w:rPr/>
-              <w:t>ITU Region 2 — North America</w:t>
+              <w:t>ITU Region 2 -- North America</w:t>
             </w:r>
           </w:p>
         </w:tc>
@@ -10328,7 +10328,7 @@
             </w:pPr>
             <w:r>
               <w:rPr/>
-              <w:t>ITU Region 3 — Asia</w:t>
+              <w:t>ITU Region 3 -- Asia</w:t>
             </w:r>
           </w:p>
         </w:tc>
@@ -10415,7 +10415,7 @@
             </w:pPr>
             <w:r>
               <w:rPr/>
-              <w:t>—</w:t>
+              <w:t>--</w:t>
             </w:r>
           </w:p>
         </w:tc>
@@ -10544,7 +10544,7 @@
             </w:pPr>
             <w:r>
               <w:rPr/>
-              <w:t>Region 1 — Africa / Middle East</w:t>
+              <w:t>Region 1 -- Africa / Middle East</w:t>
             </w:r>
           </w:p>
         </w:tc>
@@ -10652,7 +10652,7 @@
             </w:pPr>
             <w:r>
               <w:rPr/>
-              <w:t>Region 2 — South America</w:t>
+              <w:t>Region 2 -- South America</w:t>
             </w:r>
           </w:p>
         </w:tc>
@@ -10760,7 +10760,7 @@
             </w:pPr>
             <w:r>
               <w:rPr/>
-              <w:t>Region 3 — Eastern Australia</w:t>
+              <w:t>Region 3 -- Eastern Australia</w:t>
             </w:r>
           </w:p>
         </w:tc>
@@ -10847,7 +10847,7 @@
             </w:pPr>
             <w:r>
               <w:rPr/>
-              <w:t>—</w:t>
+              <w:t>--</w:t>
             </w:r>
           </w:p>
         </w:tc>
@@ -10976,7 +10976,7 @@
             </w:pPr>
             <w:r>
               <w:rPr/>
-              <w:t>Region 1 — West Africa</w:t>
+              <w:t>Region 1 -- West Africa</w:t>
             </w:r>
           </w:p>
         </w:tc>
@@ -11084,7 +11084,7 @@
             </w:pPr>
             <w:r>
               <w:rPr/>
-              <w:t>Region 2 — Central Pacific</w:t>
+              <w:t>Region 2 -- Central Pacific</w:t>
             </w:r>
           </w:p>
         </w:tc>
@@ -11192,7 +11192,7 @@
             </w:pPr>
             <w:r>
               <w:rPr/>
-              <w:t>Region 3 — North Pacific</w:t>
+              <w:t>Region 3 -- North Pacific</w:t>
             </w:r>
           </w:p>
         </w:tc>
@@ -12405,7 +12405,7 @@
           <w:rPr>
             <w:rStyle w:val="Hyperlink"/>
           </w:rPr>
-          <w:t>RSDGGS Dodecahedron Net — ISM Band Regulatory Coverage Map</w:t>
+          <w:t>RSDGGS Dodecahedron Net -- ISM Band Regulatory Coverage Map</w:t>
         </w:r>
       </w:hyperlink>
       <w:r>
@@ -12433,7 +12433,7 @@
       </w:hyperlink>
       <w:r>
         <w:rPr/>
-        <w:t xml:space="preserve"> shows the RSDGGS dodecahedron as a cut-and-fold net. The net shows all twelve faces in their correct topological adjacency, with shared fold edges indicated by dashed lines and free cut edges indicated by solid lines with outlined glue tabs. Each pentagonal face is rendered using a gnomonic projection centered on that face's sphere center, ensuring that geographic features are continuous across every fold edge: a coastline, national border, or regulatory boundary that crosses from one face to an adjacent face appears as an unbroken line on both faces. Geographic continuity across all eleven fold edges was verified to within 0.006° of arc (numerical precision only).</w:t>
+        <w:t xml:space="preserve"> shows the RSDGGS dodecahedron as a cut-and-fold net. The net shows all twelve faces in their correct topological adjacency, with shared fold edges indicated by dashed lines and free cut edges indicated by solid lines with outlined glue tabs. Each pentagonal face is rendered using a gnomonic projection centered on that face's sphere center, ensuring that geographic features are continuous across every fold edge: a coastline, national border, or regulatory boundary that crosses from one face to an adjacent face appears as an unbroken line on both faces. Geographic continuity across all eleven fold edges was verified to within 0.006 deg of arc (numerical precision only).</w:t>
       </w:r>
     </w:p>
     <w:p>
@@ -12851,11 +12851,11 @@
         </w:tblCellMar>
       </w:tblPr>
       <w:tblGrid>
-        <w:gridCol w:w="1524"/>
-        <w:gridCol w:w="2666"/>
+        <w:gridCol w:w="1525"/>
+        <w:gridCol w:w="2670"/>
         <w:gridCol w:w="1078"/>
-        <w:gridCol w:w="1539"/>
-        <w:gridCol w:w="3732"/>
+        <w:gridCol w:w="1527"/>
+        <w:gridCol w:w="3739"/>
       </w:tblGrid>
       <w:tr>
         <w:trPr>
@@ -13044,7 +13044,7 @@
             </w:pPr>
             <w:r>
               <w:rPr/>
-              <w:t>433.050–434.790 MHz</w:t>
+              <w:t>433.050-434.790 MHz</w:t>
             </w:r>
           </w:p>
         </w:tc>
@@ -13152,7 +13152,7 @@
             </w:pPr>
             <w:r>
               <w:rPr/>
-              <w:t>863–870 MHz (ETSI SRD)</w:t>
+              <w:t>863-870 MHz (ETSI SRD)</w:t>
             </w:r>
           </w:p>
         </w:tc>
@@ -13260,28 +13260,28 @@
             </w:pPr>
             <w:r>
               <w:rPr/>
-              <w:t>902–928 MHz</w:t>
-            </w:r>
-          </w:p>
-        </w:tc>
-        <w:tc>
-          <w:tcPr>
-            <w:tcBorders/>
-            <w:vAlign w:val="center"/>
-          </w:tcPr>
-          <w:p>
-            <w:pPr>
-              <w:pStyle w:val="TableContents"/>
-              <w:widowControl w:val="false"/>
-              <w:suppressLineNumbers/>
-              <w:shd w:fill="F8F8F8" w:val="clear"/>
-              <w:bidi w:val="0"/>
-              <w:jc w:val="left"/>
-              <w:rPr/>
-            </w:pPr>
-            <w:r>
-              <w:rPr/>
-              <w:t>ITU Region 2 (Americas) plus Australia, New Zealand, Taiwan, and Japan (920–928 MHz only)</w:t>
+              <w:t>902-928 MHz</w:t>
+            </w:r>
+          </w:p>
+        </w:tc>
+        <w:tc>
+          <w:tcPr>
+            <w:tcBorders/>
+            <w:vAlign w:val="center"/>
+          </w:tcPr>
+          <w:p>
+            <w:pPr>
+              <w:pStyle w:val="TableContents"/>
+              <w:widowControl w:val="false"/>
+              <w:suppressLineNumbers/>
+              <w:shd w:fill="F8F8F8" w:val="clear"/>
+              <w:bidi w:val="0"/>
+              <w:jc w:val="left"/>
+              <w:rPr/>
+            </w:pPr>
+            <w:r>
+              <w:rPr/>
+              <w:t>ITU Region 2 (Americas) plus Australia, New Zealand, Taiwan, and Japan (920-928 MHz only)</w:t>
             </w:r>
           </w:p>
         </w:tc>
@@ -13368,28 +13368,28 @@
             </w:pPr>
             <w:r>
               <w:rPr/>
-              <w:t>2400–2500 MHz</w:t>
-            </w:r>
-          </w:p>
-        </w:tc>
-        <w:tc>
-          <w:tcPr>
-            <w:tcBorders/>
-            <w:vAlign w:val="center"/>
-          </w:tcPr>
-          <w:p>
-            <w:pPr>
-              <w:pStyle w:val="TableContents"/>
-              <w:widowControl w:val="false"/>
-              <w:suppressLineNumbers/>
-              <w:shd w:fill="F8F8F8" w:val="clear"/>
-              <w:bidi w:val="0"/>
-              <w:jc w:val="left"/>
-              <w:rPr/>
-            </w:pPr>
-            <w:r>
-              <w:rPr/>
-              <w:t>Global allocation — all countries (informational baseline, universal)</w:t>
+              <w:t>2400-2500 MHz</w:t>
+            </w:r>
+          </w:p>
+        </w:tc>
+        <w:tc>
+          <w:tcPr>
+            <w:tcBorders/>
+            <w:vAlign w:val="center"/>
+          </w:tcPr>
+          <w:p>
+            <w:pPr>
+              <w:pStyle w:val="TableContents"/>
+              <w:widowControl w:val="false"/>
+              <w:suppressLineNumbers/>
+              <w:shd w:fill="F8F8F8" w:val="clear"/>
+              <w:bidi w:val="0"/>
+              <w:jc w:val="left"/>
+              <w:rPr/>
+            </w:pPr>
+            <w:r>
+              <w:rPr/>
+              <w:t>Global allocation -- all countries (informational baseline, universal)</w:t>
             </w:r>
           </w:p>
         </w:tc>
@@ -13476,7 +13476,7 @@
             </w:pPr>
             <w:r>
               <w:rPr/>
-              <w:t>2400–2500 MHz</w:t>
+              <w:t>2400-2500 MHz</w:t>
             </w:r>
           </w:p>
         </w:tc>
@@ -13676,7 +13676,7 @@
       <w:bookmarkEnd w:id="420"/>
       <w:r>
         <w:rPr/>
-        <w:t>Each face of the RSDGGS dodecahedron is labeled with its face index (0–11). The face index is the RSDGGS encoding value returned for any coordinate within that face at 1-byte resolution. The following table maps each face index to its geographic coverage and the principal national regulatory bodies whose ISM band rules apply within that face.</w:t>
+        <w:t>Each face of the RSDGGS dodecahedron is labeled with its face index (0-11). The face index is the RSDGGS encoding value returned for any coordinate within that face at 1-byte resolution. The following table maps each face index to its geographic coverage and the principal national regulatory bodies whose ISM band rules apply within that face.</w:t>
       </w:r>
     </w:p>
     <w:p>
@@ -13766,10 +13766,10 @@
       </w:tblPr>
       <w:tblGrid>
         <w:gridCol w:w="586"/>
-        <w:gridCol w:w="1763"/>
-        <w:gridCol w:w="1572"/>
-        <w:gridCol w:w="2919"/>
-        <w:gridCol w:w="3699"/>
+        <w:gridCol w:w="1751"/>
+        <w:gridCol w:w="1566"/>
+        <w:gridCol w:w="3053"/>
+        <w:gridCol w:w="3583"/>
       </w:tblGrid>
       <w:tr>
         <w:trPr>
@@ -13958,28 +13958,28 @@
             </w:pPr>
             <w:r>
               <w:rPr/>
-              <w:t>Antarctic Treaty · RSM (NZ)</w:t>
-            </w:r>
-          </w:p>
-        </w:tc>
-        <w:tc>
-          <w:tcPr>
-            <w:tcBorders/>
-            <w:vAlign w:val="center"/>
-          </w:tcPr>
-          <w:p>
-            <w:pPr>
-              <w:pStyle w:val="TableContents"/>
-              <w:widowControl w:val="false"/>
-              <w:suppressLineNumbers/>
-              <w:shd w:fill="F8F8F8" w:val="clear"/>
-              <w:bidi w:val="0"/>
-              <w:jc w:val="left"/>
-              <w:rPr/>
-            </w:pPr>
-            <w:r>
-              <w:rPr/>
-              <w:t>Antarctica: coordination required; NZ: 915–928 + 2.4 GHz</w:t>
+              <w:t>Antarctic Treaty, RSM (NZ)</w:t>
+            </w:r>
+          </w:p>
+        </w:tc>
+        <w:tc>
+          <w:tcPr>
+            <w:tcBorders/>
+            <w:vAlign w:val="center"/>
+          </w:tcPr>
+          <w:p>
+            <w:pPr>
+              <w:pStyle w:val="TableContents"/>
+              <w:widowControl w:val="false"/>
+              <w:suppressLineNumbers/>
+              <w:shd w:fill="F8F8F8" w:val="clear"/>
+              <w:bidi w:val="0"/>
+              <w:jc w:val="left"/>
+              <w:rPr/>
+            </w:pPr>
+            <w:r>
+              <w:rPr/>
+              <w:t>Antarctica: coordination required; NZ: 915-928 + 2.4 GHz</w:t>
             </w:r>
           </w:p>
         </w:tc>
@@ -14066,7 +14066,7 @@
             </w:pPr>
             <w:r>
               <w:rPr/>
-              <w:t>ETSI · Ofcom (UK) · ARCEP (FR) · BNetzA (DE)</w:t>
+              <w:t>ETSI, Ofcom (UK), ARCEP (FR), BNetzA (DE)</w:t>
             </w:r>
           </w:p>
         </w:tc>
@@ -14174,28 +14174,28 @@
             </w:pPr>
             <w:r>
               <w:rPr/>
-              <w:t>FCC (US) · ISED (CA) · IFT (MX)</w:t>
-            </w:r>
-          </w:p>
-        </w:tc>
-        <w:tc>
-          <w:tcPr>
-            <w:tcBorders/>
-            <w:vAlign w:val="center"/>
-          </w:tcPr>
-          <w:p>
-            <w:pPr>
-              <w:pStyle w:val="TableContents"/>
-              <w:widowControl w:val="false"/>
-              <w:suppressLineNumbers/>
-              <w:shd w:fill="F8F8F8" w:val="clear"/>
-              <w:bidi w:val="0"/>
-              <w:jc w:val="left"/>
-              <w:rPr/>
-            </w:pPr>
-            <w:r>
-              <w:rPr/>
-              <w:t>902–928 + 2.4 GHz</w:t>
+              <w:t>FCC (US), ISED (CA), IFT (MX)</w:t>
+            </w:r>
+          </w:p>
+        </w:tc>
+        <w:tc>
+          <w:tcPr>
+            <w:tcBorders/>
+            <w:vAlign w:val="center"/>
+          </w:tcPr>
+          <w:p>
+            <w:pPr>
+              <w:pStyle w:val="TableContents"/>
+              <w:widowControl w:val="false"/>
+              <w:suppressLineNumbers/>
+              <w:shd w:fill="F8F8F8" w:val="clear"/>
+              <w:bidi w:val="0"/>
+              <w:jc w:val="left"/>
+              <w:rPr/>
+            </w:pPr>
+            <w:r>
+              <w:rPr/>
+              <w:t>902-928 + 2.4 GHz</w:t>
             </w:r>
           </w:p>
         </w:tc>
@@ -14282,28 +14282,28 @@
             </w:pPr>
             <w:r>
               <w:rPr/>
-              <w:t>MIC (JP) · MIIT (CN) · KCC (KR) · NCC (TW) · WPC/DoT (IN)</w:t>
-            </w:r>
-          </w:p>
-        </w:tc>
-        <w:tc>
-          <w:tcPr>
-            <w:tcBorders/>
-            <w:vAlign w:val="center"/>
-          </w:tcPr>
-          <w:p>
-            <w:pPr>
-              <w:pStyle w:val="TableContents"/>
-              <w:widowControl w:val="false"/>
-              <w:suppressLineNumbers/>
-              <w:shd w:fill="F8F8F8" w:val="clear"/>
-              <w:bidi w:val="0"/>
-              <w:jc w:val="left"/>
-              <w:rPr/>
-            </w:pPr>
-            <w:r>
-              <w:rPr/>
-              <w:t>2.4 GHz; JP 920–928 MHz; TW 902–928 MHz; some: 920–925 MHz (IN, SG, MY, ID)</w:t>
+              <w:t>MIC (JP), MIIT (CN), KCC (KR), NCC (TW), WPC/DoT (IN)</w:t>
+            </w:r>
+          </w:p>
+        </w:tc>
+        <w:tc>
+          <w:tcPr>
+            <w:tcBorders/>
+            <w:vAlign w:val="center"/>
+          </w:tcPr>
+          <w:p>
+            <w:pPr>
+              <w:pStyle w:val="TableContents"/>
+              <w:widowControl w:val="false"/>
+              <w:suppressLineNumbers/>
+              <w:shd w:fill="F8F8F8" w:val="clear"/>
+              <w:bidi w:val="0"/>
+              <w:jc w:val="left"/>
+              <w:rPr/>
+            </w:pPr>
+            <w:r>
+              <w:rPr/>
+              <w:t>2.4 GHz; JP 920-928 MHz; TW 902-928 MHz; some: 920-925 MHz (IN, SG, MY, ID)</w:t>
             </w:r>
           </w:p>
         </w:tc>
@@ -14498,7 +14498,7 @@
             </w:pPr>
             <w:r>
               <w:rPr/>
-              <w:t>ATU East · ASMG · CCK (KE) · TCRA (TZ) · MCIT (SA) · TRA (AE)</w:t>
+              <w:t>ATU East, ASMG, CCK (KE), TCRA (TZ), MCIT (SA), TRA (AE)</w:t>
             </w:r>
           </w:p>
         </w:tc>
@@ -14606,28 +14606,28 @@
             </w:pPr>
             <w:r>
               <w:rPr/>
-              <w:t>Anatel (BR) · ENACOM (AR) · SUBTEL (CL)</w:t>
-            </w:r>
-          </w:p>
-        </w:tc>
-        <w:tc>
-          <w:tcPr>
-            <w:tcBorders/>
-            <w:vAlign w:val="center"/>
-          </w:tcPr>
-          <w:p>
-            <w:pPr>
-              <w:pStyle w:val="TableContents"/>
-              <w:widowControl w:val="false"/>
-              <w:suppressLineNumbers/>
-              <w:shd w:fill="F8F8F8" w:val="clear"/>
-              <w:bidi w:val="0"/>
-              <w:jc w:val="left"/>
-              <w:rPr/>
-            </w:pPr>
-            <w:r>
-              <w:rPr/>
-              <w:t>902–928 + 2.4 GHz; BR split-band</w:t>
+              <w:t>Anatel (BR), ENACOM (AR), SUBTEL (CL)</w:t>
+            </w:r>
+          </w:p>
+        </w:tc>
+        <w:tc>
+          <w:tcPr>
+            <w:tcBorders/>
+            <w:vAlign w:val="center"/>
+          </w:tcPr>
+          <w:p>
+            <w:pPr>
+              <w:pStyle w:val="TableContents"/>
+              <w:widowControl w:val="false"/>
+              <w:suppressLineNumbers/>
+              <w:shd w:fill="F8F8F8" w:val="clear"/>
+              <w:bidi w:val="0"/>
+              <w:jc w:val="left"/>
+              <w:rPr/>
+            </w:pPr>
+            <w:r>
+              <w:rPr/>
+              <w:t>902-928 + 2.4 GHz; BR split-band</w:t>
             </w:r>
           </w:p>
         </w:tc>
@@ -14714,28 +14714,28 @@
             </w:pPr>
             <w:r>
               <w:rPr/>
-              <w:t>ACMA (AU) · MCIT (PG)</w:t>
-            </w:r>
-          </w:p>
-        </w:tc>
-        <w:tc>
-          <w:tcPr>
-            <w:tcBorders/>
-            <w:vAlign w:val="center"/>
-          </w:tcPr>
-          <w:p>
-            <w:pPr>
-              <w:pStyle w:val="TableContents"/>
-              <w:widowControl w:val="false"/>
-              <w:suppressLineNumbers/>
-              <w:shd w:fill="F8F8F8" w:val="clear"/>
-              <w:bidi w:val="0"/>
-              <w:jc w:val="left"/>
-              <w:rPr/>
-            </w:pPr>
-            <w:r>
-              <w:rPr/>
-              <w:t>915–928 MHz (AU) + 2.4 GHz</w:t>
+              <w:t>ACMA (AU), MCIT (PG)</w:t>
+            </w:r>
+          </w:p>
+        </w:tc>
+        <w:tc>
+          <w:tcPr>
+            <w:tcBorders/>
+            <w:vAlign w:val="center"/>
+          </w:tcPr>
+          <w:p>
+            <w:pPr>
+              <w:pStyle w:val="TableContents"/>
+              <w:widowControl w:val="false"/>
+              <w:suppressLineNumbers/>
+              <w:shd w:fill="F8F8F8" w:val="clear"/>
+              <w:bidi w:val="0"/>
+              <w:jc w:val="left"/>
+              <w:rPr/>
+            </w:pPr>
+            <w:r>
+              <w:rPr/>
+              <w:t>915-928 MHz (AU) + 2.4 GHz</w:t>
             </w:r>
           </w:p>
         </w:tc>
@@ -14843,7 +14843,7 @@
             </w:pPr>
             <w:r>
               <w:rPr/>
-              <w:t>915–928 MHz (AU) + 2.4 GHz; Antarctica: coordination required</w:t>
+              <w:t>915-928 MHz (AU) + 2.4 GHz; Antarctica: coordination required</w:t>
             </w:r>
           </w:p>
         </w:tc>
@@ -14930,28 +14930,28 @@
             </w:pPr>
             <w:r>
               <w:rPr/>
-              <w:t>ATU West · NCC (NG) · OFCOM (GH) · ANRT (MA)</w:t>
-            </w:r>
-          </w:p>
-        </w:tc>
-        <w:tc>
-          <w:tcPr>
-            <w:tcBorders/>
-            <w:vAlign w:val="center"/>
-          </w:tcPr>
-          <w:p>
-            <w:pPr>
-              <w:pStyle w:val="TableContents"/>
-              <w:widowControl w:val="false"/>
-              <w:suppressLineNumbers/>
-              <w:shd w:fill="F8F8F8" w:val="clear"/>
-              <w:bidi w:val="0"/>
-              <w:jc w:val="left"/>
-              <w:rPr/>
-            </w:pPr>
-            <w:r>
-              <w:rPr/>
-              <w:t>433 + 2.4 GHz; north-east Brazil: 902–928 + 2.4 GHz</w:t>
+              <w:t>ATU West, NCC (NG), OFCOM (GH), ANRT (MA)</w:t>
+            </w:r>
+          </w:p>
+        </w:tc>
+        <w:tc>
+          <w:tcPr>
+            <w:tcBorders/>
+            <w:vAlign w:val="center"/>
+          </w:tcPr>
+          <w:p>
+            <w:pPr>
+              <w:pStyle w:val="TableContents"/>
+              <w:widowControl w:val="false"/>
+              <w:suppressLineNumbers/>
+              <w:shd w:fill="F8F8F8" w:val="clear"/>
+              <w:bidi w:val="0"/>
+              <w:jc w:val="left"/>
+              <w:rPr/>
+            </w:pPr>
+            <w:r>
+              <w:rPr/>
+              <w:t>433 + 2.4 GHz; north-east Brazil: 902-928 + 2.4 GHz</w:t>
             </w:r>
           </w:p>
         </w:tc>
@@ -15059,7 +15059,7 @@
             </w:pPr>
             <w:r>
               <w:rPr/>
-              <w:t>902–928 + 2.4 GHz</w:t>
+              <w:t>902-928 + 2.4 GHz</w:t>
             </w:r>
           </w:p>
         </w:tc>
@@ -15146,28 +15146,28 @@
             </w:pPr>
             <w:r>
               <w:rPr/>
-              <w:t>MIC (JP) · Roskomnadzor (RU) · FCC (US: Alaska)</w:t>
-            </w:r>
-          </w:p>
-        </w:tc>
-        <w:tc>
-          <w:tcPr>
-            <w:tcBorders/>
-            <w:vAlign w:val="center"/>
-          </w:tcPr>
-          <w:p>
-            <w:pPr>
-              <w:pStyle w:val="TableContents"/>
-              <w:widowControl w:val="false"/>
-              <w:suppressLineNumbers/>
-              <w:shd w:fill="F8F8F8" w:val="clear"/>
-              <w:bidi w:val="0"/>
-              <w:jc w:val="left"/>
-              <w:rPr/>
-            </w:pPr>
-            <w:r>
-              <w:rPr/>
-              <w:t>JP 920–928 MHz; RU 433 + 2.4 GHz; AK 902–928 + 2.4 GHz</w:t>
+              <w:t>MIC (JP), Roskomnadzor (RU), FCC (US: Alaska)</w:t>
+            </w:r>
+          </w:p>
+        </w:tc>
+        <w:tc>
+          <w:tcPr>
+            <w:tcBorders/>
+            <w:vAlign w:val="center"/>
+          </w:tcPr>
+          <w:p>
+            <w:pPr>
+              <w:pStyle w:val="TableContents"/>
+              <w:widowControl w:val="false"/>
+              <w:suppressLineNumbers/>
+              <w:shd w:fill="F8F8F8" w:val="clear"/>
+              <w:bidi w:val="0"/>
+              <w:jc w:val="left"/>
+              <w:rPr/>
+            </w:pPr>
+            <w:r>
+              <w:rPr/>
+              <w:t>JP 920-928 MHz; RU 433 + 2.4 GHz; AK 902-928 + 2.4 GHz</w:t>
             </w:r>
           </w:p>
         </w:tc>
@@ -15763,7 +15763,7 @@
       <w:bookmarkEnd w:id="434"/>
       <w:r>
         <w:rPr/>
-        <w:t>The spatial resolution of an RSDGGS index is determined entirely by its length in octets. Each octet after Octet 1 adds four subdivision levels, reducing the linear cell size by a factor of 16. Cell sizes vary across a face; the values below were measured at 39°N 98°W with the reference implementation, for a dodecahedron face area of approximately 42 million square kilometers:</w:t>
+        <w:t>The spatial resolution of an RSDGGS index is determined entirely by its length in octets. Each octet after Octet 1 adds four subdivision levels, reducing the linear cell size by a factor of 16. Cell sizes vary across a face; the values below were measured at 39N 98W with the reference implementation, for a dodecahedron face area of approximately 42 million square kilometers:</w:t>
       </w:r>
     </w:p>
     <w:p>
@@ -16728,31 +16728,31 @@
       </w:pPr>
       <w:r>
         <w:rPr/>
-        <w:t>Bits 63-60:  Octet 0 bits 7-4 — Celestial body selector [0..15]</w:t>
-      </w:r>
-    </w:p>
-    <w:p>
-      <w:pPr>
-        <w:pStyle w:val="PreformattedText"/>
-        <w:bidi w:val="0"/>
-        <w:jc w:val="left"/>
-        <w:rPr/>
-      </w:pPr>
-      <w:r>
-        <w:rPr/>
-        <w:t>Bits 59-56:  Octet 0 bits 3-0 — Face index [0..11] on selected body</w:t>
-      </w:r>
-    </w:p>
-    <w:p>
-      <w:pPr>
-        <w:pStyle w:val="PreformattedText"/>
-        <w:bidi w:val="0"/>
-        <w:jc w:val="left"/>
-        <w:rPr/>
-      </w:pPr>
-      <w:r>
-        <w:rPr/>
-        <w:t>Bits 55-52:  Octet 1 bits 7-4 — Triangle index [0..4]; 5-15 reserved</w:t>
+        <w:t>Bits 63-60:  Octet 0 bits 7-4 -- Celestial body selector [0..15]</w:t>
+      </w:r>
+    </w:p>
+    <w:p>
+      <w:pPr>
+        <w:pStyle w:val="PreformattedText"/>
+        <w:bidi w:val="0"/>
+        <w:jc w:val="left"/>
+        <w:rPr/>
+      </w:pPr>
+      <w:r>
+        <w:rPr/>
+        <w:t>Bits 59-56:  Octet 0 bits 3-0 -- Face index [0..11] on selected body</w:t>
+      </w:r>
+    </w:p>
+    <w:p>
+      <w:pPr>
+        <w:pStyle w:val="PreformattedText"/>
+        <w:bidi w:val="0"/>
+        <w:jc w:val="left"/>
+        <w:rPr/>
+      </w:pPr>
+      <w:r>
+        <w:rPr/>
+        <w:t>Bits 55-52:  Octet 1 bits 7-4 -- Triangle index [0..4]; 5-15 reserved</w:t>
       </w:r>
     </w:p>
     <w:p>
@@ -20252,10 +20252,10 @@
         </w:tblCellMar>
       </w:tblPr>
       <w:tblGrid>
-        <w:gridCol w:w="2773"/>
-        <w:gridCol w:w="988"/>
-        <w:gridCol w:w="5166"/>
-        <w:gridCol w:w="1612"/>
+        <w:gridCol w:w="2778"/>
+        <w:gridCol w:w="973"/>
+        <w:gridCol w:w="5173"/>
+        <w:gridCol w:w="1615"/>
       </w:tblGrid>
       <w:tr>
         <w:trPr>
@@ -20991,7 +20991,7 @@
             </w:pPr>
             <w:r>
               <w:rPr/>
-              <w:t>11, triangles 2–4</w:t>
+              <w:t>11, triangles 2-4</w:t>
             </w:r>
           </w:p>
         </w:tc>
@@ -21186,7 +21186,7 @@
             </w:pPr>
             <w:r>
               <w:rPr/>
-              <w:t>Region 2 inside the triangle 0 Region 1 exception; the US–Russia border passes between the Diomede Islands, 3.8 km apart</w:t>
+              <w:t>Region 2 inside the triangle 0 Region 1 exception; the US-Russia border passes between the Diomede Islands, 3.8 km apart</w:t>
             </w:r>
           </w:p>
         </w:tc>
@@ -22040,7 +22040,7 @@
             </w:pPr>
             <w:r>
               <w:rPr/>
-              <w:t>—</w:t>
+              <w:t>--</w:t>
             </w:r>
           </w:p>
         </w:tc>
@@ -22235,49 +22235,49 @@
             </w:pPr>
             <w:r>
               <w:rPr/>
-              <w:t>—</w:t>
-            </w:r>
-          </w:p>
-        </w:tc>
-        <w:tc>
-          <w:tcPr>
-            <w:tcBorders/>
-            <w:vAlign w:val="center"/>
-          </w:tcPr>
-          <w:p>
-            <w:pPr>
-              <w:pStyle w:val="TableContents"/>
-              <w:widowControl w:val="false"/>
-              <w:suppressLineNumbers/>
-              <w:shd w:fill="F8F8F8" w:val="clear"/>
-              <w:bidi w:val="0"/>
-              <w:jc w:val="left"/>
-              <w:rPr/>
-            </w:pPr>
-            <w:r>
-              <w:rPr/>
-              <w:t>—</w:t>
-            </w:r>
-          </w:p>
-        </w:tc>
-        <w:tc>
-          <w:tcPr>
-            <w:tcBorders/>
-            <w:vAlign w:val="center"/>
-          </w:tcPr>
-          <w:p>
-            <w:pPr>
-              <w:pStyle w:val="TableContents"/>
-              <w:widowControl w:val="false"/>
-              <w:suppressLineNumbers/>
-              <w:shd w:fill="F8F8F8" w:val="clear"/>
-              <w:bidi w:val="0"/>
-              <w:jc w:val="left"/>
-              <w:rPr/>
-            </w:pPr>
-            <w:r>
-              <w:rPr/>
-              <w:t>—</w:t>
+              <w:t>--</w:t>
+            </w:r>
+          </w:p>
+        </w:tc>
+        <w:tc>
+          <w:tcPr>
+            <w:tcBorders/>
+            <w:vAlign w:val="center"/>
+          </w:tcPr>
+          <w:p>
+            <w:pPr>
+              <w:pStyle w:val="TableContents"/>
+              <w:widowControl w:val="false"/>
+              <w:suppressLineNumbers/>
+              <w:shd w:fill="F8F8F8" w:val="clear"/>
+              <w:bidi w:val="0"/>
+              <w:jc w:val="left"/>
+              <w:rPr/>
+            </w:pPr>
+            <w:r>
+              <w:rPr/>
+              <w:t>--</w:t>
+            </w:r>
+          </w:p>
+        </w:tc>
+        <w:tc>
+          <w:tcPr>
+            <w:tcBorders/>
+            <w:vAlign w:val="center"/>
+          </w:tcPr>
+          <w:p>
+            <w:pPr>
+              <w:pStyle w:val="TableContents"/>
+              <w:widowControl w:val="false"/>
+              <w:suppressLineNumbers/>
+              <w:shd w:fill="F8F8F8" w:val="clear"/>
+              <w:bidi w:val="0"/>
+              <w:jc w:val="left"/>
+              <w:rPr/>
+            </w:pPr>
+            <w:r>
+              <w:rPr/>
+              <w:t>--</w:t>
             </w:r>
           </w:p>
         </w:tc>
@@ -23230,7 +23230,7 @@
             </w:pPr>
             <w:r>
               <w:rPr/>
-              <w:t>—</w:t>
+              <w:t>--</w:t>
             </w:r>
           </w:p>
         </w:tc>
@@ -25470,7 +25470,7 @@
       <w:bookmarkEnd w:id="512"/>
       <w:r>
         <w:rPr/>
-        <w:t>Below the ITU level, neighboring administrations negotiate bilateral arrangements governing specific bands along their shared borders. These agreements establish coordination zones — geographic areas on both sides of the border within which proposed assignments require prior approval from the neighboring administration. The zone extent varies by band and agreement:</w:t>
+        <w:t>Below the ITU level, neighboring administrations negotiate bilateral arrangements governing specific bands along their shared borders. These agreements establish coordination zones -- geographic areas on both sides of the border within which proposed assignments require prior approval from the neighboring administration. The zone extent varies by band and agreement:</w:t>
       </w:r>
     </w:p>
     <w:p>
@@ -25494,7 +25494,7 @@
       </w:pPr>
       <w:r>
         <w:rPr/>
-        <w:t>US-Canada (FCC / ISED, per 47 CFR § 1.928 and Arrangements A-Q):</w:t>
+        <w:t>US-Canada (FCC / ISED, per 47 CFR 1.928 and Arrangements A-Q):</w:t>
       </w:r>
     </w:p>
     <w:p>
@@ -25526,7 +25526,7 @@
       </w:r>
       <w:r>
         <w:rPr/>
-        <w:t>800 MHz band zone:  110 km (47 CFR § 90.619)</w:t>
+        <w:t>800 MHz band zone:  110 km (47 CFR 90.619)</w:t>
       </w:r>
     </w:p>
     <w:p>
@@ -25574,30 +25574,30 @@
       </w:r>
       <w:r>
         <w:rPr/>
-        <w:t>PFD limit at border: -107 dB(W/m²) for 896-940 MHz</w:t>
-      </w:r>
-    </w:p>
-    <w:p>
-      <w:pPr>
-        <w:pStyle w:val="PreformattedText"/>
-        <w:bidi w:val="0"/>
-        <w:jc w:val="left"/>
-        <w:rPr/>
-      </w:pPr>
-      <w:r>
-        <w:rPr/>
-      </w:r>
-    </w:p>
-    <w:p>
-      <w:pPr>
-        <w:pStyle w:val="PreformattedText"/>
-        <w:bidi w:val="0"/>
-        <w:jc w:val="left"/>
-        <w:rPr/>
-      </w:pPr>
-      <w:r>
-        <w:rPr/>
-        <w:t>US-Mexico (FCC / IFT, per 47 CFR § 90.619):</w:t>
+        <w:t>PFD limit at border: -107 dB(W/m^2) for 896-940 MHz</w:t>
+      </w:r>
+    </w:p>
+    <w:p>
+      <w:pPr>
+        <w:pStyle w:val="PreformattedText"/>
+        <w:bidi w:val="0"/>
+        <w:jc w:val="left"/>
+        <w:rPr/>
+      </w:pPr>
+      <w:r>
+        <w:rPr/>
+      </w:r>
+    </w:p>
+    <w:p>
+      <w:pPr>
+        <w:pStyle w:val="PreformattedText"/>
+        <w:bidi w:val="0"/>
+        <w:jc w:val="left"/>
+        <w:rPr/>
+      </w:pPr>
+      <w:r>
+        <w:rPr/>
+        <w:t>US-Mexico (FCC / IFT, per 47 CFR 90.619):</w:t>
       </w:r>
     </w:p>
     <w:p>
@@ -25645,7 +25645,7 @@
       </w:r>
       <w:r>
         <w:rPr/>
-        <w:t>PFD limit at border: -107 dB(W/m²) for 896-940 MHz</w:t>
+        <w:t>PFD limit at border: -107 dB(W/m^2) for 896-940 MHz</w:t>
       </w:r>
     </w:p>
     <w:p>
@@ -25700,7 +25700,7 @@
       </w:r>
       <w:r>
         <w:rPr/>
-        <w:t>ETSI EN 300 220 harmonized across EU — no coordination</w:t>
+        <w:t>ETSI EN 300 220 harmonized across EU -- no coordination</w:t>
       </w:r>
     </w:p>
     <w:p>
@@ -25779,7 +25779,7 @@
       <w:bookmarkEnd w:id="513"/>
       <w:r>
         <w:rPr/>
-        <w:t>The 47 CFR § 90.619 power-flux-density limit of -107 dB(W/m²) at the US/Mexico border for the 896-940 MHz band is directly applicable to ISM-adjacent operations. The 110 km coordination zone for 800 MHz band operations represents a precision requirement of approximately 3-4 bytes of RSDGGS resolution to determine border-zone membership accurately.</w:t>
+        <w:t>The 47 CFR 90.619 power-flux-density limit of -107 dB(W/m^2) at the US/Mexico border for the 896-940 MHz band is directly applicable to ISM-adjacent operations. The 110 km coordination zone for 800 MHz band operations represents a precision requirement of approximately 3-4 bytes of RSDGGS resolution to determine border-zone membership accurately.</w:t>
       </w:r>
     </w:p>
     <w:p>
@@ -25925,9 +25925,9 @@
         </w:tblCellMar>
       </w:tblPr>
       <w:tblGrid>
-        <w:gridCol w:w="2309"/>
-        <w:gridCol w:w="3523"/>
-        <w:gridCol w:w="4707"/>
+        <w:gridCol w:w="2291"/>
+        <w:gridCol w:w="3602"/>
+        <w:gridCol w:w="4646"/>
       </w:tblGrid>
       <w:tr>
         <w:trPr>
@@ -26034,7 +26034,7 @@
             </w:pPr>
             <w:r>
               <w:rPr/>
-              <w:t>Fixed limit at border line (e.g., -107 dBW/m²)</w:t>
+              <w:t>Fixed limit at border line (e.g., -107 dBW/m^2)</w:t>
             </w:r>
           </w:p>
         </w:tc>
@@ -27249,7 +27249,7 @@
       </w:r>
       <w:r>
         <w:rPr/>
-        <w:t>Input:  cell     — RSDGGS cell index at current resolution R</w:t>
+        <w:t>Input:  cell     -- RSDGGS cell index at current resolution R</w:t>
       </w:r>
     </w:p>
     <w:p>
@@ -27265,7 +27265,7 @@
       </w:r>
       <w:r>
         <w:rPr/>
-        <w:t>band     — ISM band identifier</w:t>
+        <w:t>band     -- ISM band identifier</w:t>
       </w:r>
     </w:p>
     <w:p>
@@ -27281,7 +27281,7 @@
       </w:r>
       <w:r>
         <w:rPr/>
-        <w:t>Output: steps    — number of subdivision levels to nearest</w:t>
+        <w:t>Output: steps    -- number of subdivision levels to nearest</w:t>
       </w:r>
     </w:p>
     <w:p>
@@ -28327,11 +28327,11 @@
       </w:pPr>
       <w:r>
         <w:rPr/>
-        <w:t xml:space="preserve">  → </w:t>
-      </w:r>
-      <w:r>
-        <w:rPr/>
-        <w:t>Apply DC = 1%, lbt = false</w:t>
+        <w:t xml:space="preserve">  </w:t>
+      </w:r>
+      <w:r>
+        <w:rPr/>
+        <w:t>-&gt; Apply DC = 1%, lbt = false</w:t>
       </w:r>
     </w:p>
     <w:p>
@@ -28398,11 +28398,11 @@
       </w:pPr>
       <w:r>
         <w:rPr/>
-        <w:t xml:space="preserve">  → </w:t>
-      </w:r>
-      <w:r>
-        <w:rPr/>
-        <w:t>Effectively identical, no reduction needed</w:t>
+        <w:t xml:space="preserve">  </w:t>
+      </w:r>
+      <w:r>
+        <w:rPr/>
+        <w:t>-&gt; Effectively identical, no reduction needed</w:t>
       </w:r>
     </w:p>
     <w:p>
@@ -28415,11 +28415,11 @@
       </w:pPr>
       <w:r>
         <w:rPr/>
-        <w:t xml:space="preserve">  → </w:t>
-      </w:r>
-      <w:r>
-        <w:rPr/>
-        <w:t>Exception table entry flags as RSL 5 for verification</w:t>
+        <w:t xml:space="preserve">  </w:t>
+      </w:r>
+      <w:r>
+        <w:rPr/>
+        <w:t>-&gt; Exception table entry flags as RSL 5 for verification</w:t>
       </w:r>
     </w:p>
     <w:p>
@@ -28617,7 +28617,7 @@
       </w:r>
       <w:r>
         <w:rPr/>
-        <w:t>// Boundary is within current cell — ambiguous</w:t>
+        <w:t>// Boundary is within current cell -- ambiguous</w:t>
       </w:r>
     </w:p>
     <w:p>
@@ -28724,7 +28724,7 @@
       </w:r>
       <w:r>
         <w:rPr/>
-        <w:t>// (sub-decimeter precision — effectively on the line)</w:t>
+        <w:t>// (sub-decimeter precision -- effectively on the line)</w:t>
       </w:r>
     </w:p>
     <w:p>
@@ -28799,7 +28799,7 @@
       </w:r>
       <w:r>
         <w:rPr/>
-        <w:t>5 bytes (~260 m) — adequate for bilateral zone classification</w:t>
+        <w:t>5 bytes (~260 m) -- adequate for bilateral zone classification</w:t>
       </w:r>
     </w:p>
     <w:p>
@@ -28815,7 +28815,7 @@
       </w:r>
       <w:r>
         <w:rPr/>
-        <w:t>6 bytes (~16 m)  — adequate for most land borders</w:t>
+        <w:t>6 bytes (~16 m)  -- adequate for most land borders</w:t>
       </w:r>
     </w:p>
     <w:p>
@@ -28832,7 +28832,7 @@
       </w:r>
       <w:r>
         <w:rPr/>
-        <w:t>7 bytes (~1 m)   — adequate for all practical land borders</w:t>
+        <w:t>7 bytes (~1 m)   -- adequate for all practical land borders</w:t>
       </w:r>
     </w:p>
     <w:p>
@@ -28893,7 +28893,7 @@
       <w:bookmarkEnd w:id="536"/>
       <w:r>
         <w:rPr/>
-        <w:t>The escalation is bounded: for the vast majority of IoT deployments, 3-byte resolution is sufficient for all regulatory decisions and boundary detection. Resolution escalation beyond 5 bytes is only required for devices within approximately 260 m of a land border between jurisdictions with conflicting ISM band rules — a scenario that affects only a small fraction of deployed devices.</w:t>
+        <w:t>The escalation is bounded: for the vast majority of IoT deployments, 3-byte resolution is sufficient for all regulatory decisions and boundary detection. Resolution escalation beyond 5 bytes is only required for devices within approximately 260 m of a land border between jurisdictions with conflicting ISM band rules -- a scenario that affects only a small fraction of deployed devices.</w:t>
       </w:r>
     </w:p>
     <w:p>
@@ -29249,7 +29249,7 @@
       </w:r>
       <w:r>
         <w:rPr/>
-        <w:t>pfd-limit-dbwm2: int,             ; PFD limit at boundary dB(W/m²)</w:t>
+        <w:t>pfd-limit-dbwm2: int,             ; PFD limit at boundary dB(W/m^2)</w:t>
       </w:r>
     </w:p>
     <w:p>
@@ -29444,7 +29444,7 @@
       <w:bookmarkEnd w:id="542"/>
       <w:r>
         <w:rPr/>
-        <w:t>Many IoT devices lack GPS receivers or smartphone tethering and have no independent means of determining their geographic location. In conformance with design goal G8 (Section 3), RSDGGS is designed so that a device with no external connectivity — no DHCP server, no DNS, no cloud enrollment, no smartphone tether — SHALL be capable of full regulatory self-configuration through peer interaction alone. RSDGGS defines a peer-assisted discovery mechanism enabling such Naive Devices to derive their applicable regulatory parameters from beacons transmitted by location-aware Beacon Devices in the vicinity. This mechanism is the primary regulatory bootstrap path, not a fallback: centralized provisioning systems such as DHCP servers are optional accelerators, not dependencies.</w:t>
+        <w:t>Many IoT devices lack GPS receivers or smartphone tethering and have no independent means of determining their geographic location. In conformance with design goal G8 (Section 3), RSDGGS is designed so that a device with no external connectivity -- no DHCP server, no DNS, no cloud enrollment, no smartphone tether -- SHALL be capable of full regulatory self-configuration through peer interaction alone. RSDGGS defines a peer-assisted discovery mechanism enabling such Naive Devices to derive their applicable regulatory parameters from beacons transmitted by location-aware Beacon Devices in the vicinity. This mechanism is the primary regulatory bootstrap path, not a fallback: centralized provisioning systems such as DHCP servers are optional accelerators, not dependencies.</w:t>
       </w:r>
     </w:p>
     <w:p>
@@ -30633,10 +30633,10 @@
         </w:tblCellMar>
       </w:tblPr>
       <w:tblGrid>
-        <w:gridCol w:w="2349"/>
-        <w:gridCol w:w="2764"/>
-        <w:gridCol w:w="2996"/>
-        <w:gridCol w:w="2430"/>
+        <w:gridCol w:w="2311"/>
+        <w:gridCol w:w="2798"/>
+        <w:gridCol w:w="2973"/>
+        <w:gridCol w:w="2457"/>
       </w:tblGrid>
       <w:tr>
         <w:trPr>
@@ -30742,7 +30742,7 @@
             </w:pPr>
             <w:r>
               <w:rPr/>
-              <w:t>M1 — Cell Intersection</w:t>
+              <w:t>M1 -- Cell Intersection</w:t>
             </w:r>
           </w:p>
         </w:tc>
@@ -30829,7 +30829,7 @@
             </w:pPr>
             <w:r>
               <w:rPr/>
-              <w:t>M2 — RSSI Multilateration</w:t>
+              <w:t>M2 -- RSSI Multilateration</w:t>
             </w:r>
           </w:p>
         </w:tc>
@@ -30871,7 +30871,7 @@
             </w:pPr>
             <w:r>
               <w:rPr/>
-              <w:t>10–50 m (outdoor), 20–100 m (indoor)</w:t>
+              <w:t>10-50 m (outdoor), 20-100 m (indoor)</w:t>
             </w:r>
           </w:p>
         </w:tc>
@@ -30916,7 +30916,7 @@
             </w:pPr>
             <w:r>
               <w:rPr/>
-              <w:t>M3 — UWB Ranging</w:t>
+              <w:t>M3 -- UWB Ranging</w:t>
             </w:r>
           </w:p>
         </w:tc>
@@ -30958,7 +30958,7 @@
             </w:pPr>
             <w:r>
               <w:rPr/>
-              <w:t>0.1–0.5 m (LoS), 0.3–1 m (NLoS)</w:t>
+              <w:t>0.1-0.5 m (LoS), 0.3-1 m (NLoS)</w:t>
             </w:r>
           </w:p>
         </w:tc>
@@ -31019,7 +31019,7 @@
       <w:bookmarkEnd w:id="596"/>
       <w:r>
         <w:rPr/>
-        <w:t>A device with access only to Method M1 can resolve its RSDGGS cell to the intersection of its peers' cells, typically 2–4 bytes of resolution. A device with M2 capability can typically achieve 6-byte resolution (~16 m cells) in outdoor environments. A device with M3 capability can achieve 7–8 byte resolution (~1 m to ~6 cm cells) in line-of-sight conditions.</w:t>
+        <w:t>A device with access only to Method M1 can resolve its RSDGGS cell to the intersection of its peers' cells, typically 2-4 bytes of resolution. A device with M2 capability can typically achieve 6-byte resolution (~16 m cells) in outdoor environments. A device with M3 capability can achieve 7-8 byte resolution (~1 m to ~6 cm cells) in line-of-sight conditions.</w:t>
       </w:r>
     </w:p>
     <w:p>
@@ -33147,7 +33147,7 @@
             </w:pPr>
             <w:r>
               <w:rPr/>
-              <w:t>1,000 – 7,000 km</w:t>
+              <w:t>1,000 - 7,000 km</w:t>
             </w:r>
           </w:p>
         </w:tc>
@@ -33213,7 +33213,7 @@
             </w:pPr>
             <w:r>
               <w:rPr/>
-              <w:t>65 – 1,000 km</w:t>
+              <w:t>65 - 1,000 km</w:t>
             </w:r>
           </w:p>
         </w:tc>
@@ -33279,7 +33279,7 @@
             </w:pPr>
             <w:r>
               <w:rPr/>
-              <w:t>4 – 65 km</w:t>
+              <w:t>4 - 65 km</w:t>
             </w:r>
           </w:p>
         </w:tc>
@@ -33345,7 +33345,7 @@
             </w:pPr>
             <w:r>
               <w:rPr/>
-              <w:t>260 m – 4 km</w:t>
+              <w:t>260 m - 4 km</w:t>
             </w:r>
           </w:p>
         </w:tc>
@@ -33411,7 +33411,7 @@
             </w:pPr>
             <w:r>
               <w:rPr/>
-              <w:t>16 – 260 m</w:t>
+              <w:t>16 - 260 m</w:t>
             </w:r>
           </w:p>
         </w:tc>
@@ -33477,7 +33477,7 @@
             </w:pPr>
             <w:r>
               <w:rPr/>
-              <w:t>1 – 16 m</w:t>
+              <w:t>1 - 16 m</w:t>
             </w:r>
           </w:p>
         </w:tc>
@@ -34754,7 +34754,7 @@
       <w:bookmarkEnd w:id="642"/>
       <w:r>
         <w:rPr/>
-        <w:t>For fixed devices, the EKF reduces to a static estimator. The prediction step adds no uncertainty (Q = 0) and successive measurements monotonically reduce sigma_cells until the RSDGGS resolution stabilizes at 7–8 bytes for UWB-capable deployments, or 5–6 bytes for RSSI-only deployments.</w:t>
+        <w:t>For fixed devices, the EKF reduces to a static estimator. The prediction step adds no uncertainty (Q = 0) and successive measurements monotonically reduce sigma_cells until the RSDGGS resolution stabilizes at 7-8 bytes for UWB-capable deployments, or 5-6 bytes for RSSI-only deployments.</w:t>
       </w:r>
     </w:p>
     <w:p>
@@ -35040,7 +35040,7 @@
       </w:r>
       <w:r>
         <w:rPr/>
-        <w:t>Bits [15:8]  Sub-IE ID     (8 bits) — assigned by IEEE RA</w:t>
+        <w:t>Bits [15:8]  Sub-IE ID     (8 bits) -- assigned by IEEE RA</w:t>
       </w:r>
     </w:p>
     <w:p>
@@ -35056,7 +35056,7 @@
       </w:r>
       <w:r>
         <w:rPr/>
-        <w:t>Bits [7:0]   Length         (8 bits) — payload length in octets</w:t>
+        <w:t>Bits [7:0]   Length         (8 bits) -- payload length in octets</w:t>
       </w:r>
     </w:p>
     <w:p>
@@ -35624,7 +35624,7 @@
             </w:pPr>
             <w:r>
               <w:rPr/>
-              <w:t>—</w:t>
+              <w:t>--</w:t>
             </w:r>
           </w:p>
         </w:tc>
@@ -35711,7 +35711,7 @@
             </w:pPr>
             <w:r>
               <w:rPr/>
-              <w:t>—</w:t>
+              <w:t>--</w:t>
             </w:r>
           </w:p>
         </w:tc>
@@ -36522,7 +36522,7 @@
       </w:pPr>
       <w:r>
         <w:rPr/>
-        <w:t>|         RSDGGS Cell Index — Interface Identifier (64 bits)    |</w:t>
+        <w:t>|         RSDGGS Cell Index -- Interface Identifier (64 bits)    |</w:t>
       </w:r>
     </w:p>
     <w:p>
@@ -38106,7 +38106,7 @@
       </w:hyperlink>
       <w:r>
         <w:rPr/>
-        <w:t>] and similar protocols, but operates on the RSDGGS index structure directly rather than on Euclidean or great-circle distance. The computational cost at each hop is a bitwise XOR and leading-zero count — operations available as single instructions on all target architectures including constrained microcontrollers.</w:t>
+        <w:t>] and similar protocols, but operates on the RSDGGS index structure directly rather than on Euclidean or great-circle distance. The computational cost at each hop is a bitwise XOR and leading-zero count -- operations available as single instructions on all target architectures including constrained microcontrollers.</w:t>
       </w:r>
     </w:p>
     <w:p>
@@ -38805,7 +38805,7 @@
       </w:pPr>
       <w:r>
         <w:rPr/>
-        <w:t>───────────────────  ────────────────────────  ─────────────────────────</w:t>
+        <w:t>-------------------  ------------------------  -------------------------</w:t>
       </w:r>
     </w:p>
     <w:p>
@@ -39182,7 +39182,7 @@
       </w:pPr>
       <w:r>
         <w:rPr/>
-        <w:t>───────────────────  ────────────────────────  ─────────────────────────</w:t>
+        <w:t>-------------------  ------------------------  -------------------------</w:t>
       </w:r>
     </w:p>
     <w:p>
@@ -39424,7 +39424,7 @@
       </w:hyperlink>
       <w:r>
         <w:rPr/>
-        <w:t>] (Polk, Rosen, and Peterson, 2011) defines mechanisms for conveying geographic location information within the Session Initiation Protocol (SIP). It is a Standards Track document. The primary use case is emergency services (E9-1-1, E1-1-2) and presence-based location sharing. It mandates use of the PIDF-LO (Presence Information Data Format — Location Object, RFC 4119) as the location representation format.</w:t>
+        <w:t>] (Polk, Rosen, and Peterson, 2011) defines mechanisms for conveying geographic location information within the Session Initiation Protocol (SIP). It is a Standards Track document. The primary use case is emergency services (E9-1-1, E1-1-2) and presence-based location sharing. It mandates use of the PIDF-LO (Presence Information Data Format -- Location Object, RFC 4119) as the location representation format.</w:t>
       </w:r>
     </w:p>
     <w:p>
@@ -39574,7 +39574,7 @@
       </w:pPr>
       <w:r>
         <w:rPr/>
-        <w:t>───────────────────  ────────────────────────  ─────────────────────────</w:t>
+        <w:t>-------------------  ------------------------  -------------------------</w:t>
       </w:r>
     </w:p>
     <w:p>
@@ -39966,7 +39966,7 @@
       </w:pPr>
       <w:r>
         <w:rPr/>
-        <w:t>───────────────────  ────────────────────────  ─────────────────────────</w:t>
+        <w:t>-------------------  ------------------------  -------------------------</w:t>
       </w:r>
     </w:p>
     <w:p>
@@ -40343,7 +40343,7 @@
       </w:pPr>
       <w:r>
         <w:rPr/>
-        <w:t>───────────────────  ────────────────────────  ─────────────────────────</w:t>
+        <w:t>-------------------  ------------------------  -------------------------</w:t>
       </w:r>
     </w:p>
     <w:p>
@@ -40486,7 +40486,7 @@
       <w:bookmarkEnd w:id="745"/>
       <w:r>
         <w:rPr/>
-        <w:t>RFC 9632 and RSDGGS address fundamentally different layers of the same problem. RFC 9632 maps IP address blocks — which are administratively assigned and may not correspond to the physical location of the device using them — to geographic designators, for the purpose of correcting commercial geolocation database errors. RSDGGS encodes the physical location of an IoT device directly in a binary index that travels with every message the device sends, for the purpose of regulatory compliance determination at the MAC layer.</w:t>
+        <w:t>RFC 9632 and RSDGGS address fundamentally different layers of the same problem. RFC 9632 maps IP address blocks -- which are administratively assigned and may not correspond to the physical location of the device using them -- to geographic designators, for the purpose of correcting commercial geolocation database errors. RSDGGS encodes the physical location of an IoT device directly in a binary index that travels with every message the device sends, for the purpose of regulatory compliance determination at the MAC layer.</w:t>
       </w:r>
     </w:p>
     <w:p>
@@ -40627,7 +40627,7 @@
       <w:bookmarkEnd w:id="750"/>
       <w:r>
         <w:rPr/>
-        <w:t>A geofeed file is a UTF-8 CSV text file published at a stable HTTPS URL. Each non-comment line has the form: ip_prefix, alpha2code, region, city, postal_code. The IP prefix field is required; all others are optional. The format intentionally only allows coarse-level location — political-administrative designators (ISO 3166-1 country code, ISO 3166-2 region code, city name) rather than precise coordinates. Postal code is included for backward compatibility but its use is deprecated. The file is self-published by the IP address holder and consumed by geolocation data pipeline operators on a polling schedule.</w:t>
+        <w:t>A geofeed file is a UTF-8 CSV text file published at a stable HTTPS URL. Each non-comment line has the form: ip_prefix, alpha2code, region, city, postal_code. The IP prefix field is required; all others are optional. The format intentionally only allows coarse-level location -- political-administrative designators (ISO 3166-1 country code, ISO 3166-2 region code, city name) rather than precise coordinates. Postal code is included for backward compatibility but its use is deprecated. The file is self-published by the IP address holder and consumed by geolocation data pipeline operators on a polling schedule.</w:t>
       </w:r>
     </w:p>
     <w:p>
@@ -40720,7 +40720,7 @@
       </w:pPr>
       <w:r>
         <w:rPr/>
-        <w:t>───────────────────  ────────────────────────  ─────────────────────────</w:t>
+        <w:t>-------------------  ------------------------  -------------------------</w:t>
       </w:r>
     </w:p>
     <w:p>
@@ -41085,7 +41085,7 @@
       </w:pPr>
       <w:r>
         <w:rPr/>
-        <w:t>───────────────────  ────────────────────────  ─────────────────────────</w:t>
+        <w:t>-------------------  ------------------------  -------------------------</w:t>
       </w:r>
     </w:p>
     <w:p>
@@ -41450,7 +41450,7 @@
       </w:pPr>
       <w:r>
         <w:rPr/>
-        <w:t>───────────────────  ────────────────────────  ─────────────────────────</w:t>
+        <w:t>-------------------  ------------------------  -------------------------</w:t>
       </w:r>
     </w:p>
     <w:p>
@@ -41498,7 +41498,7 @@
       </w:pPr>
       <w:r>
         <w:rPr/>
-        <w:t>Coarse-to-fine       Rule 7 (explicit)         Structural (MSB→LSB)</w:t>
+        <w:t>Coarse-to-fine       Rule 7 (explicit)         Structural (MSB-&gt;LSB)</w:t>
       </w:r>
     </w:p>
     <w:p>
@@ -41593,7 +41593,7 @@
       <w:bookmarkEnd w:id="769"/>
       <w:r>
         <w:rPr/>
-        <w:t>RFC 5491's Rule 7 — coarse location MUST precede fine location in compound PIDF-LO — is structurally expressed in RSDGGS by the bit layout itself: Byte 0 (coarsest) precedes Byte 7 (finest), and truncation from the right always yields the coarser representation. RSDGGS embodies Rule 7 as an invariant property of the encoding rather than an application-layer behavioral requirement.</w:t>
+        <w:t>RFC 5491's Rule 7 -- coarse location MUST precede fine location in compound PIDF-LO -- is structurally expressed in RSDGGS by the bit layout itself: Byte 0 (coarsest) precedes Byte 7 (finest), and truncation from the right always yields the coarser representation. RSDGGS embodies Rule 7 as an invariant property of the encoding rather than an application-layer behavioral requirement.</w:t>
       </w:r>
     </w:p>
     <w:p>
@@ -41827,7 +41827,7 @@
       </w:pPr>
       <w:r>
         <w:rPr/>
-        <w:t>───────────────────  ────────────────────────  ─────────────────────────</w:t>
+        <w:t>-------------------  ------------------------  -------------------------</w:t>
       </w:r>
     </w:p>
     <w:p>
@@ -42126,7 +42126,7 @@
       <w:bookmarkEnd w:id="783"/>
       <w:r>
         <w:rPr/>
-        <w:t>A geolocation authorization document is an XML document with MIME type application/auth-policy+xml, using the namespace urn:ietf:params:xml:ns:geolocation-policy. Documents are structured as sets of rules, each containing a condition, an action, and a transformation component. Conditions may include identity-based conditions (who is requesting) and location-based conditions (where the target is). Transformations specify how the location information should be modified before delivery — for example, reducing precision by replacing a precise geodetic coordinate with a less precise one, or replacing geodetic coordinates with a civic address.</w:t>
+        <w:t>A geolocation authorization document is an XML document with MIME type application/auth-policy+xml, using the namespace urn:ietf:params:xml:ns:geolocation-policy. Documents are structured as sets of rules, each containing a condition, an action, and a transformation component. Conditions may include identity-based conditions (who is requesting) and location-based conditions (where the target is). Transformations specify how the location information should be modified before delivery -- for example, reducing precision by replacing a precise geodetic coordinate with a less precise one, or replacing geodetic coordinates with a civic address.</w:t>
       </w:r>
     </w:p>
     <w:p>
@@ -42219,7 +42219,7 @@
       </w:pPr>
       <w:r>
         <w:rPr/>
-        <w:t>───────────────────  ────────────────────────  ─────────────────────────</w:t>
+        <w:t>-------------------  ------------------------  -------------------------</w:t>
       </w:r>
     </w:p>
     <w:p>
@@ -42362,7 +42362,7 @@
       <w:bookmarkEnd w:id="786"/>
       <w:r>
         <w:rPr/>
-        <w:t>RFC 6772's location obfuscation mechanism — reducing precision in the transformation element of a policy rule — is conceptually identical to RSDGGS truncation, but implemented through a server-side XML transformation rather than a structural property of the encoding. The RFC 6772 approach requires a Location Server to apply the transformation rule; the RSDGGS approach requires the transmitting device to select an index length. The RSDGGS approach is implementable on a 32-byte RAM microcontroller with no server dependency.</w:t>
+        <w:t>RFC 6772's location obfuscation mechanism -- reducing precision in the transformation element of a policy rule -- is conceptually identical to RSDGGS truncation, but implemented through a server-side XML transformation rather than a structural property of the encoding. The RFC 6772 approach requires a Location Server to apply the transformation rule; the RSDGGS approach requires the transmitting device to select an index length. The RSDGGS approach is implementable on a 32-byte RAM microcontroller with no server dependency.</w:t>
       </w:r>
     </w:p>
     <w:p>
@@ -42377,7 +42377,7 @@
       <w:bookmarkEnd w:id="787"/>
       <w:r>
         <w:rPr/>
-        <w:t>RFC 6772's location-based conditions — rules that apply differently depending on where the Target is — have a direct analogy in RSDGGS: the RSL (Resolution Sufficiency Level) table defines location-dependent disclosure requirements for regulatory purposes. A device in Face 2 (North America) needs to disclose only 1 byte to establish 902 MHz legality; a device in Face 3 (East Asia) needs 3 bytes to distinguish Japan from China. The RSDGGS RSL table is a regulatory-specific, infrastructure-free analog to RFC 6772's location-based policy conditions.</w:t>
+        <w:t>RFC 6772's location-based conditions -- rules that apply differently depending on where the Target is -- have a direct analogy in RSDGGS: the RSL (Resolution Sufficiency Level) table defines location-dependent disclosure requirements for regulatory purposes. A device in Face 2 (North America) needs to disclose only 1 byte to establish 902 MHz legality; a device in Face 3 (East Asia) needs 3 bytes to distinguish Japan from China. The RSDGGS RSL table is a regulatory-specific, infrastructure-free analog to RFC 6772's location-based policy conditions.</w:t>
       </w:r>
     </w:p>
     <w:p>
@@ -43302,7 +43302,7 @@
       <w:bookmarkEnd w:id="793"/>
       <w:r>
         <w:rPr/>
-        <w:t>RSDGGS does not supersede any of the five referenced specifications. Each addresses a distinct protocol layer or use case for which it remains the appropriate standard. RSDGGS fills the gap at the intersection of geographic addressing, regulatory compliance encoding, constrained IoT communication, and MAC-layer integration — a combination not addressed by any prior IETF work.</w:t>
+        <w:t>RSDGGS does not supersede any of the five referenced specifications. Each addresses a distinct protocol layer or use case for which it remains the appropriate standard. RSDGGS fills the gap at the intersection of geographic addressing, regulatory compliance encoding, constrained IoT communication, and MAC-layer integration -- a combination not addressed by any prior IETF work.</w:t>
       </w:r>
     </w:p>
     <w:p>
@@ -43374,7 +43374,7 @@
       <w:bookmarkEnd w:id="796"/>
       <w:r>
         <w:rPr/>
-        <w:t>Each patent and RFC examined in Section 16 carries its own citation list. This section identifies references within those backward citation chains that are independently relevant to RSDGGS — documents cited by the cited documents that surface additional prior art, gaps, or informative context not already addressed in the specification.</w:t>
+        <w:t>Each patent and RFC examined in Section 16 carries its own citation list. This section identifies references within those backward citation chains that are independently relevant to RSDGGS -- documents cited by the cited documents that surface additional prior art, gaps, or informative context not already addressed in the specification.</w:t>
       </w:r>
     </w:p>
     <w:p>
@@ -43411,7 +43411,7 @@
           <w:rPr>
             <w:rStyle w:val="Hyperlink"/>
           </w:rPr>
-          <w:t>GPSR — Greedy Perimeter Stateless Routing (from US 10,812,365)</w:t>
+          <w:t>GPSR -- Greedy Perimeter Stateless Routing (from US 10,812,365)</w:t>
         </w:r>
       </w:hyperlink>
       <w:r>
@@ -43483,7 +43483,7 @@
           <w:rPr>
             <w:rStyle w:val="Hyperlink"/>
           </w:rPr>
-          <w:t>IEEE 802.11d — Country Information Elements (from US 10,306,400 family)</w:t>
+          <w:t>IEEE 802.11d -- Country Information Elements (from US 10,306,400 family)</w:t>
         </w:r>
       </w:hyperlink>
       <w:r>
@@ -43555,7 +43555,7 @@
           <w:rPr>
             <w:rStyle w:val="Hyperlink"/>
           </w:rPr>
-          <w:t>IEEE 802.11h — DFS and TPC (from US 10,306,400 family)</w:t>
+          <w:t>IEEE 802.11h -- DFS and TPC (from US 10,306,400 family)</w:t>
         </w:r>
       </w:hyperlink>
       <w:r>
@@ -43627,7 +43627,7 @@
           <w:rPr>
             <w:rStyle w:val="Hyperlink"/>
           </w:rPr>
-          <w:t>RFC 3693 — GEOPRIV Requirements (from RFC 6442 and RFC 6280)</w:t>
+          <w:t>RFC 3693 -- GEOPRIV Requirements (from RFC 6442 and RFC 6280)</w:t>
         </w:r>
       </w:hyperlink>
       <w:r>
@@ -43699,7 +43699,7 @@
           <w:rPr>
             <w:rStyle w:val="Hyperlink"/>
           </w:rPr>
-          <w:t>RFC 3825 — DHCP Geodetic Location Option (from RFC 5870 and RFC 5808)</w:t>
+          <w:t>RFC 3825 -- DHCP Geodetic Location Option (from RFC 5870 and RFC 5808)</w:t>
         </w:r>
       </w:hyperlink>
       <w:r>
@@ -43749,7 +43749,7 @@
       <w:bookmarkEnd w:id="812"/>
       <w:r>
         <w:rPr/>
-        <w:t>The reason is structural: DHCP is a client-server protocol with a centralized server as a single point of failure. If the DHCPv6 server is unavailable — due to server failure, network partition, or initial bootstrap before any infrastructure is established — onboarding devices cannot acquire their regulatory configuration. This violates G8's requirement for complete independence from any centralized server. IPv6 Stateless Address Autoconfiguration (SLAAC, RFC 4862) and Neighbor Discovery (RFC 4861) demonstrate the correct architectural model: a device derives its IPv6 address from its MAC address and the subnet prefix advertised by neighboring routers, with no server dependency. RSDGGS follows the same model: a device derives its regulatory cell from the RSDGGS cells of neighboring devices (Section 11), with no server dependency.</w:t>
+        <w:t>The reason is structural: DHCP is a client-server protocol with a centralized server as a single point of failure. If the DHCPv6 server is unavailable -- due to server failure, network partition, or initial bootstrap before any infrastructure is established -- onboarding devices cannot acquire their regulatory configuration. This violates G8's requirement for complete independence from any centralized server. IPv6 Stateless Address Autoconfiguration (SLAAC, RFC 4862) and Neighbor Discovery (RFC 4861) demonstrate the correct architectural model: a device derives its IPv6 address from its MAC address and the subnet prefix advertised by neighboring routers, with no server dependency. RSDGGS follows the same model: a device derives its regulatory cell from the RSDGGS cells of neighboring devices (Section 11), with no server dependency.</w:t>
       </w:r>
     </w:p>
     <w:p>
@@ -43801,7 +43801,7 @@
           <w:rPr>
             <w:rStyle w:val="Hyperlink"/>
           </w:rPr>
-          <w:t>RFC 4632 — CIDR: Classless Inter-Domain Routing (from RFC 9632)</w:t>
+          <w:t>RFC 4632 -- CIDR: Classless Inter-Domain Routing (from RFC 9632)</w:t>
         </w:r>
       </w:hyperlink>
       <w:r>
@@ -43836,7 +43836,7 @@
       <w:bookmarkEnd w:id="816"/>
       <w:r>
         <w:rPr/>
-        <w:t>Relevance to RSDGGS: CIDR defines prefix-based aggregation of IPv4 address space into routing hierarchies, where a /16 prefix aggregates 65,536 /32 host addresses into a single routing entry. RSDGGS-IPv6 geographic addressing (Section 15) implements the same concept with geographic cells: a /72 RSDGGS-IPv6 prefix aggregates all devices in a single dodecahedron face (ITU Region) into a single routing entry; a /88 prefix aggregates all devices in a country-scale cell. The mathematical relationship is direct — RSDGGS-IPv6 is CIDR for geography rather than administrative address allocation. RFC 4632 should be cited as an informative reference in Section 15.2 to establish this conceptual lineage.</w:t>
+        <w:t>Relevance to RSDGGS: CIDR defines prefix-based aggregation of IPv4 address space into routing hierarchies, where a /16 prefix aggregates 65,536 /32 host addresses into a single routing entry. RSDGGS-IPv6 geographic addressing (Section 15) implements the same concept with geographic cells: a /72 RSDGGS-IPv6 prefix aggregates all devices in a single dodecahedron face (ITU Region) into a single routing entry; a /88 prefix aggregates all devices in a country-scale cell. The mathematical relationship is direct -- RSDGGS-IPv6 is CIDR for geography rather than administrative address allocation. RFC 4632 should be cited as an informative reference in Section 15.2 to establish this conceptual lineage.</w:t>
       </w:r>
     </w:p>
     <w:p>
@@ -43873,7 +43873,7 @@
           <w:rPr>
             <w:rStyle w:val="Hyperlink"/>
           </w:rPr>
-          <w:t>RFC 6269 — Issues with IP Address Sharing (from RFC 9632)</w:t>
+          <w:t>RFC 6269 -- Issues with IP Address Sharing (from RFC 9632)</w:t>
         </w:r>
       </w:hyperlink>
       <w:r>
@@ -43908,7 +43908,7 @@
       <w:bookmarkEnd w:id="819"/>
       <w:r>
         <w:rPr/>
-        <w:t>Relevance to RSDGGS: RFC 6269 documents the problem that commercial IP geolocation databases are unreliable when IP addresses are shared (NAT, CGN, mobile carrier address pools) because a shared address maps to many physical locations. RFC 9632 geofeed was designed as a partial solution — operators can publish authoritative location for their IP prefix. RSDGGS-IPv6 geographic addressing solves this problem categorically for devices using RSDGGS addresses: the lower 64 bits of the IPv6 address encode the device's geographic cell, making location-by-address exact by construction rather than inferred. This should be noted in Section 15 as one of the concrete advantages of RSDGGS-IPv6 over commercial geolocation.</w:t>
+        <w:t>Relevance to RSDGGS: RFC 6269 documents the problem that commercial IP geolocation databases are unreliable when IP addresses are shared (NAT, CGN, mobile carrier address pools) because a shared address maps to many physical locations. RFC 9632 geofeed was designed as a partial solution -- operators can publish authoritative location for their IP prefix. RSDGGS-IPv6 geographic addressing solves this problem categorically for devices using RSDGGS addresses: the lower 64 bits of the IPv6 address encode the device's geographic cell, making location-by-address exact by construction rather than inferred. This should be noted in Section 15 as one of the concrete advantages of RSDGGS-IPv6 over commercial geolocation.</w:t>
       </w:r>
     </w:p>
     <w:p>
@@ -43945,7 +43945,7 @@
           <w:rPr>
             <w:rStyle w:val="Hyperlink"/>
           </w:rPr>
-          <w:t>GeoCast — Geographic Addressing and Routing (from RFC 2009)</w:t>
+          <w:t>GeoCast -- Geographic Addressing and Routing (from RFC 2009)</w:t>
         </w:r>
       </w:hyperlink>
       <w:r>
@@ -43980,7 +43980,7 @@
       <w:bookmarkEnd w:id="822"/>
       <w:r>
         <w:rPr/>
-        <w:t>Relevance to RSDGGS: GeoCast defines geographic multicast: delivering a packet to all nodes currently within a specified geographic polygon. RSDGGS-IPv6 prefix aggregation enables a direct implementation of GeoCast: a packet addressed to a /72 RSDGGS-IPv6 prefix is a GeoCast to all devices in a single ITU Region; a packet addressed to a /88 prefix is a GeoCast to a country-scale cell. This is lossless GeoCast — the cell boundary is exact, not approximated by a polygon. GeoCast should be cited as an informative reference in Section 15 as an ancestor of RSDGGS geographic multicast capability.</w:t>
+        <w:t>Relevance to RSDGGS: GeoCast defines geographic multicast: delivering a packet to all nodes currently within a specified geographic polygon. RSDGGS-IPv6 prefix aggregation enables a direct implementation of GeoCast: a packet addressed to a /72 RSDGGS-IPv6 prefix is a GeoCast to all devices in a single ITU Region; a packet addressed to a /88 prefix is a GeoCast to a country-scale cell. This is lossless GeoCast -- the cell boundary is exact, not approximated by a polygon. GeoCast should be cited as an informative reference in Section 15 as an ancestor of RSDGGS geographic multicast capability.</w:t>
       </w:r>
     </w:p>
     <w:p>
@@ -45215,7 +45215,7 @@
           <w:rPr>
             <w:rStyle w:val="Hyperlink"/>
           </w:rPr>
-          <w:t>Expired Patents — Public Domain Prior Art</w:t>
+          <w:t>Expired Patents -- Public Domain Prior Art</w:t>
         </w:r>
       </w:hyperlink>
       <w:r>
@@ -45272,7 +45272,7 @@
           <w:rPr>
             <w:rStyle w:val="Hyperlink"/>
           </w:rPr>
-          <w:t>US Patent 4,939,726 — Metricom, Inc. (Expired 2007)</w:t>
+          <w:t>US Patent 4,939,726 -- Metricom, Inc. (Expired 2007)</w:t>
         </w:r>
       </w:hyperlink>
       <w:r>
@@ -45292,7 +45292,7 @@
       <w:bookmarkEnd w:id="833"/>
       <w:r>
         <w:rPr/>
-        <w:t>Title: Method for Routing Packets in a Packet Communication Network. Inventors: Flammer, Kalkwarf. Assignee: Metricom, Inc. (later Proxim Wireless Corp.). Filed 1989, granted July 3, 1990, expired 2007. Companion patent US 5,115,433 (Baran, Flammer, Kalkwarf — Metricom, 1992) is also expired.</w:t>
+        <w:t>Title: Method for Routing Packets in a Packet Communication Network. Inventors: Flammer, Kalkwarf. Assignee: Metricom, Inc. (later Proxim Wireless Corp.). Filed 1989, granted July 3, 1990, expired 2007. Companion patent US 5,115,433 (Baran, Flammer, Kalkwarf -- Metricom, 1992) is also expired.</w:t>
       </w:r>
     </w:p>
     <w:p>
@@ -45500,7 +45500,7 @@
       </w:r>
       <w:r>
         <w:rPr/>
-        <w:t>data priority — richer than Claim 3 of 4,939,726</w:t>
+        <w:t>data priority -- richer than Claim 3 of 4,939,726</w:t>
       </w:r>
     </w:p>
     <w:p>
@@ -45546,7 +45546,7 @@
       <w:bookmarkEnd w:id="834"/>
       <w:r>
         <w:rPr/>
-        <w:t>RSDGGS improvement opportunity — Link Quality Weighted Forwarding: US 4,939,726 Claim 3 and US 5,115,433 define a link quality (LQ) factor incorporating distance, power, retry history, throughput, and delay. RSDGGS Section 15.3 defines geographic greedy forwarding using only common-prefix-length as the progress metric. Incorporating a link quality weighting that prefers the LQ-best neighbor among those making geographic progress would improve real-world routing performance in dense ISM-band deployments where RSSI and retry rates vary significantly. This enhancement is freely implementable from the expired public domain claims and should be noted as a normative extension candidate for follow-on standards-track work.</w:t>
+        <w:t>RSDGGS improvement opportunity -- Link Quality Weighted Forwarding: US 4,939,726 Claim 3 and US 5,115,433 define a link quality (LQ) factor incorporating distance, power, retry history, throughput, and delay. RSDGGS Section 15.3 defines geographic greedy forwarding using only common-prefix-length as the progress metric. Incorporating a link quality weighting that prefers the LQ-best neighbor among those making geographic progress would improve real-world routing performance in dense ISM-band deployments where RSSI and retry rates vary significantly. This enhancement is freely implementable from the expired public domain claims and should be noted as a normative extension candidate for follow-on standards-track work.</w:t>
       </w:r>
     </w:p>
     <w:p>
@@ -45583,7 +45583,7 @@
           <w:rPr>
             <w:rStyle w:val="Hyperlink"/>
           </w:rPr>
-          <w:t>US Patent 6,982,966 — Status Unconfirmed</w:t>
+          <w:t>US Patent 6,982,966 -- Status Unconfirmed</w:t>
         </w:r>
       </w:hyperlink>
       <w:r>
@@ -45640,7 +45640,7 @@
           <w:rPr>
             <w:rStyle w:val="Hyperlink"/>
           </w:rPr>
-          <w:t>Active Patents — Detailed Analysis</w:t>
+          <w:t>Active Patents -- Detailed Analysis</w:t>
         </w:r>
       </w:hyperlink>
       <w:r>
@@ -45682,7 +45682,7 @@
           <w:rPr>
             <w:rStyle w:val="Hyperlink"/>
           </w:rPr>
-          <w:t>US Patent 10,306,400 / Application 2014/0162692 — Wirelesss Regulatory Compliance (Active until ~2035)</w:t>
+          <w:t>US Patent 10,306,400 / Application 2014/0162692 -- Wireless Regulatory Compliance (Active until ~2035)</w:t>
         </w:r>
       </w:hyperlink>
       <w:r>
@@ -45971,7 +45971,7 @@
       <w:bookmarkEnd w:id="841"/>
       <w:r>
         <w:rPr/>
-        <w:t>RSDGGS improvement opportunity — Lookup Table Architecture: US 9,654,965 explicitly discloses the architecture of a location-to-regulations lookup table stored locally on the device, optionally small enough to fit in embedded memory, potentially updated from network. This is directly analogous to the RSDGGS regulatory database architecture defined in Section 8. The patent discloses this as a WLAN channel compliance mechanism; RSDGGS generalizes it to ISM bands with a hierarchical geographic index as the lookup key. Because 9,654,965 is active, RSDGGS implementations MUST NOT incorporate AC power line frequency as a location verification step alongside the lookup table. The lookup table architecture itself predates 9,654,965 as prior art (RFC 2009 describes location-to-routing-table mapping from 1996), but the specific combination of local storage + network update + GNSS/MCC/AP location sources for the lookup key is a design pattern that RSDGGS implementations should credit to this work in any patent prosecution.</w:t>
+        <w:t>RSDGGS improvement opportunity -- Lookup Table Architecture: US 9,654,965 explicitly discloses the architecture of a location-to-regulations lookup table stored locally on the device, optionally small enough to fit in embedded memory, potentially updated from network. This is directly analogous to the RSDGGS regulatory database architecture defined in Section 8. The patent discloses this as a WLAN channel compliance mechanism; RSDGGS generalizes it to ISM bands with a hierarchical geographic index as the lookup key. Because 9,654,965 is active, RSDGGS implementations MUST NOT incorporate AC power line frequency as a location verification step alongside the lookup table. The lookup table architecture itself predates 9,654,965 as prior art (RFC 2009 describes location-to-routing-table mapping from 1996), but the specific combination of local storage + network update + GNSS/MCC/AP location sources for the lookup key is a design pattern that RSDGGS implementations should credit to this work in any patent prosecution.</w:t>
       </w:r>
     </w:p>
     <w:p>
@@ -46008,7 +46008,7 @@
           <w:rPr>
             <w:rStyle w:val="Hyperlink"/>
           </w:rPr>
-          <w:t>US Patent 10,812,365 — Geohyperbolic Routing (Northeastern University, Active until 2037)</w:t>
+          <w:t>US Patent 10,812,365 -- Geohyperbolic Routing (Northeastern University, Active until 2037)</w:t>
         </w:r>
       </w:hyperlink>
       <w:r>
@@ -46219,7 +46219,7 @@
       </w:r>
       <w:r>
         <w:rPr/>
-        <w:t>No hyperbolic space — RSDGGS uses integer cell index</w:t>
+        <w:t>No hyperbolic space -- RSDGGS uses integer cell index</w:t>
       </w:r>
     </w:p>
     <w:p>
@@ -46235,7 +46235,7 @@
       </w:r>
       <w:r>
         <w:rPr/>
-        <w:t>No radial centrality component — no population density</w:t>
+        <w:t>No radial centrality component -- no population density</w:t>
       </w:r>
     </w:p>
     <w:p>
@@ -46362,7 +46362,7 @@
       <w:bookmarkEnd w:id="844"/>
       <w:r>
         <w:rPr/>
-        <w:t>RSDGGS improvement opportunity — None applicable: The geohyperbolic model is specifically optimized for large-scale Internet backbone topology reproduction, using population-density centrality to reproduce power-law degree distributions. RSDGGS targets constrained 802.15.4 IoT mesh networks with no backbone topology requirements and no population-density data available at compile time on embedded devices. The mathematical approaches are incompatible at a fundamental level: hyperbolic geometry requires floating-point (r, theta, phi) arithmetic, whereas RSDGGS's design goal G4 requires no-FPU integer arithmetic. No improvement opportunity from this patent is applicable to RSDGGS.</w:t>
+        <w:t>RSDGGS improvement opportunity -- None applicable: The geohyperbolic model is specifically optimized for large-scale Internet backbone topology reproduction, using population-density centrality to reproduce power-law degree distributions. RSDGGS targets constrained 802.15.4 IoT mesh networks with no backbone topology requirements and no population-density data available at compile time on embedded devices. The mathematical approaches are incompatible at a fundamental level: hyperbolic geometry requires floating-point (r, theta, phi) arithmetic, whereas RSDGGS's design goal G4 requires no-FPU integer arithmetic. No improvement opportunity from this patent is applicable to RSDGGS.</w:t>
       </w:r>
     </w:p>
     <w:p>
@@ -46414,7 +46414,7 @@
           <w:rPr>
             <w:rStyle w:val="Hyperlink"/>
           </w:rPr>
-          <w:t>US Patent 11,652,742 — Ghost Routing (Microsoft, Active until 2041)</w:t>
+          <w:t>US Patent 11,652,742 -- Ghost Routing (Microsoft, Active until 2041)</w:t>
         </w:r>
       </w:hyperlink>
       <w:r>
@@ -46720,7 +46720,7 @@
       <w:bookmarkEnd w:id="848"/>
       <w:r>
         <w:rPr/>
-        <w:t>RSDGGS improvement opportunity — None: Ghost routing addresses verification of network configuration changes in cloud datacenter switching infrastructure. It has no technical concepts, no claim elements, and no CPC classifications that overlap with RSDGGS. The name superficially resembles geographic routing but the technical subject matter is entirely unrelated. No improvement opportunity exists.</w:t>
+        <w:t>RSDGGS improvement opportunity -- None: Ghost routing addresses verification of network configuration changes in cloud datacenter switching infrastructure. It has no technical concepts, no claim elements, and no CPC classifications that overlap with RSDGGS. The name superficially resembles geographic routing but the technical subject matter is entirely unrelated. No improvement opportunity exists.</w:t>
       </w:r>
     </w:p>
     <w:p>
@@ -46757,7 +46757,7 @@
           <w:rPr>
             <w:rStyle w:val="Hyperlink"/>
           </w:rPr>
-          <w:t>CN101923801B — Method for Generating a Regular Dodecahedron Map Projection (Expired)</w:t>
+          <w:t>CN101923801B -- Method for Generating a Regular Dodecahedron Map Projection (Expired)</w:t>
         </w:r>
       </w:hyperlink>
       <w:r>
@@ -46777,7 +46777,7 @@
       <w:bookmarkEnd w:id="850"/>
       <w:r>
         <w:rPr/>
-        <w:t>Assignee: Wuhan University (WHU), Wuhan, China. Inventors: Hu Peng, Li Yunxiang, Zhu Fuli. Application number: CN2009100626550A. Filing and priority date: 10 June 2009. Grant date: 29 February 2012. Jurisdiction: China only (no PCT application, no US, EP, or other national-phase equivalents identified). Legal status: Expired — Fee Related. Anticipated statutory expiration: 10 June 2029 (20-year term from filing). Actual status: lapsed prior to statutory expiration due to non-payment of annual maintenance fees.</w:t>
+        <w:t>Assignee: Wuhan University (WHU), Wuhan, China. Inventors: Hu Peng, Li Yunxiang, Zhu Fuli. Application number: CN2009100626550A. Filing and priority date: 10 June 2009. Grant date: 29 February 2012. Jurisdiction: China only (no PCT application, no US, EP, or other national-phase equivalents identified). Legal status: Expired -- Fee Related. Anticipated statutory expiration: 10 June 2029 (20-year term from filing). Actual status: lapsed prior to statutory expiration due to non-payment of annual maintenance fees.</w:t>
       </w:r>
     </w:p>
     <w:p>
@@ -46817,7 +46817,7 @@
       </w:r>
       <w:r>
         <w:rPr/>
-        <w:t>'Expired — Fee Related' = patent lapsed due to non-payment of</w:t>
+        <w:t>'Expired -- Fee Related' = patent lapsed due to non-payment of</w:t>
       </w:r>
     </w:p>
     <w:p>
@@ -47333,7 +47333,7 @@
       </w:pPr>
       <w:r>
         <w:rPr/>
-        <w:t>RSDGGS distinguishing elements — no claim reads on RSDGGS:</w:t>
+        <w:t>RSDGGS distinguishing elements -- no claim reads on RSDGGS:</w:t>
       </w:r>
     </w:p>
     <w:p>
@@ -47349,7 +47349,7 @@
       </w:r>
       <w:r>
         <w:rPr/>
-        <w:t>D1: Orientation — RSDGGS orients Face 2 at 39°N, 98°W</w:t>
+        <w:t>D1: Orientation -- RSDGGS orients Face 2 at 39N, 98W</w:t>
       </w:r>
     </w:p>
     <w:p>
@@ -47381,7 +47381,7 @@
       </w:r>
       <w:r>
         <w:rPr/>
-        <w:t>D2: Face assignment — RSDGGS faces are fixed to ITU Radio</w:t>
+        <w:t>D2: Face assignment -- RSDGGS faces are fixed to ITU Radio</w:t>
       </w:r>
     </w:p>
     <w:p>
@@ -47429,7 +47429,7 @@
       </w:r>
       <w:r>
         <w:rPr/>
-        <w:t>D3: Output — RSDGGS produces a 1-8 byte integer cell index;</w:t>
+        <w:t>D3: Output -- RSDGGS produces a 1-8 byte integer cell index;</w:t>
       </w:r>
     </w:p>
     <w:p>
@@ -47461,7 +47461,7 @@
       </w:r>
       <w:r>
         <w:rPr/>
-        <w:t>D4: Pipeline — RSDGGS uses no ArcGIS, ArcMap, or ESRI</w:t>
+        <w:t>D4: Pipeline -- RSDGGS uses no ArcGIS, ArcMap, or ESRI</w:t>
       </w:r>
     </w:p>
     <w:p>
@@ -47493,7 +47493,7 @@
       </w:r>
       <w:r>
         <w:rPr/>
-        <w:t>D5: Purpose — RSDGGS encodes regulatory jurisdiction for</w:t>
+        <w:t>D5: Purpose -- RSDGGS encodes regulatory jurisdiction for</w:t>
       </w:r>
     </w:p>
     <w:p>
@@ -47525,7 +47525,7 @@
       </w:r>
       <w:r>
         <w:rPr/>
-        <w:t>D6: Physical artifact — RSDGGS specifies no physical object;</w:t>
+        <w:t>D6: Physical artifact -- RSDGGS specifies no physical object;</w:t>
       </w:r>
     </w:p>
     <w:p>
@@ -47588,7 +47588,7 @@
       <w:bookmarkEnd w:id="852"/>
       <w:r>
         <w:rPr/>
-        <w:t>Freedom to operate conclusion: CN101923801B presents no freedom-to-operate concern for RSDGGS on three independent grounds, each sufficient alone. First, the patent is expired due to fee non-payment and its claims are in the public domain — no enforcement is possible regardless of claim scope. Second, the patent is China-jurisdiction only with no international equivalents, so even if active it could not be enforced in the United States, European Union, Japan, or any other IETF-process jurisdiction. Third, no claim element of CN101923801B reads on RSDGGS: the patent covers a cartographic rendering pipeline for producing visual map products from geographic vector data using ArcGIS tooling, whereas RSDGGS is a binary integer encoding scheme for IoT device regulatory context with no map output, no GIS pipeline, and no physical artifact. The shared concept of using a dodecahedron as an Earth reference surface is established prior art predating CN101923801B by decades, with the gnomonic polyhedral map projection appearing in academic cartography literature since at least the 1940s (Fuller, 1944, US Patent 2,393,676, expired 1963) and in peer-reviewed cartographic literature through the 1990s.</w:t>
+        <w:t>Freedom to operate conclusion: CN101923801B presents no freedom-to-operate concern for RSDGGS on three independent grounds, each sufficient alone. First, the patent is expired due to fee non-payment and its claims are in the public domain -- no enforcement is possible regardless of claim scope. Second, the patent is China-jurisdiction only with no international equivalents, so even if active it could not be enforced in the United States, European Union, Japan, or any other IETF-process jurisdiction. Third, no claim element of CN101923801B reads on RSDGGS: the patent covers a cartographic rendering pipeline for producing visual map products from geographic vector data using ArcGIS tooling, whereas RSDGGS is a binary integer encoding scheme for IoT device regulatory context with no map output, no GIS pipeline, and no physical artifact. The shared concept of using a dodecahedron as an Earth reference surface is established prior art predating CN101923801B by decades, with the gnomonic polyhedral map projection appearing in academic cartography literature since at least the 1940s (Fuller, 1944, US Patent 2,393,676, expired 1963) and in peer-reviewed cartographic literature through the 1990s.</w:t>
       </w:r>
     </w:p>
     <w:p>
@@ -47603,7 +47603,7 @@
       <w:bookmarkEnd w:id="853"/>
       <w:r>
         <w:rPr/>
-        <w:t>Prior art note: CN101923801B itself acknowledges that dodecahedron map projection is a known concept by framing its contribution as 'breaking through the limitation that the previous projection surface is a plane and a developable surface.' The gnomonic projection of the Earth onto a regular dodecahedron is explicitly not novel to CN101923801B — the claimed novelty is the specific ArcGIS-based rendering workflow and the face-by-face data extraction pipeline. RSDGGS's use of the dodecahedron as a hierarchical geographic index is therefore independently supported by prior art that predates CN101923801B, in addition to the non-infringement analysis above.</w:t>
+        <w:t>Prior art note: CN101923801B itself acknowledges that dodecahedron map projection is a known concept by framing its contribution as 'breaking through the limitation that the previous projection surface is a plane and a developable surface.' The gnomonic projection of the Earth onto a regular dodecahedron is explicitly not novel to CN101923801B -- the claimed novelty is the specific ArcGIS-based rendering workflow and the face-by-face data extraction pipeline. RSDGGS's use of the dodecahedron as a hierarchical geographic index is therefore independently supported by prior art that predates CN101923801B, in addition to the non-infringement analysis above.</w:t>
       </w:r>
     </w:p>
     <w:p>
@@ -47697,7 +47697,7 @@
           <w:rPr>
             <w:rStyle w:val="Hyperlink"/>
           </w:rPr>
-          <w:t>RFC 2009 — GPS-Based Addressing (1996, Experimental/Legacy)</w:t>
+          <w:t>RFC 2009 -- GPS-Based Addressing (1996, Experimental/Legacy)</w:t>
         </w:r>
       </w:hyperlink>
       <w:r>
@@ -47717,7 +47717,7 @@
       <w:bookmarkEnd w:id="857"/>
       <w:r>
         <w:rPr/>
-        <w:t>Improvement opportunity — Weak beacon concept: RFC 2009 Section 5.2 defines 'weak radio beacons' that broadcast a GPS address enabling indoor devices without GPS to adopt the beacon's address. This is structurally identical to RSDGGS Section 11's peer-assisted location discovery, but RFC 2009's approach is address adoption (the Naive Device copies the beacon's address) rather than address derivation (RSDGGS derives its own cell from the beacon's cell via intersection and ranging). RSDGGS should explicitly note this distinction: RFC 2009's approach loses geographic uniqueness for devices sharing an adopted address, whereas RSDGGS's intersection-and-ranging approach preserves geographic uniqueness. This distinction strengthens the novelty claim of Section 11.</w:t>
+        <w:t>Improvement opportunity -- Weak beacon concept: RFC 2009 Section 5.2 defines 'weak radio beacons' that broadcast a GPS address enabling indoor devices without GPS to adopt the beacon's address. This is structurally identical to RSDGGS Section 11's peer-assisted location discovery, but RFC 2009's approach is address adoption (the Naive Device copies the beacon's address) rather than address derivation (RSDGGS derives its own cell from the beacon's cell via intersection and ranging). RSDGGS should explicitly note this distinction: RFC 2009's approach loses geographic uniqueness for devices sharing an adopted address, whereas RSDGGS's intersection-and-ranging approach preserves geographic uniqueness. This distinction strengthens the novelty claim of Section 11.</w:t>
       </w:r>
     </w:p>
     <w:p>
@@ -47732,7 +47732,7 @@
       <w:bookmarkEnd w:id="858"/>
       <w:r>
         <w:rPr/>
-        <w:t>Improvement opportunity — IGPSMP protocol gap: RFC 2009 proposes IGPSMP (Internet GPS Management Protocol) for router-to-router geographic service area exchange, with a polygon boundary representation. RSDGGS explicitly avoids polygon boundaries in favor of cell prefix hierarchy. Noting that RSDGGS's approach eliminates IGPSMP entirely (routing decisions from address arithmetic, no management protocol needed) more precisely characterizes RSDGGS's architectural simplification relative to RFC 2009.</w:t>
+        <w:t>Improvement opportunity -- IGPSMP protocol gap: RFC 2009 proposes IGPSMP (Internet GPS Management Protocol) for router-to-router geographic service area exchange, with a polygon boundary representation. RSDGGS explicitly avoids polygon boundaries in favor of cell prefix hierarchy. Noting that RSDGGS's approach eliminates IGPSMP entirely (routing decisions from address arithmetic, no management protocol needed) more precisely characterizes RSDGGS's architectural simplification relative to RFC 2009.</w:t>
       </w:r>
     </w:p>
     <w:p>
@@ -47769,7 +47769,7 @@
           <w:rPr>
             <w:rStyle w:val="Hyperlink"/>
           </w:rPr>
-          <w:t>RFC 5870 — geo URI Scheme (2010, Standards Track)</w:t>
+          <w:t>RFC 5870 -- geo URI Scheme (2010, Standards Track)</w:t>
         </w:r>
       </w:hyperlink>
       <w:r>
@@ -47789,7 +47789,7 @@
       <w:bookmarkEnd w:id="860"/>
       <w:r>
         <w:rPr/>
-        <w:t>Improvement opportunity — Uncertainty parameter alignment: RFC 5870 Section 3.4 defines the u= parameter as the uncertainty radius in meters, explicitly stating that it represents the uncertainty of the location rather than a desired precision. RSDGGS's truncation model produces cells with a defined radius (cell diameter / 2), which is conceptually equivalent to u= but is structural rather than declared. The RSDGGS-to-geo-URI translation proposed in Section 16.2 should map cell radius to u=, but must note that RFC 5870 explicitly states u= MUST NOT be interpreted as a request for a certain level of precision from a location server. The cell radius is a guaranteed precision bound, not a request — a stronger property than RFC 5870's u= semantics.</w:t>
+        <w:t>Improvement opportunity -- Uncertainty parameter alignment: RFC 5870 Section 3.4 defines the u= parameter as the uncertainty radius in meters, explicitly stating that it represents the uncertainty of the location rather than a desired precision. RSDGGS's truncation model produces cells with a defined radius (cell diameter / 2), which is conceptually equivalent to u= but is structural rather than declared. The RSDGGS-to-geo-URI translation proposed in Section 16.2 should map cell radius to u=, but must note that RFC 5870 explicitly states u= MUST NOT be interpreted as a request for a certain level of precision from a location server. The cell radius is a guaranteed precision bound, not a request -- a stronger property than RFC 5870's u= semantics.</w:t>
       </w:r>
     </w:p>
     <w:p>
@@ -47804,7 +47804,7 @@
       <w:bookmarkEnd w:id="861"/>
       <w:r>
         <w:rPr/>
-        <w:t>Improvement opportunity — CRS extensibility: RFC 5870 Section 3.5 defines a crs= parameter for alternative coordinate reference systems (default WGS-84). A future RSDGGS-aware geo URI extension could define crs=rsdggs as a CRS identifier, with the URI carrying the RSDGGS cell hex string as the coordinate value. This would enable geo URI interoperability for RSDGGS cell references in web and messaging contexts without loss of the RSDGGS hierarchical structure. This is a concrete future work item for Section 21 of the draft.</w:t>
+        <w:t>Improvement opportunity -- CRS extensibility: RFC 5870 Section 3.5 defines a crs= parameter for alternative coordinate reference systems (default WGS-84). A future RSDGGS-aware geo URI extension could define crs=rsdggs as a CRS identifier, with the URI carrying the RSDGGS cell hex string as the coordinate value. This would enable geo URI interoperability for RSDGGS cell references in web and messaging contexts without loss of the RSDGGS hierarchical structure. This is a concrete future work item for Section 21 of the draft.</w:t>
       </w:r>
     </w:p>
     <w:p>
@@ -47841,7 +47841,7 @@
           <w:rPr>
             <w:rStyle w:val="Hyperlink"/>
           </w:rPr>
-          <w:t>RFC 6442 — Location Conveyance for SIP (2011, Standards Track)</w:t>
+          <w:t>RFC 6442 -- Location Conveyance for SIP (2011, Standards Track)</w:t>
         </w:r>
       </w:hyperlink>
       <w:r>
@@ -47861,7 +47861,7 @@
       <w:bookmarkEnd w:id="863"/>
       <w:r>
         <w:rPr/>
-        <w:t>Improvement opportunity — 424 error code applicability: RFC 6442 Section 6 defines the 424 (Bad Location Information) SIP response code for cases where location cannot be processed. For RSDGGS-SIP integration (a gateway translating RSDGGS cells to PIDF-LO for emergency services), this error code should be returned when the RSDGGS cell's resolution is insufficient for the requested service (e.g., a 1-byte cell when the SIP application requires country-level precision). Defining an RSDGGS-specific error sub-code for 'insufficient cell resolution' would improve SIP gateway interoperability.</w:t>
+        <w:t>Improvement opportunity -- 424 error code applicability: RFC 6442 Section 6 defines the 424 (Bad Location Information) SIP response code for cases where location cannot be processed. For RSDGGS-SIP integration (a gateway translating RSDGGS cells to PIDF-LO for emergency services), this error code should be returned when the RSDGGS cell's resolution is insufficient for the requested service (e.g., a 1-byte cell when the SIP application requires country-level precision). Defining an RSDGGS-specific error sub-code for 'insufficient cell resolution' would improve SIP gateway interoperability.</w:t>
       </w:r>
     </w:p>
     <w:p>
@@ -47876,7 +47876,7 @@
       <w:bookmarkEnd w:id="864"/>
       <w:r>
         <w:rPr/>
-        <w:t>Improvement opportunity — Geolocation-Routing header: RFC 6442 Section 8 defines a Geolocation-Routing SIP header that can be set to 'yes' to indicate that the location should influence routing. RSDGGS geographic IPv6 addresses (Section 15) embed routing information in the address itself, making the Geolocation-Routing header redundant for RSDGGS-addressed traffic. Explicitly noting this in the draft strengthens the architectural case for RSDGGS-IPv6 as a simplification over SIP-based geographic routing.</w:t>
+        <w:t>Improvement opportunity -- Geolocation-Routing header: RFC 6442 Section 8 defines a Geolocation-Routing SIP header that can be set to 'yes' to indicate that the location should influence routing. RSDGGS geographic IPv6 addresses (Section 15) embed routing information in the address itself, making the Geolocation-Routing header redundant for RSDGGS-addressed traffic. Explicitly noting this in the draft strengthens the architectural case for RSDGGS-IPv6 as a simplification over SIP-based geographic routing.</w:t>
       </w:r>
     </w:p>
     <w:p>
@@ -47913,7 +47913,7 @@
           <w:rPr>
             <w:rStyle w:val="Hyperlink"/>
           </w:rPr>
-          <w:t>RFC 9179 — YANG Grouping for Geographic Locations (2022, Standards Track)</w:t>
+          <w:t>RFC 9179 -- YANG Grouping for Geographic Locations (2022, Standards Track)</w:t>
         </w:r>
       </w:hyperlink>
       <w:r>
@@ -47933,7 +47933,7 @@
       <w:bookmarkEnd w:id="866"/>
       <w:r>
         <w:rPr/>
-        <w:t>Improvement opportunity — Velocity field: RFC 9179 Section 5 defines velocity as a first-class field in the geo-location grouping: v-north, v-east, and v-up in meters/second with 12 fraction-digits precision. RSDGGS Section 13.7 (Extended Kalman Filter) defines a velocity component in the EKF state vector as cells-per-second, but the CDDL schema in Section 7.3 does not expose velocity externally. Adding an optional velocity field to the RSDGGS CBOR encoding — expressed in EKF cell units for constrained devices or as an RFC 9179-compatible (v-north, v-east) pair for gateway contexts — would improve interoperability with YANG-managed network infrastructure.</w:t>
+        <w:t>Improvement opportunity -- Velocity field: RFC 9179 Section 5 defines velocity as a first-class field in the geo-location grouping: v-north, v-east, and v-up in meters/second with 12 fraction-digits precision. RSDGGS Section 13.7 (Extended Kalman Filter) defines a velocity component in the EKF state vector as cells-per-second, but the CDDL schema in Section 7.3 does not expose velocity externally. Adding an optional velocity field to the RSDGGS CBOR encoding -- expressed in EKF cell units for constrained devices or as an RFC 9179-compatible (v-north, v-east) pair for gateway contexts -- would improve interoperability with YANG-managed network infrastructure.</w:t>
       </w:r>
     </w:p>
     <w:p>
@@ -47948,7 +47948,7 @@
       <w:bookmarkEnd w:id="867"/>
       <w:r>
         <w:rPr/>
-        <w:t>Improvement opportunity — Altitude encoding: RFC 9179 defines height above WGS-84 ellipsoid in meters as a decimal64 field. RSDGGS Section 7.3 includes an optional alt-m float16 field in the location CDDL. Float16 provides only ~3 significant decimal digits of altitude precision (~1 meter at low altitude, degrading above 1 km). For applications requiring RFC 9179-compatible altitude precision, the CDDL should provide an alternative float32 or decimal encoding. This is a minor schema enhancement that should be noted as a future revision item.</w:t>
+        <w:t>Improvement opportunity -- Altitude encoding: RFC 9179 defines height above WGS-84 ellipsoid in meters as a decimal64 field. RSDGGS Section 7.3 includes an optional alt-m float16 field in the location CDDL. Float16 provides only ~3 significant decimal digits of altitude precision (~1 meter at low altitude, degrading above 1 km). For applications requiring RFC 9179-compatible altitude precision, the CDDL should provide an alternative float32 or decimal encoding. This is a minor schema enhancement that should be noted as a future revision item.</w:t>
       </w:r>
     </w:p>
     <w:p>
@@ -47985,7 +47985,7 @@
           <w:rPr>
             <w:rStyle w:val="Hyperlink"/>
           </w:rPr>
-          <w:t>RFC 9632 / RFC 8805 — Geofeed Data (2024 / 2020)</w:t>
+          <w:t>RFC 9632 / RFC 8805 -- Geofeed Data (2024 / 2020)</w:t>
         </w:r>
       </w:hyperlink>
       <w:r>
@@ -48005,7 +48005,7 @@
       <w:bookmarkEnd w:id="869"/>
       <w:r>
         <w:rPr/>
-        <w:t>Improvement opportunity — RSDGGS-IPv6 geofeed compliance: RFC 8805 Section 2.1 defines the geofeed CSV format with fields: ip_prefix, alpha2code, region, city, postal_code. RFC 9632 Section 4 defines how geofeed files are discovered via RPSL inetnum objects. RSDGGS-IPv6 addresses are inherently geofeed-compatible, as noted in Section 15, but the specific mapping has not been formalized. A concrete improvement: define a RSDGGS-IPv6 geofeed profile where ip_prefix encodes the RSDGGS face (/72) or country-scale cell (/88), alpha2code is derived from the face's ITU Region, and region is the face name from the RSDGGS face table. This profile would make RSDGGS-IPv6 deployments automatically RFC 9632-compliant without any additional geofeed file maintenance.</w:t>
+        <w:t>Improvement opportunity -- RSDGGS-IPv6 geofeed compliance: RFC 8805 Section 2.1 defines the geofeed CSV format with fields: ip_prefix, alpha2code, region, city, postal_code. RFC 9632 Section 4 defines how geofeed files are discovered via RPSL inetnum objects. RSDGGS-IPv6 addresses are inherently geofeed-compatible, as noted in Section 15, but the specific mapping has not been formalized. A concrete improvement: define a RSDGGS-IPv6 geofeed profile where ip_prefix encodes the RSDGGS face (/72) or country-scale cell (/88), alpha2code is derived from the face's ITU Region, and region is the face name from the RSDGGS face table. This profile would make RSDGGS-IPv6 deployments automatically RFC 9632-compliant without any additional geofeed file maintenance.</w:t>
       </w:r>
     </w:p>
     <w:p>
@@ -48042,7 +48042,7 @@
           <w:rPr>
             <w:rStyle w:val="Hyperlink"/>
           </w:rPr>
-          <w:t>RFC 5808 — Location-by-Reference Requirements (2010, Informational)</w:t>
+          <w:t>RFC 5808 -- Location-by-Reference Requirements (2010, Informational)</w:t>
         </w:r>
       </w:hyperlink>
       <w:r>
@@ -48062,7 +48062,7 @@
       <w:bookmarkEnd w:id="871"/>
       <w:r>
         <w:rPr/>
-        <w:t>Improvement opportunity — Dereference latency requirement: RFC 5808 Section 4.3 requires that a location URI dereference return the current location at the time of dereference, not the location at the time the URI was created. This requirement is irrelevant to RSDGGS LbyV (Location-by-Value) encoding, but it highlights a gap: RSDGGS does not define a staleness indicator for the cell index. A device that provisioned its cell at manufacturing time (Section 12) and has never moved still carries a potentially stale index. Adding an optional timestamp or age field to the CBOR encoding would allow receivers to determine whether the cell index is current-position or provisioned-position, analogous to RFC 5808's dereference-time semantics. This is a concrete CDDL enhancement for the next draft revision.</w:t>
+        <w:t>Improvement opportunity -- Dereference latency requirement: RFC 5808 Section 4.3 requires that a location URI dereference return the current location at the time of dereference, not the location at the time the URI was created. This requirement is irrelevant to RSDGGS LbyV (Location-by-Value) encoding, but it highlights a gap: RSDGGS does not define a staleness indicator for the cell index. A device that provisioned its cell at manufacturing time (Section 12) and has never moved still carries a potentially stale index. Adding an optional timestamp or age field to the CBOR encoding would allow receivers to determine whether the cell index is current-position or provisioned-position, analogous to RFC 5808's dereference-time semantics. This is a concrete CDDL enhancement for the next draft revision.</w:t>
       </w:r>
     </w:p>
     <w:p>
@@ -48099,7 +48099,7 @@
           <w:rPr>
             <w:rStyle w:val="Hyperlink"/>
           </w:rPr>
-          <w:t>RFC 5491 — PIDF-LO Usage (2009, Standards Track)</w:t>
+          <w:t>RFC 5491 -- PIDF-LO Usage (2009, Standards Track)</w:t>
         </w:r>
       </w:hyperlink>
       <w:r>
@@ -48119,7 +48119,7 @@
       <w:bookmarkEnd w:id="873"/>
       <w:r>
         <w:rPr/>
-        <w:t>Improvement opportunity — Confidence level encoding: RFC 5491 Section 5.5 defines a confidence attribute in PIDF-LO location shapes, expressing the probability (as a percentage) that the described region contains the true location. RSDGGS implicitly expresses 100% confidence that the true location is within the stated cell (by construction of the encoding: the cell is computed from the true coordinate, so it always contains that coordinate). However, for RSDGGS cells derived from peer-assisted localization (Section 13) where the cell is inferred rather than computed, the confidence may be lower. Adding an optional confidence field (uint8, percentage) to the CBOR location encoding would align RSDGGS with RFC 5491's confidence model and would be particularly useful for cells derived from the cell intersection method of Section 13.2.</w:t>
+        <w:t>Improvement opportunity -- Confidence level encoding: RFC 5491 Section 5.5 defines a confidence attribute in PIDF-LO location shapes, expressing the probability (as a percentage) that the described region contains the true location. RSDGGS implicitly expresses 100% confidence that the true location is within the stated cell (by construction of the encoding: the cell is computed from the true coordinate, so it always contains that coordinate). However, for RSDGGS cells derived from peer-assisted localization (Section 13) where the cell is inferred rather than computed, the confidence may be lower. Adding an optional confidence field (uint8, percentage) to the CBOR location encoding would align RSDGGS with RFC 5491's confidence model and would be particularly useful for cells derived from the cell intersection method of Section 13.2.</w:t>
       </w:r>
     </w:p>
     <w:p>
@@ -48156,7 +48156,7 @@
           <w:rPr>
             <w:rStyle w:val="Hyperlink"/>
           </w:rPr>
-          <w:t>RFC 6280 — GEOPRIV Architecture (2011, BCP)</w:t>
+          <w:t>RFC 6280 -- GEOPRIV Architecture (2011, BCP)</w:t>
         </w:r>
       </w:hyperlink>
       <w:r>
@@ -48176,7 +48176,7 @@
       <w:bookmarkEnd w:id="875"/>
       <w:r>
         <w:rPr/>
-        <w:t>Improvement opportunity — Rule Maker analog: RFC 6280 Section 5 defines the Rule Maker role: the entity (typically the device owner) who specifies what location information may be disclosed to whom. RSDGGS's structural privacy model (byte truncation) does not support rule-based disclosure. For deployments where different recipients should receive different resolution (e.g., a regulatory compliance server receives 3 bytes, a fleet tracking application receives 7 bytes), an application-layer resolution selection mechanism is needed. Defining a CBOR map structure that carries multiple truncated cells at different resolutions, labeled by intended recipient type, would provide a RSDGGS-native analog to RFC 6280's Rule Maker mechanism without requiring XCAP or a Location Server.</w:t>
+        <w:t>Improvement opportunity -- Rule Maker analog: RFC 6280 Section 5 defines the Rule Maker role: the entity (typically the device owner) who specifies what location information may be disclosed to whom. RSDGGS's structural privacy model (byte truncation) does not support rule-based disclosure. For deployments where different recipients should receive different resolution (e.g., a regulatory compliance server receives 3 bytes, a fleet tracking application receives 7 bytes), an application-layer resolution selection mechanism is needed. Defining a CBOR map structure that carries multiple truncated cells at different resolutions, labeled by intended recipient type, would provide a RSDGGS-native analog to RFC 6280's Rule Maker mechanism without requiring XCAP or a Location Server.</w:t>
       </w:r>
     </w:p>
     <w:p>
@@ -48213,7 +48213,7 @@
           <w:rPr>
             <w:rStyle w:val="Hyperlink"/>
           </w:rPr>
-          <w:t>RFC 6772 — Geolocation Policy (2013, Standards Track)</w:t>
+          <w:t>RFC 6772 -- Geolocation Policy (2013, Standards Track)</w:t>
         </w:r>
       </w:hyperlink>
       <w:r>
@@ -48233,7 +48233,7 @@
       <w:bookmarkEnd w:id="877"/>
       <w:r>
         <w:rPr/>
-        <w:t>Improvement opportunity — Location-based condition analog: RFC 6772 Section 8 defines location-based conditions in policy rules: rules that apply only when the Target is within a specified geographic region. RSDGGS's RSL (Resolution Sufficiency Level) table in Section 8.2 is a regulatory-driven analog to RFC 6772's location-based conditions, but applies uniformly without per-device policy variation. For deployments with site-specific privacy requirements (e.g., a factory that requires higher location precision within its boundary but coarser precision outside), an RSDGGS extension could define per-cell RSL overrides stored in the regulatory database exception table (Section 8.3). This would be the RSDGGS-native equivalent of RFC 6772's location-based policy conditions without XML or XCAP infrastructure.</w:t>
+        <w:t>Improvement opportunity -- Location-based condition analog: RFC 6772 Section 8 defines location-based conditions in policy rules: rules that apply only when the Target is within a specified geographic region. RSDGGS's RSL (Resolution Sufficiency Level) table in Section 8.2 is a regulatory-driven analog to RFC 6772's location-based conditions, but applies uniformly without per-device policy variation. For deployments with site-specific privacy requirements (e.g., a factory that requires higher location precision within its boundary but coarser precision outside), an RSDGGS extension could define per-cell RSL overrides stored in the regulatory database exception table (Section 8.3). This would be the RSDGGS-native equivalent of RFC 6772's location-based policy conditions without XML or XCAP infrastructure.</w:t>
       </w:r>
     </w:p>
     <w:p>
@@ -48379,10 +48379,10 @@
         </w:tblCellMar>
       </w:tblPr>
       <w:tblGrid>
-        <w:gridCol w:w="1873"/>
-        <w:gridCol w:w="4036"/>
-        <w:gridCol w:w="2070"/>
-        <w:gridCol w:w="2560"/>
+        <w:gridCol w:w="1885"/>
+        <w:gridCol w:w="4075"/>
+        <w:gridCol w:w="2084"/>
+        <w:gridCol w:w="2495"/>
       </w:tblGrid>
       <w:tr>
         <w:trPr>
@@ -48551,7 +48551,7 @@
             </w:pPr>
             <w:r>
               <w:rPr/>
-              <w:t>High — routing performance</w:t>
+              <w:t>High -- routing performance</w:t>
             </w:r>
           </w:p>
         </w:tc>
@@ -48638,7 +48638,7 @@
             </w:pPr>
             <w:r>
               <w:rPr/>
-              <w:t>Medium — FTO documentation</w:t>
+              <w:t>Medium -- FTO documentation</w:t>
             </w:r>
           </w:p>
         </w:tc>
@@ -48725,7 +48725,7 @@
             </w:pPr>
             <w:r>
               <w:rPr/>
-              <w:t>Medium — novelty clarity</w:t>
+              <w:t>Medium -- novelty clarity</w:t>
             </w:r>
           </w:p>
         </w:tc>
@@ -48812,7 +48812,7 @@
             </w:pPr>
             <w:r>
               <w:rPr/>
-              <w:t>Low — interoperability</w:t>
+              <w:t>Low -- interoperability</w:t>
             </w:r>
           </w:p>
         </w:tc>
@@ -48899,7 +48899,7 @@
             </w:pPr>
             <w:r>
               <w:rPr/>
-              <w:t>Low — SIP integration</w:t>
+              <w:t>Low -- SIP integration</w:t>
             </w:r>
           </w:p>
         </w:tc>
@@ -48986,7 +48986,7 @@
             </w:pPr>
             <w:r>
               <w:rPr/>
-              <w:t>Medium — YANG interop</w:t>
+              <w:t>Medium -- YANG interop</w:t>
             </w:r>
           </w:p>
         </w:tc>
@@ -49073,7 +49073,7 @@
             </w:pPr>
             <w:r>
               <w:rPr/>
-              <w:t>Low — schema extension</w:t>
+              <w:t>Low -- schema extension</w:t>
             </w:r>
           </w:p>
         </w:tc>
@@ -49160,7 +49160,7 @@
             </w:pPr>
             <w:r>
               <w:rPr/>
-              <w:t>High — deployment utility</w:t>
+              <w:t>High -- deployment utility</w:t>
             </w:r>
           </w:p>
         </w:tc>
@@ -49247,7 +49247,7 @@
             </w:pPr>
             <w:r>
               <w:rPr/>
-              <w:t>Medium — LbyV semantics</w:t>
+              <w:t>Medium -- LbyV semantics</w:t>
             </w:r>
           </w:p>
         </w:tc>
@@ -49334,7 +49334,7 @@
             </w:pPr>
             <w:r>
               <w:rPr/>
-              <w:t>Medium — cooperative location</w:t>
+              <w:t>Medium -- cooperative location</w:t>
             </w:r>
           </w:p>
         </w:tc>
@@ -49421,7 +49421,7 @@
             </w:pPr>
             <w:r>
               <w:rPr/>
-              <w:t>Medium — privacy model</w:t>
+              <w:t>Medium -- privacy model</w:t>
             </w:r>
           </w:p>
         </w:tc>
@@ -49508,7 +49508,7 @@
             </w:pPr>
             <w:r>
               <w:rPr/>
-              <w:t>Low — policy extension</w:t>
+              <w:t>Low -- policy extension</w:t>
             </w:r>
           </w:p>
         </w:tc>
@@ -49548,7 +49548,7 @@
       <w:bookmarkEnd w:id="882"/>
       <w:r>
         <w:rPr/>
-        <w:t>The highest-priority improvements — link quality weighted forwarding, RSDGGS-IPv6 geofeed profile, and the staleness field — represent concrete enhancements to the core specification that should be incorporated in the -01 revision. The medium-priority items are suitable for informational notes or future work statements in the current -00 draft. The low-priority items are candidates for companion specifications or implementation guidance documents.</w:t>
+        <w:t>The highest-priority improvements -- link quality weighted forwarding, RSDGGS-IPv6 geofeed profile, and the staleness field -- represent concrete enhancements to the core specification that should be incorporated in the -01 revision. The medium-priority items are suitable for informational notes or future work statements in the current -00 draft. The low-priority items are candidates for companion specifications or implementation guidance documents.</w:t>
       </w:r>
     </w:p>
     <w:p>
@@ -49995,7 +49995,7 @@
       </w:pPr>
       <w:r>
         <w:rPr/>
-        <w:t>// RSDGGS — Regulatory Spectrum Discrete Global Grid System</w:t>
+        <w:t>// RSDGGS -- Regulatory Spectrum Discrete Global Grid System</w:t>
       </w:r>
     </w:p>
     <w:p>
@@ -50101,7 +50101,7 @@
       </w:pPr>
       <w:r>
         <w:rPr/>
-        <w:t>///          subdivision levels 1–2 in bits [4:1],</w:t>
+        <w:t>///          subdivision levels 1-2 in bits [4:1],</w:t>
       </w:r>
     </w:p>
     <w:p>
@@ -50125,7 +50125,7 @@
       </w:pPr>
       <w:r>
         <w:rPr/>
-        <w:t>/// Bytes 2–7: subdivision levels packed 2 bits per level, MSB-first.</w:t>
+        <w:t>/// Bytes 2-7: subdivision levels packed 2 bits per level, MSB-first.</w:t>
       </w:r>
     </w:p>
     <w:p>
@@ -53215,19 +53215,19 @@
       </w:pPr>
       <w:r>
         <w:rPr/>
-        <w:t>/// Sign of the scalar triple product [a×b · p].</w:t>
-      </w:r>
-    </w:p>
-    <w:p>
-      <w:pPr>
-        <w:pStyle w:val="PreformattedText"/>
-        <w:bidi w:val="0"/>
-        <w:jc w:val="left"/>
-        <w:rPr/>
-      </w:pPr>
-      <w:r>
-        <w:rPr/>
-        <w:t>/// Positive if p is on the left side (CCW) of the arc a→b.</w:t>
+        <w:t>/// Sign of the scalar triple product [(a x b) . p].</w:t>
+      </w:r>
+    </w:p>
+    <w:p>
+      <w:pPr>
+        <w:pStyle w:val="PreformattedText"/>
+        <w:bidi w:val="0"/>
+        <w:jc w:val="left"/>
+        <w:rPr/>
+      </w:pPr>
+      <w:r>
+        <w:rPr/>
+        <w:t>/// Positive if p is on the left side (CCW) of the arc a-&gt;b.</w:t>
       </w:r>
     </w:p>
     <w:p>
@@ -53803,7 +53803,7 @@
       </w:pPr>
       <w:r>
         <w:rPr/>
-        <w:t>// only finding the maximum of 12 products — no sqrt, no trig.</w:t>
+        <w:t>// only finding the maximum of 12 products -- no sqrt, no trig.</w:t>
       </w:r>
     </w:p>
     <w:p>
@@ -53994,7 +53994,7 @@
       </w:r>
       <w:r>
         <w:rPr/>
-        <w:t>// face 0 (Antarctic) — vertices omitted for brevity</w:t>
+        <w:t>// face 0 (Antarctic) -- vertices omitted for brevity</w:t>
       </w:r>
     </w:p>
     <w:p>
@@ -54042,7 +54042,7 @@
       </w:r>
       <w:r>
         <w:rPr/>
-        <w:t>// face 2 (N. America) — computed pentagon vertices</w:t>
+        <w:t>// face 2 (N. America) -- computed pentagon vertices</w:t>
       </w:r>
     </w:p>
     <w:p>
@@ -54074,7 +54074,7 @@
       </w:r>
       <w:r>
         <w:rPr/>
-        <w:t>[ 0.3546, -0.5742,  0.7378],   // pv[0] ~(47.6°N,  58.2°W)</w:t>
+        <w:t>[ 0.3546, -0.5742,  0.7378],   // pv[0] ~(47.6N,  58.2W)</w:t>
       </w:r>
     </w:p>
     <w:p>
@@ -54090,7 +54090,7 @@
       </w:r>
       <w:r>
         <w:rPr/>
-        <w:t>[ 0.5936, -0.7722,  0.2235],   // pv[1] ~(12.9°N,  52.5°W)</w:t>
+        <w:t>[ 0.5936, -0.7722,  0.2235],   // pv[1] ~(12.9N,  52.5W)</w:t>
       </w:r>
     </w:p>
     <w:p>
@@ -54106,7 +54106,7 @@
       </w:r>
       <w:r>
         <w:rPr/>
-        <w:t>[ 0.6204, -0.7726,  0.1376],   // pv[2] ~( 7.9°N,  51.3°W)</w:t>
+        <w:t>[ 0.6204, -0.7726,  0.1376],   // pv[2] ~( 7.9N,  51.3W)</w:t>
       </w:r>
     </w:p>
     <w:p>
@@ -54122,7 +54122,7 @@
       </w:r>
       <w:r>
         <w:rPr/>
-        <w:t>[-0.3546, -0.8986, -0.2586],   // pv[3] ~(15.0°S, 111.6°W)</w:t>
+        <w:t>[-0.3546, -0.8986, -0.2586],   // pv[3] ~(15.0S, 111.6W)</w:t>
       </w:r>
     </w:p>
     <w:p>
@@ -54138,7 +54138,7 @@
       </w:r>
       <w:r>
         <w:rPr/>
-        <w:t>[ 0.0523, -0.9954,  0.0805],   // pv[4] ~( 4.6°N, 86.9°W)</w:t>
+        <w:t>[ 0.0523, -0.9954,  0.0805],   // pv[4] ~( 4.6N, 86.9W)</w:t>
       </w:r>
     </w:p>
     <w:p>
@@ -55002,7 +55002,7 @@
       </w:r>
       <w:r>
         <w:rPr/>
-        <w:t>// Central is last — it contains any point not in the other three.</w:t>
+        <w:t>// Central is last -- it contains any point not in the other three.</w:t>
       </w:r>
     </w:p>
     <w:p>
@@ -55526,19 +55526,19 @@
       </w:pPr>
       <w:r>
         <w:rPr/>
-        <w:t>/// * \x60ll\x60  — latitude/longitude in decimal degrees (WGS-84)</w:t>
-      </w:r>
-    </w:p>
-    <w:p>
-      <w:pPr>
-        <w:pStyle w:val="PreformattedText"/>
-        <w:bidi w:val="0"/>
-        <w:jc w:val="left"/>
-        <w:rPr/>
-      </w:pPr>
-      <w:r>
-        <w:rPr/>
-        <w:t>/// * \x60len\x60 — desired index length in bytes, 1..=8</w:t>
+        <w:t>/// * \x60ll\x60  -- latitude/longitude in decimal degrees (WGS-84)</w:t>
+      </w:r>
+    </w:p>
+    <w:p>
+      <w:pPr>
+        <w:pStyle w:val="PreformattedText"/>
+        <w:bidi w:val="0"/>
+        <w:jc w:val="left"/>
+        <w:rPr/>
+      </w:pPr>
+      <w:r>
+        <w:rPr/>
+        <w:t>/// * \x60len\x60 -- desired index length in bytes, 1..=8</w:t>
       </w:r>
     </w:p>
     <w:p>
@@ -55716,7 +55716,7 @@
       </w:r>
       <w:r>
         <w:rPr/>
-        <w:t>// ── Byte 0: face index ──────────────────────────────────────────</w:t>
+        <w:t>// -- Byte 0: face index ------------------------------------------</w:t>
       </w:r>
     </w:p>
     <w:p>
@@ -55791,7 +55791,7 @@
       </w:r>
       <w:r>
         <w:rPr/>
-        <w:t>// ── Byte 1 [7:4]: pentagon sector ───────────────────────────────</w:t>
+        <w:t>// -- Byte 1 [7:4]: pentagon sector -------------------------------</w:t>
       </w:r>
     </w:p>
     <w:p>
@@ -56320,7 +56320,7 @@
       <w:bookmarkEnd w:id="912"/>
       <w:r>
         <w:rPr/>
-        <w:t>The decode function extracts the face, sector, and subdivision level sequence from a populated RsdggsCell. It does not reconstruct the precise geographic coordinate — it returns the cell information sufficient for regulatory database lookup. Geographic coordinate recovery (computing the cell center) is a separate operation not required for regulatory compliance.</w:t>
+        <w:t>The decode function extracts the face, sector, and subdivision level sequence from a populated RsdggsCell. It does not reconstruct the precise geographic coordinate -- it returns the cell information sufficient for regulatory database lookup. Geographic coordinate recovery (computing the cell center) is a separate operation not required for regulatory compliance.</w:t>
       </w:r>
     </w:p>
     <w:p>
@@ -57708,19 +57708,19 @@
       </w:pPr>
       <w:r>
         <w:rPr/>
-        <w:t>//   latitude  =  37.7749° N  (San Francisco, CA, USA)</w:t>
-      </w:r>
-    </w:p>
-    <w:p>
-      <w:pPr>
-        <w:pStyle w:val="PreformattedText"/>
-        <w:bidi w:val="0"/>
-        <w:jc w:val="left"/>
-        <w:rPr/>
-      </w:pPr>
-      <w:r>
-        <w:rPr/>
-        <w:t>//   longitude = 122.4194° W</w:t>
+        <w:t>//   latitude  =  37.7749 N  (San Francisco, CA, USA)</w:t>
+      </w:r>
+    </w:p>
+    <w:p>
+      <w:pPr>
+        <w:pStyle w:val="PreformattedText"/>
+        <w:bidi w:val="0"/>
+        <w:jc w:val="left"/>
+        <w:rPr/>
+      </w:pPr>
+      <w:r>
+        <w:rPr/>
+        <w:t>//   longitude = 122.4194 W</w:t>
       </w:r>
     </w:p>
     <w:p>
@@ -57968,55 +57968,55 @@
       </w:pPr>
       <w:r>
         <w:rPr/>
-        <w:t>//   London    (51.51°N,   0.13°W) → face 1  (ITU Region 1, Europe)</w:t>
-      </w:r>
-    </w:p>
-    <w:p>
-      <w:pPr>
-        <w:pStyle w:val="PreformattedText"/>
-        <w:bidi w:val="0"/>
-        <w:jc w:val="left"/>
-        <w:rPr/>
-      </w:pPr>
-      <w:r>
-        <w:rPr/>
-        <w:t>//   Tokyo     (35.68°N, 139.69°E) → face 3  (ITU Region 3, Asia)</w:t>
-      </w:r>
-    </w:p>
-    <w:p>
-      <w:pPr>
-        <w:pStyle w:val="PreformattedText"/>
-        <w:bidi w:val="0"/>
-        <w:jc w:val="left"/>
-        <w:rPr/>
-      </w:pPr>
-      <w:r>
-        <w:rPr/>
-        <w:t>//   Beijing   (39.91°N, 116.39°E) → face 3  (ITU Region 3, Asia)</w:t>
-      </w:r>
-    </w:p>
-    <w:p>
-      <w:pPr>
-        <w:pStyle w:val="PreformattedText"/>
-        <w:bidi w:val="0"/>
-        <w:jc w:val="left"/>
-        <w:rPr/>
-      </w:pPr>
-      <w:r>
-        <w:rPr/>
-        <w:t>//   São Paulo (23.55°S,  46.63°W) → face 6  (ITU Region 2, S. America)</w:t>
-      </w:r>
-    </w:p>
-    <w:p>
-      <w:pPr>
-        <w:pStyle w:val="PreformattedText"/>
-        <w:bidi w:val="0"/>
-        <w:jc w:val="left"/>
-        <w:rPr/>
-      </w:pPr>
-      <w:r>
-        <w:rPr/>
-        <w:t>//   Sydney    (33.87°S, 151.21°E) → face 7  (Region 3, E. Australia)</w:t>
+        <w:t>//   London    (51.51N,   0.13W) -&gt; face 1  (ITU Region 1, Europe)</w:t>
+      </w:r>
+    </w:p>
+    <w:p>
+      <w:pPr>
+        <w:pStyle w:val="PreformattedText"/>
+        <w:bidi w:val="0"/>
+        <w:jc w:val="left"/>
+        <w:rPr/>
+      </w:pPr>
+      <w:r>
+        <w:rPr/>
+        <w:t>//   Tokyo     (35.68N, 139.69E) -&gt; face 3  (ITU Region 3, Asia)</w:t>
+      </w:r>
+    </w:p>
+    <w:p>
+      <w:pPr>
+        <w:pStyle w:val="PreformattedText"/>
+        <w:bidi w:val="0"/>
+        <w:jc w:val="left"/>
+        <w:rPr/>
+      </w:pPr>
+      <w:r>
+        <w:rPr/>
+        <w:t>//   Beijing   (39.91N, 116.39E) -&gt; face 3  (ITU Region 3, Asia)</w:t>
+      </w:r>
+    </w:p>
+    <w:p>
+      <w:pPr>
+        <w:pStyle w:val="PreformattedText"/>
+        <w:bidi w:val="0"/>
+        <w:jc w:val="left"/>
+        <w:rPr/>
+      </w:pPr>
+      <w:r>
+        <w:rPr/>
+        <w:t>//   Sao Paulo (23.55S,  46.63W) -&gt; face 6  (ITU Region 2, S. America)</w:t>
+      </w:r>
+    </w:p>
+    <w:p>
+      <w:pPr>
+        <w:pStyle w:val="PreformattedText"/>
+        <w:bidi w:val="0"/>
+        <w:jc w:val="left"/>
+        <w:rPr/>
+      </w:pPr>
+      <w:r>
+        <w:rPr/>
+        <w:t>//   Sydney    (33.87S, 151.21E) -&gt; face 7  (Region 3, E. Australia)</w:t>
       </w:r>
     </w:p>
     <w:p>
@@ -59798,49 +59798,49 @@
 
 <file path=word/comments.xml><?xml version="1.0" encoding="utf-8"?>
 <w:comments xmlns:o="urn:schemas-microsoft-com:office:office" xmlns:r="http://schemas.openxmlformats.org/officeDocument/2006/relationships" xmlns:v="urn:schemas-microsoft-com:vml" xmlns:w="http://schemas.openxmlformats.org/wordprocessingml/2006/main" xmlns:w10="urn:schemas-microsoft-com:office:word" xmlns:wp="http://schemas.openxmlformats.org/drawingml/2006/wordprocessingDrawing" xmlns:wps="http://schemas.microsoft.com/office/word/2010/wordprocessingShape" xmlns:wpg="http://schemas.microsoft.com/office/word/2010/wordprocessingGroup" xmlns:mc="http://schemas.openxmlformats.org/markup-compatibility/2006" xmlns:wp14="http://schemas.microsoft.com/office/word/2010/wordprocessingDrawing" xmlns:w14="http://schemas.microsoft.com/office/word/2010/wordml" xmlns:w15="http://schemas.microsoft.com/office/word/2012/wordml" mc:Ignorable="w14 wp14 w15">
-  <w:comment w:id="0" w:author="" w:date="2026-10-20T09:42:35Z" w:initials="">
+  <w:comment w:id="0" w:author="" w:date="2026-10-20T16:55:03Z" w:initials="">
     <w:p>
       <w:r>
         <w:t>HTML: &lt;meta name="keyword" content="spectrum"&gt;</w:t>
       </w:r>
     </w:p>
   </w:comment>
-  <w:comment w:id="1" w:author="" w:date="2026-10-20T09:42:35Z" w:initials="">
+  <w:comment w:id="1" w:author="" w:date="2026-10-20T16:55:03Z" w:initials="">
     <w:p>
       <w:r>
         <w:t>HTML: &lt;meta name="keyword" content="regulatory"&gt;</w:t>
       </w:r>
     </w:p>
   </w:comment>
-  <w:comment w:id="2" w:author="" w:date="2026-10-20T09:42:35Z" w:initials="">
+  <w:comment w:id="2" w:author="" w:date="2026-10-20T16:55:03Z" w:initials="">
     <w:p>
       <w:r>
         <w:t>HTML: &lt;meta name="keyword" content="dodecahedron"&gt;</w:t>
       </w:r>
     </w:p>
   </w:comment>
-  <w:comment w:id="3" w:author="" w:date="2026-10-20T09:42:35Z" w:initials="">
+  <w:comment w:id="3" w:author="" w:date="2026-10-20T16:55:03Z" w:initials="">
     <w:p>
       <w:r>
         <w:t>HTML: &lt;meta name="keyword" content="ISM"&gt;</w:t>
       </w:r>
     </w:p>
   </w:comment>
-  <w:comment w:id="4" w:author="" w:date="2026-10-20T09:42:35Z" w:initials="">
+  <w:comment w:id="4" w:author="" w:date="2026-10-20T16:55:03Z" w:initials="">
     <w:p>
       <w:r>
         <w:t>HTML: &lt;meta name="keyword" content="location"&gt;</w:t>
       </w:r>
     </w:p>
   </w:comment>
-  <w:comment w:id="5" w:author="" w:date="2026-10-20T09:42:35Z" w:initials="">
+  <w:comment w:id="5" w:author="" w:date="2026-10-20T16:55:03Z" w:initials="">
     <w:p>
       <w:r>
         <w:t>HTML: &lt;meta name="keyword" content="802.15.4"&gt;</w:t>
       </w:r>
     </w:p>
   </w:comment>
-  <w:comment w:id="6" w:author="" w:date="2026-10-20T09:42:35Z" w:initials="">
+  <w:comment w:id="6" w:author="" w:date="2026-10-20T16:55:03Z" w:initials="">
     <w:p>
       <w:r>
         <w:t>HTML: &lt;meta name="keyword" content="CBOR"&gt;</w:t>

</xml_diff>

<commit_message>
Draft: clear the idnits full-checklist items
- RFC 2119/8174 boilerplate: add ", as shown here".
- The Rust reference implementation and worked example are
  <sourcecode type="rust" markers="true">, so the text has
  <CODE BEGINS>/<CODE ENDS>; code lines rewrapped to fit 72 columns.
- CDDL and pseudocode blocks are <sourcecode type="cddl"> and
  type="pseudocode" (no markers).
- patents.uspto.gov is a URL; Cell[0]/Cell[1] in prose and the Sub-IE
  table become "cell octet 0/1"; G_next[N] becomes G_next(N).
- boundary_power_dbm used an undeclared neighbor_power_dbm and
  rule.power_dbm.min(...); it now reads core::cmp::min(rule.power_dbm,
  nbr_pwr).
</commit_message>
<xml_diff>
--- a/draft/draft-hanley-rsdggs-00.docx
+++ b/draft/draft-hanley-rsdggs-00.docx
@@ -124,7 +124,7 @@
       </w:pPr>
       <w:r>
         <w:rPr/>
-        <w:t xml:space="preserve">20 October 2026 </w:t>
+        <w:t xml:space="preserve">21 October 2026 </w:t>
       </w:r>
     </w:p>
     <w:p>
@@ -172,7 +172,7 @@
       </w:pPr>
       <w:r>
         <w:rPr/>
-        <w:t xml:space="preserve">23 April 2027 </w:t>
+        <w:t xml:space="preserve">24 April 2027 </w:t>
       </w:r>
     </w:p>
     <w:p>
@@ -431,7 +431,7 @@
       <w:bookmarkEnd w:id="11"/>
       <w:r>
         <w:rPr/>
-        <w:t>This Internet-Draft will expire on 23 April 2027.</w:t>
+        <w:t>This Internet-Draft will expire on 24 April 2027.</w:t>
       </w:r>
     </w:p>
     <w:p>
@@ -7554,7 +7554,7 @@
       </w:hyperlink>
       <w:r>
         <w:rPr/>
-        <w:t>] when, and only when, they appear in all capitals.</w:t>
+        <w:t>] when, and only when, they appear in all capitals, as shown here.</w:t>
       </w:r>
     </w:p>
     <w:p>
@@ -18723,7 +18723,7 @@
       </w:r>
       <w:r>
         <w:rPr/>
-        <w:t>citation:      tstr,        ; rule citation (e.g. "FCC Part 15.247")</w:t>
+        <w:t>citation:      tstr,        ; rule citation, e.g. "FCC 15.247"</w:t>
       </w:r>
     </w:p>
     <w:p>
@@ -18819,7 +18819,7 @@
       </w:r>
       <w:r>
         <w:rPr/>
-        <w:t>dwell-s:       nil / float, ; max dwell in seconds, nil = unrestricted</w:t>
+        <w:t>dwell-s:       nil / float, ; max dwell (s), nil = unrestricted</w:t>
       </w:r>
     </w:p>
     <w:p>
@@ -35320,10 +35320,10 @@
         </w:tblCellMar>
       </w:tblPr>
       <w:tblGrid>
-        <w:gridCol w:w="968"/>
+        <w:gridCol w:w="1333"/>
         <w:gridCol w:w="511"/>
-        <w:gridCol w:w="1267"/>
-        <w:gridCol w:w="7793"/>
+        <w:gridCol w:w="1246"/>
+        <w:gridCol w:w="7449"/>
       </w:tblGrid>
       <w:tr>
         <w:trPr>
@@ -35603,7 +35603,7 @@
             </w:pPr>
             <w:r>
               <w:rPr/>
-              <w:t>Cell[0]</w:t>
+              <w:t>Cell octet 0</w:t>
             </w:r>
           </w:p>
         </w:tc>
@@ -35690,7 +35690,7 @@
             </w:pPr>
             <w:r>
               <w:rPr/>
-              <w:t>Cell[1..7]</w:t>
+              <w:t>Cell octets 1-7</w:t>
             </w:r>
           </w:p>
         </w:tc>
@@ -35753,7 +35753,7 @@
             </w:pPr>
             <w:r>
               <w:rPr/>
-              <w:t>Triangle index (Cell[1] bits 7-4) and subdivision levels, present per Length field</w:t>
+              <w:t>Triangle index (octet 1 bits 7-4) and subdivision levels, present per Length field</w:t>
             </w:r>
           </w:p>
         </w:tc>
@@ -35793,7 +35793,7 @@
       <w:bookmarkEnd w:id="658"/>
       <w:r>
         <w:rPr/>
-        <w:t>A receiver MUST interpret the Length field as the RSDGGS resolution level. A Length of 1 indicates face-only resolution. A Length of 0 is invalid and MUST be rejected. A Length greater than 8 is invalid and MUST be rejected. Reserved face values (0xC to 0xF in Cell[0] bits 3-0) MUST be treated as an error condition. A Length of 2 or more with a reserved triangle index (Cell[1] bits 7-4 in the range 0x5 to 0xF) MUST be treated as an error condition.</w:t>
+        <w:t>A receiver MUST interpret the Length field as the RSDGGS resolution level. A Length of 1 indicates face-only resolution. A Length of 0 is invalid and MUST be rejected. A Length greater than 8 is invalid and MUST be rejected. Reserved face values (0xC to 0xF in bits 3-0 of cell octet 0) MUST be treated as an error condition. A Length of 2 or more with a reserved triangle index (bits 7-4 of cell octet 1 in the range 0x5 to 0xF) MUST be treated as an error condition.</w:t>
       </w:r>
     </w:p>
     <w:p>
@@ -37812,7 +37812,7 @@
       </w:r>
       <w:r>
         <w:rPr/>
-        <w:t>G_self  = local RSDGGS cell (from own address IID)</w:t>
+        <w:t>G_self    = local RSDGGS cell (from own address IID)</w:t>
       </w:r>
     </w:p>
     <w:p>
@@ -37828,7 +37828,7 @@
       </w:r>
       <w:r>
         <w:rPr/>
-        <w:t>G_dest  = destination RSDGGS cell (from packet dest IID)</w:t>
+        <w:t>G_dest    = destination RSDGGS cell (from packet dest IID)</w:t>
       </w:r>
     </w:p>
     <w:p>
@@ -37844,7 +37844,7 @@
       </w:r>
       <w:r>
         <w:rPr/>
-        <w:t>G_next  = next-hop RSDGGS cell (from neighbor table)</w:t>
+        <w:t>G_next(N) = RSDGGS cell of neighbor N (from neighbor table)</w:t>
       </w:r>
     </w:p>
     <w:p>
@@ -37973,7 +37973,7 @@
       </w:r>
       <w:r>
         <w:rPr/>
-        <w:t>if progress(G_next[N], G_self, G_dest):</w:t>
+        <w:t>if progress(G_next(N), G_self, G_dest):</w:t>
       </w:r>
     </w:p>
     <w:p>
@@ -45603,7 +45603,7 @@
       <w:bookmarkEnd w:id="836"/>
       <w:r>
         <w:rPr/>
-        <w:t>This number was not definitively identified in patent database searches. If this patent was cited in relation to geographic routing or MANET protocols, the Metricom prior art (4,939,726 and 5,115,433, both expired 2007 and 2009 respectively) predates any 2006-era geographic routing patent by 15+ years and establishes the core concepts as public domain. Independent verification at patents.uspto.gov is still recommended.</w:t>
+        <w:t>This number was not definitively identified in patent database searches. If this patent was cited in relation to geographic routing or MANET protocols, the Metricom prior art (4,939,726 and 5,115,433, both expired 2007 and 2009 respectively) predates any 2006-era geographic routing patent by 15+ years and establishes the core concepts as public domain. Independent verification at the USPTO patent database (https://patents.uspto.gov) is still recommended.</w:t>
       </w:r>
     </w:p>
     <w:p>
@@ -49936,6 +49936,18 @@
       </w:pPr>
       <w:r>
         <w:rPr/>
+        <w:t>&lt;CODE BEGINS&gt;</w:t>
+      </w:r>
+    </w:p>
+    <w:p>
+      <w:pPr>
+        <w:pStyle w:val="PreformattedText"/>
+        <w:bidi w:val="0"/>
+        <w:jc w:val="left"/>
+        <w:rPr/>
+      </w:pPr>
+      <w:r>
+        <w:rPr/>
         <w:t>#![no_std]</w:t>
       </w:r>
     </w:p>
@@ -50314,13 +50326,36 @@
       <w:pPr>
         <w:pStyle w:val="PreformattedText"/>
         <w:bidi w:val="0"/>
+        <w:jc w:val="left"/>
+        <w:rPr/>
+      </w:pPr>
+      <w:r>
+        <w:rPr/>
+        <w:t>type Vec3 = [f64; 3];</w:t>
+      </w:r>
+    </w:p>
+    <w:p>
+      <w:pPr>
+        <w:pStyle w:val="PreformattedText"/>
+        <w:bidi w:val="0"/>
+        <w:jc w:val="left"/>
+        <w:rPr/>
+      </w:pPr>
+      <w:r>
+        <w:rPr/>
+      </w:r>
+    </w:p>
+    <w:p>
+      <w:pPr>
+        <w:pStyle w:val="PreformattedText"/>
+        <w:bidi w:val="0"/>
         <w:spacing w:before="0" w:after="283"/>
         <w:jc w:val="left"/>
         <w:rPr/>
       </w:pPr>
       <w:r>
         <w:rPr/>
-        <w:t>type Vec3 = [f64; 3];</w:t>
+        <w:t>&lt;CODE ENDS&gt;</w:t>
       </w:r>
     </w:p>
     <w:p>
@@ -50432,7 +50467,19 @@
       </w:pPr>
       <w:r>
         <w:rPr/>
-        <w:t>/// Dodecahedron face center unit vectors, in RSDGGS face index order.</w:t>
+        <w:t>&lt;CODE BEGINS&gt;</w:t>
+      </w:r>
+    </w:p>
+    <w:p>
+      <w:pPr>
+        <w:pStyle w:val="PreformattedText"/>
+        <w:bidi w:val="0"/>
+        <w:jc w:val="left"/>
+        <w:rPr/>
+      </w:pPr>
+      <w:r>
+        <w:rPr/>
+        <w:t>/// Dodecahedron face center unit vectors, in RSDGGS face order.</w:t>
       </w:r>
     </w:p>
     <w:p>
@@ -50887,19 +50934,31 @@
       </w:pPr>
       <w:r>
         <w:rPr/>
-        <w:t>/// Pentagon vertices per face, counter-clockwise as seen from outside</w:t>
-      </w:r>
-    </w:p>
-    <w:p>
-      <w:pPr>
-        <w:pStyle w:val="PreformattedText"/>
-        <w:bidi w:val="0"/>
-        <w:jc w:val="left"/>
-        <w:rPr/>
-      </w:pPr>
-      <w:r>
-        <w:rPr/>
-        <w:t>/// the sphere, starting at the smallest bearing from the face center.</w:t>
+        <w:t>/// Pentagon vertices per face, counter-clockwise as seen from</w:t>
+      </w:r>
+    </w:p>
+    <w:p>
+      <w:pPr>
+        <w:pStyle w:val="PreformattedText"/>
+        <w:bidi w:val="0"/>
+        <w:jc w:val="left"/>
+        <w:rPr/>
+      </w:pPr>
+      <w:r>
+        <w:rPr/>
+        <w:t>/// outside the sphere, starting at the smallest bearing from the</w:t>
+      </w:r>
+    </w:p>
+    <w:p>
+      <w:pPr>
+        <w:pStyle w:val="PreformattedText"/>
+        <w:bidi w:val="0"/>
+        <w:jc w:val="left"/>
+        <w:rPr/>
+      </w:pPr>
+      <w:r>
+        <w:rPr/>
+        <w:t>/// face center.</w:t>
       </w:r>
     </w:p>
     <w:p>
@@ -52585,13 +52644,36 @@
       <w:pPr>
         <w:pStyle w:val="PreformattedText"/>
         <w:bidi w:val="0"/>
+        <w:jc w:val="left"/>
+        <w:rPr/>
+      </w:pPr>
+      <w:r>
+        <w:rPr/>
+        <w:t>const CHILD_CENTRAL: u8 = 0b11;</w:t>
+      </w:r>
+    </w:p>
+    <w:p>
+      <w:pPr>
+        <w:pStyle w:val="PreformattedText"/>
+        <w:bidi w:val="0"/>
+        <w:jc w:val="left"/>
+        <w:rPr/>
+      </w:pPr>
+      <w:r>
+        <w:rPr/>
+      </w:r>
+    </w:p>
+    <w:p>
+      <w:pPr>
+        <w:pStyle w:val="PreformattedText"/>
+        <w:bidi w:val="0"/>
         <w:spacing w:before="0" w:after="283"/>
         <w:jc w:val="left"/>
         <w:rPr/>
       </w:pPr>
       <w:r>
         <w:rPr/>
-        <w:t>const CHILD_CENTRAL: u8 = 0b11;</w:t>
+        <w:t>&lt;CODE ENDS&gt;</w:t>
       </w:r>
     </w:p>
     <w:p>
@@ -52688,6 +52770,18 @@
       </w:pPr>
       <w:r>
         <w:rPr/>
+        <w:t>&lt;CODE BEGINS&gt;</w:t>
+      </w:r>
+    </w:p>
+    <w:p>
+      <w:pPr>
+        <w:pStyle w:val="PreformattedText"/>
+        <w:bidi w:val="0"/>
+        <w:jc w:val="left"/>
+        <w:rPr/>
+      </w:pPr>
+      <w:r>
+        <w:rPr/>
         <w:t>/// Convert WGS-84 decimal degrees to unit Cartesian vector.</w:t>
       </w:r>
     </w:p>
@@ -53302,7 +53396,7 @@
       </w:pPr>
       <w:r>
         <w:rPr/>
-        <w:t>/// Test whether point p lies within the spherical triangle (a, b, c).</w:t>
+        <w:t>/// Test whether point p lies in the spherical triangle (a, b, c).</w:t>
       </w:r>
     </w:p>
     <w:p>
@@ -53425,13 +53519,36 @@
       <w:pPr>
         <w:pStyle w:val="PreformattedText"/>
         <w:bidi w:val="0"/>
+        <w:jc w:val="left"/>
+        <w:rPr/>
+      </w:pPr>
+      <w:r>
+        <w:rPr/>
+        <w:t>}</w:t>
+      </w:r>
+    </w:p>
+    <w:p>
+      <w:pPr>
+        <w:pStyle w:val="PreformattedText"/>
+        <w:bidi w:val="0"/>
+        <w:jc w:val="left"/>
+        <w:rPr/>
+      </w:pPr>
+      <w:r>
+        <w:rPr/>
+      </w:r>
+    </w:p>
+    <w:p>
+      <w:pPr>
+        <w:pStyle w:val="PreformattedText"/>
+        <w:bidi w:val="0"/>
         <w:spacing w:before="0" w:after="283"/>
         <w:jc w:val="left"/>
         <w:rPr/>
       </w:pPr>
       <w:r>
         <w:rPr/>
-        <w:t>}</w:t>
+        <w:t>&lt;CODE ENDS&gt;</w:t>
       </w:r>
     </w:p>
     <w:p>
@@ -53543,6 +53660,18 @@
       </w:pPr>
       <w:r>
         <w:rPr/>
+        <w:t>&lt;CODE BEGINS&gt;</w:t>
+      </w:r>
+    </w:p>
+    <w:p>
+      <w:pPr>
+        <w:pStyle w:val="PreformattedText"/>
+        <w:bidi w:val="0"/>
+        <w:jc w:val="left"/>
+        <w:rPr/>
+      </w:pPr>
+      <w:r>
+        <w:rPr/>
         <w:t>/// Return the RSDGGS face index [0..11] for a WGS-84 coordinate.</w:t>
       </w:r>
     </w:p>
@@ -53766,31 +53895,66 @@
       </w:pPr>
       <w:r>
         <w:rPr/>
-        <w:t>// NOTE: On devices without FPU, replace dot() with a 32-bit fixed-point</w:t>
-      </w:r>
-    </w:p>
-    <w:p>
-      <w:pPr>
-        <w:pStyle w:val="PreformattedText"/>
-        <w:bidi w:val="0"/>
-        <w:jc w:val="left"/>
-        <w:rPr/>
-      </w:pPr>
-      <w:r>
-        <w:rPr/>
-        <w:t>// dot product using Q2.30 format. The FACE_CENTERS values are all in</w:t>
-      </w:r>
-    </w:p>
-    <w:p>
-      <w:pPr>
-        <w:pStyle w:val="PreformattedText"/>
-        <w:bidi w:val="0"/>
-        <w:jc w:val="left"/>
-        <w:rPr/>
-      </w:pPr>
-      <w:r>
-        <w:rPr/>
-        <w:t>// [-1.0, +1.0], representable exactly in Q2.30. The comparison requires</w:t>
+        <w:t>// NOTE: On devices without FPU, replace dot() with a 32-bit</w:t>
+      </w:r>
+    </w:p>
+    <w:p>
+      <w:pPr>
+        <w:pStyle w:val="PreformattedText"/>
+        <w:bidi w:val="0"/>
+        <w:jc w:val="left"/>
+        <w:rPr/>
+      </w:pPr>
+      <w:r>
+        <w:rPr/>
+        <w:t>// fixed-point dot product using Q2.30 format. The FACE_CENTERS</w:t>
+      </w:r>
+    </w:p>
+    <w:p>
+      <w:pPr>
+        <w:pStyle w:val="PreformattedText"/>
+        <w:bidi w:val="0"/>
+        <w:jc w:val="left"/>
+        <w:rPr/>
+      </w:pPr>
+      <w:r>
+        <w:rPr/>
+        <w:t>// values are all in [-1.0, +1.0], representable exactly in Q2.30.</w:t>
+      </w:r>
+    </w:p>
+    <w:p>
+      <w:pPr>
+        <w:pStyle w:val="PreformattedText"/>
+        <w:bidi w:val="0"/>
+        <w:jc w:val="left"/>
+        <w:rPr/>
+      </w:pPr>
+      <w:r>
+        <w:rPr/>
+        <w:t>// The comparison requires only finding the maximum of 12 products</w:t>
+      </w:r>
+    </w:p>
+    <w:p>
+      <w:pPr>
+        <w:pStyle w:val="PreformattedText"/>
+        <w:bidi w:val="0"/>
+        <w:jc w:val="left"/>
+        <w:rPr/>
+      </w:pPr>
+      <w:r>
+        <w:rPr/>
+        <w:t>// -- no sqrt, no trig.</w:t>
+      </w:r>
+    </w:p>
+    <w:p>
+      <w:pPr>
+        <w:pStyle w:val="PreformattedText"/>
+        <w:bidi w:val="0"/>
+        <w:jc w:val="left"/>
+        <w:rPr/>
+      </w:pPr>
+      <w:r>
+        <w:rPr/>
       </w:r>
     </w:p>
     <w:p>
@@ -53803,7 +53967,7 @@
       </w:pPr>
       <w:r>
         <w:rPr/>
-        <w:t>// only finding the maximum of 12 products -- no sqrt, no trig.</w:t>
+        <w:t>&lt;CODE ENDS&gt;</w:t>
       </w:r>
     </w:p>
     <w:p>
@@ -53930,6 +54094,18 @@
       </w:pPr>
       <w:r>
         <w:rPr/>
+        <w:t>&lt;CODE BEGINS&gt;</w:t>
+      </w:r>
+    </w:p>
+    <w:p>
+      <w:pPr>
+        <w:pStyle w:val="PreformattedText"/>
+        <w:bidi w:val="0"/>
+        <w:jc w:val="left"/>
+        <w:rPr/>
+      </w:pPr>
+      <w:r>
+        <w:rPr/>
         <w:t>/// Pentagon vertices for each RSDGGS face.</w:t>
       </w:r>
     </w:p>
@@ -54412,13 +54588,36 @@
       <w:pPr>
         <w:pStyle w:val="PreformattedText"/>
         <w:bidi w:val="0"/>
+        <w:jc w:val="left"/>
+        <w:rPr/>
+      </w:pPr>
+      <w:r>
+        <w:rPr/>
+        <w:t>}</w:t>
+      </w:r>
+    </w:p>
+    <w:p>
+      <w:pPr>
+        <w:pStyle w:val="PreformattedText"/>
+        <w:bidi w:val="0"/>
+        <w:jc w:val="left"/>
+        <w:rPr/>
+      </w:pPr>
+      <w:r>
+        <w:rPr/>
+      </w:r>
+    </w:p>
+    <w:p>
+      <w:pPr>
+        <w:pStyle w:val="PreformattedText"/>
+        <w:bidi w:val="0"/>
         <w:spacing w:before="0" w:after="283"/>
         <w:jc w:val="left"/>
         <w:rPr/>
       </w:pPr>
       <w:r>
         <w:rPr/>
-        <w:t>}</w:t>
+        <w:t>&lt;CODE ENDS&gt;</w:t>
       </w:r>
     </w:p>
     <w:p>
@@ -54545,6 +54744,18 @@
       </w:pPr>
       <w:r>
         <w:rPr/>
+        <w:t>&lt;CODE BEGINS&gt;</w:t>
+      </w:r>
+    </w:p>
+    <w:p>
+      <w:pPr>
+        <w:pStyle w:val="PreformattedText"/>
+        <w:bidi w:val="0"/>
+        <w:jc w:val="left"/>
+        <w:rPr/>
+      </w:pPr>
+      <w:r>
+        <w:rPr/>
         <w:t>/// Recursive subdivision state: current triangle vertices.</w:t>
       </w:r>
     </w:p>
@@ -55002,7 +55213,7 @@
       </w:r>
       <w:r>
         <w:rPr/>
-        <w:t>// Central is last -- it contains any point not in the other three.</w:t>
+        <w:t>// Central is last: it contains any point not in the other three.</w:t>
       </w:r>
     </w:p>
     <w:p>
@@ -55372,13 +55583,36 @@
       <w:pPr>
         <w:pStyle w:val="PreformattedText"/>
         <w:bidi w:val="0"/>
+        <w:jc w:val="left"/>
+        <w:rPr/>
+      </w:pPr>
+      <w:r>
+        <w:rPr/>
+        <w:t>}</w:t>
+      </w:r>
+    </w:p>
+    <w:p>
+      <w:pPr>
+        <w:pStyle w:val="PreformattedText"/>
+        <w:bidi w:val="0"/>
+        <w:jc w:val="left"/>
+        <w:rPr/>
+      </w:pPr>
+      <w:r>
+        <w:rPr/>
+      </w:r>
+    </w:p>
+    <w:p>
+      <w:pPr>
+        <w:pStyle w:val="PreformattedText"/>
+        <w:bidi w:val="0"/>
         <w:spacing w:before="0" w:after="283"/>
         <w:jc w:val="left"/>
         <w:rPr/>
       </w:pPr>
       <w:r>
         <w:rPr/>
-        <w:t>}</w:t>
+        <w:t>&lt;CODE ENDS&gt;</w:t>
       </w:r>
     </w:p>
     <w:p>
@@ -55490,6 +55724,18 @@
       </w:pPr>
       <w:r>
         <w:rPr/>
+        <w:t>&lt;CODE BEGINS&gt;</w:t>
+      </w:r>
+    </w:p>
+    <w:p>
+      <w:pPr>
+        <w:pStyle w:val="PreformattedText"/>
+        <w:bidi w:val="0"/>
+        <w:jc w:val="left"/>
+        <w:rPr/>
+      </w:pPr>
+      <w:r>
+        <w:rPr/>
         <w:t>/// Encode a WGS-84 coordinate as an RSDGGS cell index.</w:t>
       </w:r>
     </w:p>
@@ -55716,7 +55962,7 @@
       </w:r>
       <w:r>
         <w:rPr/>
-        <w:t>// -- Byte 0: face index ------------------------------------------</w:t>
+        <w:t>// -- Byte 0: face index ---------------------------------------</w:t>
       </w:r>
     </w:p>
     <w:p>
@@ -55791,7 +56037,7 @@
       </w:r>
       <w:r>
         <w:rPr/>
-        <w:t>// -- Byte 1 [7:4]: pentagon sector -------------------------------</w:t>
+        <w:t>// -- Byte 1 [7:4]: pentagon sector ----------------------------</w:t>
       </w:r>
     </w:p>
     <w:p>
@@ -56226,13 +56472,36 @@
       <w:pPr>
         <w:pStyle w:val="PreformattedText"/>
         <w:bidi w:val="0"/>
+        <w:jc w:val="left"/>
+        <w:rPr/>
+      </w:pPr>
+      <w:r>
+        <w:rPr/>
+        <w:t>}</w:t>
+      </w:r>
+    </w:p>
+    <w:p>
+      <w:pPr>
+        <w:pStyle w:val="PreformattedText"/>
+        <w:bidi w:val="0"/>
+        <w:jc w:val="left"/>
+        <w:rPr/>
+      </w:pPr>
+      <w:r>
+        <w:rPr/>
+      </w:r>
+    </w:p>
+    <w:p>
+      <w:pPr>
+        <w:pStyle w:val="PreformattedText"/>
+        <w:bidi w:val="0"/>
         <w:spacing w:before="0" w:after="283"/>
         <w:jc w:val="left"/>
         <w:rPr/>
       </w:pPr>
       <w:r>
         <w:rPr/>
-        <w:t>}</w:t>
+        <w:t>&lt;CODE ENDS&gt;</w:t>
       </w:r>
     </w:p>
     <w:p>
@@ -56344,6 +56613,18 @@
       </w:pPr>
       <w:r>
         <w:rPr/>
+        <w:t>&lt;CODE BEGINS&gt;</w:t>
+      </w:r>
+    </w:p>
+    <w:p>
+      <w:pPr>
+        <w:pStyle w:val="PreformattedText"/>
+        <w:bidi w:val="0"/>
+        <w:jc w:val="left"/>
+        <w:rPr/>
+      </w:pPr>
+      <w:r>
+        <w:rPr/>
         <w:t>/// Decoded RSDGGS cell contents.</w:t>
       </w:r>
     </w:p>
@@ -56601,7 +56882,7 @@
       </w:r>
       <w:r>
         <w:rPr/>
-        <w:t>let sector = cell.bytes[1] &gt;&gt; 4;            // 5-15 reserved: reject</w:t>
+        <w:t>let sector = cell.bytes[1] &gt;&gt; 4;   // 5-15 reserved: reject</w:t>
       </w:r>
     </w:p>
     <w:p>
@@ -56876,13 +57157,36 @@
       <w:pPr>
         <w:pStyle w:val="PreformattedText"/>
         <w:bidi w:val="0"/>
+        <w:jc w:val="left"/>
+        <w:rPr/>
+      </w:pPr>
+      <w:r>
+        <w:rPr/>
+        <w:t>}</w:t>
+      </w:r>
+    </w:p>
+    <w:p>
+      <w:pPr>
+        <w:pStyle w:val="PreformattedText"/>
+        <w:bidi w:val="0"/>
+        <w:jc w:val="left"/>
+        <w:rPr/>
+      </w:pPr>
+      <w:r>
+        <w:rPr/>
+      </w:r>
+    </w:p>
+    <w:p>
+      <w:pPr>
+        <w:pStyle w:val="PreformattedText"/>
+        <w:bidi w:val="0"/>
         <w:spacing w:before="0" w:after="283"/>
         <w:jc w:val="left"/>
         <w:rPr/>
       </w:pPr>
       <w:r>
         <w:rPr/>
-        <w:t>}</w:t>
+        <w:t>&lt;CODE ENDS&gt;</w:t>
       </w:r>
     </w:p>
     <w:p>
@@ -56994,6 +57298,18 @@
       </w:pPr>
       <w:r>
         <w:rPr/>
+        <w:t>&lt;CODE BEGINS&gt;</w:t>
+      </w:r>
+    </w:p>
+    <w:p>
+      <w:pPr>
+        <w:pStyle w:val="PreformattedText"/>
+        <w:bidi w:val="0"/>
+        <w:jc w:val="left"/>
+        <w:rPr/>
+      </w:pPr>
+      <w:r>
+        <w:rPr/>
         <w:t>/// Regulatory band identifier.</w:t>
       </w:r>
     </w:p>
@@ -57395,7 +57711,7 @@
       </w:r>
       <w:r>
         <w:rPr/>
-        <w:t>let p_max = rule.power_dbm.min(neighbor_power_dbm);</w:t>
+        <w:t>let p_max = core::cmp::min(rule.power_dbm, nbr_pwr);</w:t>
       </w:r>
     </w:p>
     <w:p>
@@ -57578,13 +57894,36 @@
       <w:pPr>
         <w:pStyle w:val="PreformattedText"/>
         <w:bidi w:val="0"/>
+        <w:jc w:val="left"/>
+        <w:rPr/>
+      </w:pPr>
+      <w:r>
+        <w:rPr/>
+        <w:t>}</w:t>
+      </w:r>
+    </w:p>
+    <w:p>
+      <w:pPr>
+        <w:pStyle w:val="PreformattedText"/>
+        <w:bidi w:val="0"/>
+        <w:jc w:val="left"/>
+        <w:rPr/>
+      </w:pPr>
+      <w:r>
+        <w:rPr/>
+      </w:r>
+    </w:p>
+    <w:p>
+      <w:pPr>
+        <w:pStyle w:val="PreformattedText"/>
+        <w:bidi w:val="0"/>
         <w:spacing w:before="0" w:after="283"/>
         <w:jc w:val="left"/>
         <w:rPr/>
       </w:pPr>
       <w:r>
         <w:rPr/>
-        <w:t>}</w:t>
+        <w:t>&lt;CODE ENDS&gt;</w:t>
       </w:r>
     </w:p>
     <w:p>
@@ -57696,6 +58035,18 @@
       </w:pPr>
       <w:r>
         <w:rPr/>
+        <w:t>&lt;CODE BEGINS&gt;</w:t>
+      </w:r>
+    </w:p>
+    <w:p>
+      <w:pPr>
+        <w:pStyle w:val="PreformattedText"/>
+        <w:bidi w:val="0"/>
+        <w:jc w:val="left"/>
+        <w:rPr/>
+      </w:pPr>
+      <w:r>
+        <w:rPr/>
         <w:t>// Input:</w:t>
       </w:r>
     </w:p>
@@ -57814,7 +58165,19 @@
       </w:pPr>
       <w:r>
         <w:rPr/>
-        <w:t>//   cell.bytes[1] = 0x25   sector 2 [7:4]=0010; sub_bits[0]=1 [3:2]=01;</w:t>
+        <w:t>//   cell.bytes[1] = 0x25   sector 2 [7:4]=0010;</w:t>
+      </w:r>
+    </w:p>
+    <w:p>
+      <w:pPr>
+        <w:pStyle w:val="PreformattedText"/>
+        <w:bidi w:val="0"/>
+        <w:jc w:val="left"/>
+        <w:rPr/>
+      </w:pPr>
+      <w:r>
+        <w:rPr/>
+        <w:t>//                          sub_bits[0]=1 [3:2]=01;</w:t>
       </w:r>
     </w:p>
     <w:p>
@@ -58004,7 +58367,7 @@
       </w:pPr>
       <w:r>
         <w:rPr/>
-        <w:t>//   Sao Paulo (23.55S,  46.63W) -&gt; face 6  (ITU Region 2, S. America)</w:t>
+        <w:t>//   Sao Paulo (23.55S,  46.63W) -&gt; face 6  (ITU Region 2, S. Amer.)</w:t>
       </w:r>
     </w:p>
     <w:p>
@@ -58118,13 +58481,36 @@
       <w:pPr>
         <w:pStyle w:val="PreformattedText"/>
         <w:bidi w:val="0"/>
+        <w:jc w:val="left"/>
+        <w:rPr/>
+      </w:pPr>
+      <w:r>
+        <w:rPr/>
+        <w:t>// Enough to determine that 902-928 MHz is legal at this location.</w:t>
+      </w:r>
+    </w:p>
+    <w:p>
+      <w:pPr>
+        <w:pStyle w:val="PreformattedText"/>
+        <w:bidi w:val="0"/>
+        <w:jc w:val="left"/>
+        <w:rPr/>
+      </w:pPr>
+      <w:r>
+        <w:rPr/>
+      </w:r>
+    </w:p>
+    <w:p>
+      <w:pPr>
+        <w:pStyle w:val="PreformattedText"/>
+        <w:bidi w:val="0"/>
         <w:spacing w:before="0" w:after="283"/>
         <w:jc w:val="left"/>
         <w:rPr/>
       </w:pPr>
       <w:r>
         <w:rPr/>
-        <w:t>// Sufficient to determine that 902-928 MHz is legal at this location.</w:t>
+        <w:t>&lt;CODE ENDS&gt;</w:t>
       </w:r>
     </w:p>
     <w:p>
@@ -59798,49 +60184,49 @@
 
 <file path=word/comments.xml><?xml version="1.0" encoding="utf-8"?>
 <w:comments xmlns:o="urn:schemas-microsoft-com:office:office" xmlns:r="http://schemas.openxmlformats.org/officeDocument/2006/relationships" xmlns:v="urn:schemas-microsoft-com:vml" xmlns:w="http://schemas.openxmlformats.org/wordprocessingml/2006/main" xmlns:w10="urn:schemas-microsoft-com:office:word" xmlns:wp="http://schemas.openxmlformats.org/drawingml/2006/wordprocessingDrawing" xmlns:wps="http://schemas.microsoft.com/office/word/2010/wordprocessingShape" xmlns:wpg="http://schemas.microsoft.com/office/word/2010/wordprocessingGroup" xmlns:mc="http://schemas.openxmlformats.org/markup-compatibility/2006" xmlns:wp14="http://schemas.microsoft.com/office/word/2010/wordprocessingDrawing" xmlns:w14="http://schemas.microsoft.com/office/word/2010/wordml" xmlns:w15="http://schemas.microsoft.com/office/word/2012/wordml" mc:Ignorable="w14 wp14 w15">
-  <w:comment w:id="0" w:author="" w:date="2026-10-20T16:55:03Z" w:initials="">
+  <w:comment w:id="0" w:author="" w:date="2026-10-21T07:52:34Z" w:initials="">
     <w:p>
       <w:r>
         <w:t>HTML: &lt;meta name="keyword" content="spectrum"&gt;</w:t>
       </w:r>
     </w:p>
   </w:comment>
-  <w:comment w:id="1" w:author="" w:date="2026-10-20T16:55:03Z" w:initials="">
+  <w:comment w:id="1" w:author="" w:date="2026-10-21T07:52:34Z" w:initials="">
     <w:p>
       <w:r>
         <w:t>HTML: &lt;meta name="keyword" content="regulatory"&gt;</w:t>
       </w:r>
     </w:p>
   </w:comment>
-  <w:comment w:id="2" w:author="" w:date="2026-10-20T16:55:03Z" w:initials="">
+  <w:comment w:id="2" w:author="" w:date="2026-10-21T07:52:34Z" w:initials="">
     <w:p>
       <w:r>
         <w:t>HTML: &lt;meta name="keyword" content="dodecahedron"&gt;</w:t>
       </w:r>
     </w:p>
   </w:comment>
-  <w:comment w:id="3" w:author="" w:date="2026-10-20T16:55:03Z" w:initials="">
+  <w:comment w:id="3" w:author="" w:date="2026-10-21T07:52:34Z" w:initials="">
     <w:p>
       <w:r>
         <w:t>HTML: &lt;meta name="keyword" content="ISM"&gt;</w:t>
       </w:r>
     </w:p>
   </w:comment>
-  <w:comment w:id="4" w:author="" w:date="2026-10-20T16:55:03Z" w:initials="">
+  <w:comment w:id="4" w:author="" w:date="2026-10-21T07:52:34Z" w:initials="">
     <w:p>
       <w:r>
         <w:t>HTML: &lt;meta name="keyword" content="location"&gt;</w:t>
       </w:r>
     </w:p>
   </w:comment>
-  <w:comment w:id="5" w:author="" w:date="2026-10-20T16:55:03Z" w:initials="">
+  <w:comment w:id="5" w:author="" w:date="2026-10-21T07:52:34Z" w:initials="">
     <w:p>
       <w:r>
         <w:t>HTML: &lt;meta name="keyword" content="802.15.4"&gt;</w:t>
       </w:r>
     </w:p>
   </w:comment>
-  <w:comment w:id="6" w:author="" w:date="2026-10-20T16:55:03Z" w:initials="">
+  <w:comment w:id="6" w:author="" w:date="2026-10-21T07:52:34Z" w:initials="">
     <w:p>
       <w:r>
         <w:t>HTML: &lt;meta name="keyword" content="CBOR"&gt;</w:t>

</xml_diff>

<commit_message>
Draft: current orientation in the CN101923801B comparison (D1)
D1 still said Face 2 is oriented at 39N, 98W, the pre-reorientation
anchor. It now gives the Section 4.3 parameters: Face 1 centered at
60.0N, 26.5E and Face 2 at 39.60N, 79.28W. The nearest vertex to a
pole is at 76.8 degrees latitude, so "no vertex is at either pole"
still distinguishes RSDGGS from the patent's pole-vertex alignment.
</commit_message>
<xml_diff>
--- a/draft/draft-hanley-rsdggs-00.docx
+++ b/draft/draft-hanley-rsdggs-00.docx
@@ -47349,7 +47349,7 @@
       </w:r>
       <w:r>
         <w:rPr/>
-        <w:t>D1: Orientation -- RSDGGS orients Face 2 at 39N, 98W</w:t>
+        <w:t>D1: Orientation -- RSDGGS centers Face 1 (ITU Region 1) at</w:t>
       </w:r>
     </w:p>
     <w:p>
@@ -47365,7 +47365,23 @@
       </w:r>
       <w:r>
         <w:rPr/>
-        <w:t>(ITU Region 2 anchor); not North/South Pole alignment</w:t>
+        <w:t>60.0N, 26.5E and Face 2 (ITU Region 2) at 39.60N, 79.28W</w:t>
+      </w:r>
+    </w:p>
+    <w:p>
+      <w:pPr>
+        <w:pStyle w:val="PreformattedText"/>
+        <w:bidi w:val="0"/>
+        <w:jc w:val="left"/>
+        <w:rPr/>
+      </w:pPr>
+      <w:r>
+        <w:rPr/>
+        <w:t xml:space="preserve">      </w:t>
+      </w:r>
+      <w:r>
+        <w:rPr/>
+        <w:t>(Section 4.3); no vertex is at either pole</w:t>
       </w:r>
     </w:p>
     <w:p>
@@ -60184,49 +60200,49 @@
 
 <file path=word/comments.xml><?xml version="1.0" encoding="utf-8"?>
 <w:comments xmlns:o="urn:schemas-microsoft-com:office:office" xmlns:r="http://schemas.openxmlformats.org/officeDocument/2006/relationships" xmlns:v="urn:schemas-microsoft-com:vml" xmlns:w="http://schemas.openxmlformats.org/wordprocessingml/2006/main" xmlns:w10="urn:schemas-microsoft-com:office:word" xmlns:wp="http://schemas.openxmlformats.org/drawingml/2006/wordprocessingDrawing" xmlns:wps="http://schemas.microsoft.com/office/word/2010/wordprocessingShape" xmlns:wpg="http://schemas.microsoft.com/office/word/2010/wordprocessingGroup" xmlns:mc="http://schemas.openxmlformats.org/markup-compatibility/2006" xmlns:wp14="http://schemas.microsoft.com/office/word/2010/wordprocessingDrawing" xmlns:w14="http://schemas.microsoft.com/office/word/2010/wordml" xmlns:w15="http://schemas.microsoft.com/office/word/2012/wordml" mc:Ignorable="w14 wp14 w15">
-  <w:comment w:id="0" w:author="" w:date="2026-10-21T07:52:34Z" w:initials="">
+  <w:comment w:id="0" w:author="" w:date="2026-10-21T12:43:11Z" w:initials="">
     <w:p>
       <w:r>
         <w:t>HTML: &lt;meta name="keyword" content="spectrum"&gt;</w:t>
       </w:r>
     </w:p>
   </w:comment>
-  <w:comment w:id="1" w:author="" w:date="2026-10-21T07:52:34Z" w:initials="">
+  <w:comment w:id="1" w:author="" w:date="2026-10-21T12:43:11Z" w:initials="">
     <w:p>
       <w:r>
         <w:t>HTML: &lt;meta name="keyword" content="regulatory"&gt;</w:t>
       </w:r>
     </w:p>
   </w:comment>
-  <w:comment w:id="2" w:author="" w:date="2026-10-21T07:52:34Z" w:initials="">
+  <w:comment w:id="2" w:author="" w:date="2026-10-21T12:43:11Z" w:initials="">
     <w:p>
       <w:r>
         <w:t>HTML: &lt;meta name="keyword" content="dodecahedron"&gt;</w:t>
       </w:r>
     </w:p>
   </w:comment>
-  <w:comment w:id="3" w:author="" w:date="2026-10-21T07:52:34Z" w:initials="">
+  <w:comment w:id="3" w:author="" w:date="2026-10-21T12:43:11Z" w:initials="">
     <w:p>
       <w:r>
         <w:t>HTML: &lt;meta name="keyword" content="ISM"&gt;</w:t>
       </w:r>
     </w:p>
   </w:comment>
-  <w:comment w:id="4" w:author="" w:date="2026-10-21T07:52:34Z" w:initials="">
+  <w:comment w:id="4" w:author="" w:date="2026-10-21T12:43:11Z" w:initials="">
     <w:p>
       <w:r>
         <w:t>HTML: &lt;meta name="keyword" content="location"&gt;</w:t>
       </w:r>
     </w:p>
   </w:comment>
-  <w:comment w:id="5" w:author="" w:date="2026-10-21T07:52:34Z" w:initials="">
+  <w:comment w:id="5" w:author="" w:date="2026-10-21T12:43:11Z" w:initials="">
     <w:p>
       <w:r>
         <w:t>HTML: &lt;meta name="keyword" content="802.15.4"&gt;</w:t>
       </w:r>
     </w:p>
   </w:comment>
-  <w:comment w:id="6" w:author="" w:date="2026-10-21T07:52:34Z" w:initials="">
+  <w:comment w:id="6" w:author="" w:date="2026-10-21T12:43:11Z" w:initials="">
     <w:p>
       <w:r>
         <w:t>HTML: &lt;meta name="keyword" content="CBOR"&gt;</w:t>

</xml_diff>